<commit_message>
Implementacion d el patron Adapter (Para pasarelas de pago Stripe/PayU) integrado en la app
</commit_message>
<xml_diff>
--- a/Documentacion/plataforma-Comercio-Energia.docx
+++ b/Documentacion/plataforma-Comercio-Energia.docx
@@ -2296,6 +2296,340 @@
           <w:tab w:val="right" w:leader="dot" w:pos="9360"/>
         </w:tabs>
         <w:spacing w:after="80" w:line="360" w:lineRule="auto"/>
+        <w:ind w:left="360"/>
+        <w:rPr>
+          <w:lang w:val="es-CO"/>
+        </w:rPr>
+      </w:pPr>
+      <w:r>
+        <w:rPr>
+          <w:lang w:val="es-CO"/>
+        </w:rPr>
+        <w:t>Aplicación del Patrón de Diseño Adapter en el Cobro de Pagos</w:t>
+      </w:r>
+      <w:r>
+        <w:rPr>
+          <w:lang w:val="es-CO"/>
+        </w:rPr>
+        <w:tab/>
+      </w:r>
+      <w:r>
+        <w:fldChar w:fldCharType="begin"/>
+      </w:r>
+      <w:r>
+        <w:rPr>
+          <w:lang w:val="es-CO"/>
+        </w:rPr>
+        <w:instrText>PAGEREF bm_adapter \h</w:instrText>
+      </w:r>
+      <w:r>
+        <w:fldChar w:fldCharType="separate"/>
+      </w:r>
+      <w:r>
+        <w:rPr>
+          <w:noProof/>
+          <w:lang w:val="es-CO"/>
+        </w:rPr>
+        <w:t>1</w:t>
+      </w:r>
+      <w:r>
+        <w:fldChar w:fldCharType="end"/>
+      </w:r>
+    </w:p>
+    <w:p>
+      <w:pPr>
+        <w:tabs>
+          <w:tab w:val="right" w:leader="dot" w:pos="9360"/>
+        </w:tabs>
+        <w:spacing w:after="80" w:line="360" w:lineRule="auto"/>
+        <w:ind w:left="720"/>
+        <w:rPr>
+          <w:lang w:val="es-CO"/>
+        </w:rPr>
+      </w:pPr>
+      <w:r>
+        <w:rPr>
+          <w:i/>
+          <w:iCs/>
+          <w:lang w:val="es-CO"/>
+        </w:rPr>
+        <w:t>El Problema que Resuelve</w:t>
+      </w:r>
+      <w:r>
+        <w:rPr>
+          <w:lang w:val="es-CO"/>
+        </w:rPr>
+        <w:tab/>
+      </w:r>
+      <w:r>
+        <w:fldChar w:fldCharType="begin"/>
+      </w:r>
+      <w:r>
+        <w:rPr>
+          <w:lang w:val="es-CO"/>
+        </w:rPr>
+        <w:instrText>PAGEREF bm_adapter_problema \h</w:instrText>
+      </w:r>
+      <w:r>
+        <w:fldChar w:fldCharType="separate"/>
+      </w:r>
+      <w:r>
+        <w:rPr>
+          <w:noProof/>
+          <w:lang w:val="es-CO"/>
+        </w:rPr>
+        <w:t>1</w:t>
+      </w:r>
+      <w:r>
+        <w:fldChar w:fldCharType="end"/>
+      </w:r>
+    </w:p>
+    <w:p>
+      <w:pPr>
+        <w:tabs>
+          <w:tab w:val="right" w:leader="dot" w:pos="9360"/>
+        </w:tabs>
+        <w:spacing w:after="80" w:line="360" w:lineRule="auto"/>
+        <w:ind w:left="720"/>
+        <w:rPr>
+          <w:lang w:val="es-CO"/>
+        </w:rPr>
+      </w:pPr>
+      <w:r>
+        <w:rPr>
+          <w:i/>
+          <w:iCs/>
+          <w:lang w:val="es-CO"/>
+        </w:rPr>
+        <w:t>Cómo lo Soluciona el Patrón</w:t>
+      </w:r>
+      <w:r>
+        <w:rPr>
+          <w:lang w:val="es-CO"/>
+        </w:rPr>
+        <w:tab/>
+      </w:r>
+      <w:r>
+        <w:fldChar w:fldCharType="begin"/>
+      </w:r>
+      <w:r>
+        <w:rPr>
+          <w:lang w:val="es-CO"/>
+        </w:rPr>
+        <w:instrText>PAGEREF bm_adapter_solucion \h</w:instrText>
+      </w:r>
+      <w:r>
+        <w:fldChar w:fldCharType="separate"/>
+      </w:r>
+      <w:r>
+        <w:rPr>
+          <w:noProof/>
+          <w:lang w:val="es-CO"/>
+        </w:rPr>
+        <w:t>1</w:t>
+      </w:r>
+      <w:r>
+        <w:fldChar w:fldCharType="end"/>
+      </w:r>
+    </w:p>
+    <w:p>
+      <w:pPr>
+        <w:tabs>
+          <w:tab w:val="right" w:leader="dot" w:pos="9360"/>
+        </w:tabs>
+        <w:spacing w:after="80" w:line="360" w:lineRule="auto"/>
+        <w:ind w:left="720"/>
+        <w:rPr>
+          <w:lang w:val="es-CO"/>
+        </w:rPr>
+      </w:pPr>
+      <w:r>
+        <w:rPr>
+          <w:i/>
+          <w:iCs/>
+          <w:lang w:val="es-CO"/>
+        </w:rPr>
+        <w:t>Qué Gana la Plataforma con Esto</w:t>
+      </w:r>
+      <w:r>
+        <w:rPr>
+          <w:lang w:val="es-CO"/>
+        </w:rPr>
+        <w:tab/>
+      </w:r>
+      <w:r>
+        <w:fldChar w:fldCharType="begin"/>
+      </w:r>
+      <w:r>
+        <w:rPr>
+          <w:lang w:val="es-CO"/>
+        </w:rPr>
+        <w:instrText>PAGEREF bm_adapter_gana \h</w:instrText>
+      </w:r>
+      <w:r>
+        <w:fldChar w:fldCharType="separate"/>
+      </w:r>
+      <w:r>
+        <w:rPr>
+          <w:noProof/>
+          <w:lang w:val="es-CO"/>
+        </w:rPr>
+        <w:t>1</w:t>
+      </w:r>
+      <w:r>
+        <w:fldChar w:fldCharType="end"/>
+      </w:r>
+    </w:p>
+    <w:p>
+      <w:pPr>
+        <w:tabs>
+          <w:tab w:val="right" w:leader="dot" w:pos="9360"/>
+        </w:tabs>
+        <w:spacing w:after="80" w:line="360" w:lineRule="auto"/>
+        <w:ind w:left="720"/>
+        <w:rPr>
+          <w:lang w:val="es-CO"/>
+        </w:rPr>
+      </w:pPr>
+      <w:r>
+        <w:rPr>
+          <w:i/>
+          <w:iCs/>
+          <w:lang w:val="es-CO"/>
+        </w:rPr>
+        <w:t>Justificación de su Uso en el Proyecto</w:t>
+      </w:r>
+      <w:r>
+        <w:rPr>
+          <w:lang w:val="es-CO"/>
+        </w:rPr>
+        <w:tab/>
+      </w:r>
+      <w:r>
+        <w:fldChar w:fldCharType="begin"/>
+      </w:r>
+      <w:r>
+        <w:rPr>
+          <w:lang w:val="es-CO"/>
+        </w:rPr>
+        <w:instrText>PAGEREF bm_adapter_justificacion \h</w:instrText>
+      </w:r>
+      <w:r>
+        <w:fldChar w:fldCharType="separate"/>
+      </w:r>
+      <w:r>
+        <w:rPr>
+          <w:noProof/>
+          <w:lang w:val="es-CO"/>
+        </w:rPr>
+        <w:t>1</w:t>
+      </w:r>
+      <w:r>
+        <w:fldChar w:fldCharType="end"/>
+      </w:r>
+    </w:p>
+    <w:p>
+      <w:pPr>
+        <w:tabs>
+          <w:tab w:val="right" w:leader="dot" w:pos="9360"/>
+        </w:tabs>
+        <w:spacing w:after="80" w:line="360" w:lineRule="auto"/>
+        <w:ind w:left="720"/>
+        <w:rPr>
+          <w:lang w:val="es-CO"/>
+        </w:rPr>
+      </w:pPr>
+      <w:r>
+        <w:rPr>
+          <w:i/>
+          <w:iCs/>
+          <w:lang w:val="es-CO"/>
+        </w:rPr>
+        <w:t>Evaluación: ¿Sirve este patrón para el proyecto?</w:t>
+      </w:r>
+      <w:r>
+        <w:rPr>
+          <w:lang w:val="es-CO"/>
+        </w:rPr>
+        <w:tab/>
+      </w:r>
+      <w:r>
+        <w:fldChar w:fldCharType="begin"/>
+      </w:r>
+      <w:r>
+        <w:rPr>
+          <w:lang w:val="es-CO"/>
+        </w:rPr>
+        <w:instrText>PAGEREF bm_adapter_evaluacion \h</w:instrText>
+      </w:r>
+      <w:r>
+        <w:fldChar w:fldCharType="separate"/>
+      </w:r>
+      <w:r>
+        <w:rPr>
+          <w:noProof/>
+          <w:lang w:val="es-CO"/>
+        </w:rPr>
+        <w:t>1</w:t>
+      </w:r>
+      <w:r>
+        <w:fldChar w:fldCharType="end"/>
+      </w:r>
+    </w:p>
+    <w:p>
+      <w:pPr>
+        <w:tabs>
+          <w:tab w:val="right" w:leader="dot" w:pos="9360"/>
+        </w:tabs>
+        <w:spacing w:after="80" w:line="360" w:lineRule="auto"/>
+        <w:ind w:left="720"/>
+        <w:rPr>
+          <w:lang w:val="es-CO"/>
+        </w:rPr>
+      </w:pPr>
+      <w:r>
+        <w:rPr>
+          <w:i/>
+          <w:iCs/>
+          <w:lang w:val="es-CO"/>
+        </w:rPr>
+        <w:t>Validación del Patrón</w:t>
+      </w:r>
+      <w:r>
+        <w:rPr>
+          <w:lang w:val="es-CO"/>
+        </w:rPr>
+        <w:tab/>
+      </w:r>
+      <w:r>
+        <w:fldChar w:fldCharType="begin"/>
+      </w:r>
+      <w:r>
+        <w:rPr>
+          <w:lang w:val="es-CO"/>
+        </w:rPr>
+        <w:instrText>PAGEREF bm_adapter_validacion \h</w:instrText>
+      </w:r>
+      <w:r>
+        <w:fldChar w:fldCharType="separate"/>
+      </w:r>
+      <w:r>
+        <w:rPr>
+          <w:noProof/>
+          <w:lang w:val="es-CO"/>
+        </w:rPr>
+        <w:t>1</w:t>
+      </w:r>
+      <w:r>
+        <w:fldChar w:fldCharType="end"/>
+      </w:r>
+    </w:p>
+    <w:p>
+      <w:pPr>
+        <w:tabs>
+          <w:tab w:val="right" w:leader="dot" w:pos="9360"/>
+        </w:tabs>
+        <w:spacing w:after="80" w:line="360" w:lineRule="auto"/>
         <w:ind w:left="720"/>
         <w:rPr>
           <w:lang w:val="es-CO"/>
@@ -2674,7 +3008,7 @@
         <w:rPr>
           <w:lang w:val="es-CO"/>
         </w:rPr>
-        <w:instrText>PAGEREF bm_fig90 \h</w:instrText>
+        <w:instrText>PAGEREF bm_fig6 \h</w:instrText>
       </w:r>
       <w:r>
         <w:fldChar w:fldCharType="separate"/>
@@ -3520,6 +3854,52 @@
     </w:p>
     <w:p>
       <w:pPr>
+        <w:tabs>
+          <w:tab w:val="right" w:leader="dot" w:pos="9360"/>
+        </w:tabs>
+        <w:spacing w:after="80" w:line="360" w:lineRule="auto"/>
+        <w:ind w:left="360" w:hanging="360"/>
+        <w:rPr>
+          <w:lang w:val="es-CO"/>
+        </w:rPr>
+      </w:pPr>
+      <w:r>
+        <w:rPr>
+          <w:lang w:val="es-CO"/>
+        </w:rPr>
+        <w:t>Figura 25. Adapters AdaptadorStripe y AdaptadorPayU implementando PasarelaPago en pagos.py</w:t>
+      </w:r>
+      <w:r>
+        <w:rPr>
+          <w:lang w:val="es-CO"/>
+        </w:rPr>
+        <w:tab/>
+      </w:r>
+      <w:r>
+        <w:fldChar w:fldCharType="begin"/>
+      </w:r>
+      <w:r>
+        <w:rPr>
+          <w:lang w:val="es-CO"/>
+        </w:rPr>
+        <w:instrText>PAGEREF bm_fig25 \h</w:instrText>
+      </w:r>
+      <w:r>
+        <w:fldChar w:fldCharType="separate"/>
+      </w:r>
+      <w:r>
+        <w:rPr>
+          <w:noProof/>
+          <w:lang w:val="es-CO"/>
+        </w:rPr>
+        <w:t>1</w:t>
+      </w:r>
+      <w:r>
+        <w:fldChar w:fldCharType="end"/>
+      </w:r>
+    </w:p>
+    <w:p>
+      <w:pPr>
         <w:pageBreakBefore/>
         <w:rPr>
           <w:lang w:val="es-CO"/>
@@ -3559,7 +3939,7 @@
         <w:rPr>
           <w:lang w:val="es-CO"/>
         </w:rPr>
-        <w:t>El presente documento contextualiza el proyecto Plataforma de Comercio de Energía, una solución digital orientada a facilitar la compra y venta de excedentes energéticos entre usuarios en contextos de generación distribuida, como paneles solares domésticos y baterías inteligentes. Adicionalmente, se explica la implementación de cinco patrones de diseño aplicados en el sistema: el patrón Singleton, que garantiza un punto único y consistente de acceso al estado de la plataforma (PlataformaEnergia) de forma segura ante la concurrencia; el patrón Factory Method, que resuelve la integración de distintos tipos de dispositivos IoT domésticos (paneles solares, baterías inteligentes y medidores); el patrón Abstract Factory, que organiza los canales de notificación (correo, SMS y notificación push) para que cada uno genere la familia completa de avisos con un formato coherente; y el patrón Builder, que construye el reporte energético del usuario paso a paso para obtenerlo en distintas representaciones (diccionario, objeto con secciones o texto); y el patrón Prototype, que permite clonar un dispositivo IoT ya calibrado para dar de alta otros similares sin repetir su configuración. Se describe la problemática que motiva el proyecto, la propuesta de solución, las funcionalidades principales, el objetivo general y el impacto esperado, así como el problema técnico que motiva cada patrón, la solución propuesta a partir de las clases involucradas y los beneficios que aportan a la consistencia, la escalabilidad y la mantenibilidad del sistema.</w:t>
+        <w:t>El presente documento contextualiza el proyecto Plataforma de Comercio de Energía, una solución digital orientada a facilitar la compra y venta de excedentes energéticos entre usuarios en contextos de generación distribuida, como paneles solares domésticos y baterías inteligentes. Adicionalmente, se explica la implementación de seis patrones de diseño aplicados en el sistema: el patrón Singleton, que garantiza un punto único y consistente de acceso al estado de la plataforma (PlataformaEnergia) de forma segura ante la concurrencia; el patrón Factory Method, que resuelve la integración de distintos tipos de dispositivos IoT domésticos (paneles solares, baterías inteligentes y medidores); el patrón Abstract Factory, que organiza los canales de notificación (correo, SMS y notificación push) para que cada uno genere la familia completa de avisos con un formato coherente; y el patrón Builder, que construye el reporte energético del usuario paso a paso para obtenerlo en distintas representaciones (diccionario, objeto con secciones o texto); y el patrón Prototype, que permite clonar un dispositivo IoT ya calibrado para dar de alta otros similares sin repetir su configuración; y el patrón Adapter, que integra pasarelas de pago externas (Stripe, PayU) con interfaces incompatibles bajo una interfaz uniforme. Se describe la problemática que motiva el proyecto, la propuesta de solución, las funcionalidades principales, el objetivo general y el impacto esperado, así como el problema técnico que motiva cada patrón, la solución propuesta a partir de las clases involucradas y los beneficios que aportan a la consistencia, la escalabilidad y la mantenibilidad del sistema.</w:t>
       </w:r>
     </w:p>
     <w:p>
@@ -3581,7 +3961,7 @@
         <w:rPr>
           <w:lang w:val="es-CO"/>
         </w:rPr>
-        <w:t>comercio de energía, Singleton, Factory Method, Abstract Factory, Builder, Prototype, patrones de diseño, IoT, arquitectura de software, principio abierto/cerrado.</w:t>
+        <w:t>comercio de energía, Singleton, Factory Method, Abstract Factory, Builder, Prototype, Adapter, patrones de diseño, IoT, arquitectura de software, principio abierto/cerrado.</w:t>
       </w:r>
     </w:p>
     <w:p>
@@ -5975,7 +6355,7 @@
           <w:lang w:val="es-CO"/>
         </w:rPr>
       </w:pPr>
-      <w:bookmarkStart w:id="68" w:name="bm_fig90"/>
+      <w:bookmarkStart w:id="68" w:name="bm_fig6"/>
       <w:r>
         <w:rPr>
           <w:b/>
@@ -11695,13 +12075,50 @@
     <w:p/>
     <w:p>
       <w:pPr>
+        <w:pStyle w:val="Ttulo2"/>
+        <w:spacing w:before="240" w:after="120" w:line="480" w:lineRule="auto"/>
+        <w:rPr>
+          <w:lang w:val="es-CO"/>
+        </w:rPr>
+      </w:pPr>
+      <w:bookmarkStart w:id="70" w:name="bm_adapter"/>
+      <w:r>
+        <w:rPr>
+          <w:b/>
+          <w:bCs/>
+          <w:color w:val="000000"/>
+          <w:sz w:val="24"/>
+          <w:szCs w:val="24"/>
+          <w:lang w:val="es-CO"/>
+        </w:rPr>
+        <w:t xml:space="preserve">Aplicación del Patrón de Diseño Adapter en el Cobro de Pagos</w:t>
+      </w:r>
+      <w:bookmarkEnd w:id="70"/>
+    </w:p>
+    <w:p>
+      <w:pPr>
+        <w:ind w:firstLine="720"/>
+        <w:jc w:val="both"/>
+        <w:rPr>
+          <w:lang w:val="es-CO"/>
+        </w:rPr>
+      </w:pPr>
+      <w:r>
+        <w:rPr>
+          <w:lang w:val="es-CO"/>
+        </w:rPr>
+        <w:t xml:space="preserve">El patrón Adapter incorporado a la plataforma resuelve el cobro real de las transacciones que cierra la subasta (Singleton): en lugar de que la plataforma llame directamente al SDK de una pasarela de pago externa, programa contra una interfaz propia (PasarelaPago) y cada SDK se envuelve en un adaptador. Este módulo forma parte de la lógica de dominio del backend (plataforma.py, método _cobrar_transaccion) y se expone en la API FastAPI (main.py) a través de /pagos, /pagos/pasarelas y /usuarios/me/pasarela; la implementación educativa completa se encuentra en Documentacion/Semana 7/adapter.py.</w:t>
+      </w:r>
+    </w:p>
+    <w:p>
+      <w:pPr>
         <w:pStyle w:val="Ttulo3"/>
         <w:spacing w:before="200" w:after="100" w:line="480" w:lineRule="auto"/>
         <w:rPr>
           <w:lang w:val="es-CO"/>
         </w:rPr>
       </w:pPr>
-      <w:bookmarkStart w:id="55" w:name="bm_factory_conclusion"/>
+      <w:bookmarkStart w:id="71" w:name="bm_adapter_problema"/>
       <w:r>
         <w:rPr>
           <w:b/>
@@ -11711,9 +12128,9 @@
           <w:color w:val="000000"/>
           <w:lang w:val="es-CO"/>
         </w:rPr>
-        <w:t>Conclusión</w:t>
-      </w:r>
-      <w:bookmarkEnd w:id="55"/>
+        <w:t>El Problema que Resuelve</w:t>
+      </w:r>
+      <w:bookmarkEnd w:id="71"/>
     </w:p>
     <w:p>
       <w:pPr>
@@ -11727,8 +12144,816 @@
         <w:rPr>
           <w:lang w:val="es-CO"/>
         </w:rPr>
+        <w:t xml:space="preserve">La subasta en tiempo real calcula un total en dinero por cada transacción cerrada, pero la plataforma nunca lo cobra de verdad: falta conectar una pasarela de pagos externa (Stripe, PayU), como ya contempla el alcance futuro descrito en la Contextualización del Proyecto («puede ampliarse con pagos electrónicos»). El problema es que cada pasarela expone su propio SDK, incompatible con el de las demás: Stripe trabaja en centavos y en inglés (create_charge(amount_cents, currency, metadata)); PayU trabaja en pesos y en español, con sus propias claves de respuesta (generar_transaccion(monto, moneda, referencia)).</w:t>
+      </w:r>
+    </w:p>
+    <w:p>
+      <w:pPr>
+        <w:ind w:firstLine="720"/>
+        <w:jc w:val="both"/>
+        <w:rPr>
+          <w:lang w:val="es-CO"/>
+        </w:rPr>
+      </w:pPr>
+      <w:r>
+        <w:rPr>
+          <w:lang w:val="es-CO"/>
+        </w:rPr>
+        <w:t xml:space="preserve">Si la plataforma llamara directamente a esos SDKs, la lógica de negocio terminaría con condicionales («si es Stripe... si es PayU...») repartidos en cada punto donde se cobra, y agregar o cambiar de pasarela obligaría a tocar esa lógica en todos esos puntos.</w:t>
+      </w:r>
+    </w:p>
+    <w:p>
+      <w:pPr>
+        <w:pStyle w:val="Ttulo3"/>
+        <w:spacing w:before="200" w:after="100" w:line="480" w:lineRule="auto"/>
+        <w:rPr>
+          <w:lang w:val="es-CO"/>
+        </w:rPr>
+      </w:pPr>
+      <w:bookmarkStart w:id="72" w:name="bm_adapter_solucion"/>
+      <w:r>
+        <w:rPr>
+          <w:b/>
+          <w:bCs/>
+          <w:i/>
+          <w:iCs/>
+          <w:color w:val="000000"/>
+          <w:lang w:val="es-CO"/>
+        </w:rPr>
+        <w:t>Cómo lo Soluciona el Patrón</w:t>
+      </w:r>
+      <w:bookmarkEnd w:id="72"/>
+    </w:p>
+    <w:p>
+      <w:pPr>
+        <w:pStyle w:val="Prrafodelista"/>
+        <w:numPr>
+          <w:ilvl w:val="0"/>
+          <w:numId w:val="2"/>
+        </w:numPr>
+        <w:spacing w:line="480" w:lineRule="auto"/>
+        <w:jc w:val="both"/>
+        <w:rPr>
+          <w:lang w:val="es-CO"/>
+        </w:rPr>
+      </w:pPr>
+      <w:r>
+        <w:rPr>
+          <w:b/>
+          <w:bCs/>
+          <w:lang w:val="es-CO"/>
+        </w:rPr>
+        <w:t xml:space="preserve">Target PasarelaPago. </w:t>
+      </w:r>
+      <w:r>
+        <w:rPr>
+          <w:lang w:val="es-CO"/>
+        </w:rPr>
+        <w:t xml:space="preserve">Interfaz única que la plataforma ya espera: procesar_pago(usuario_id, monto, concepto) -&gt; ResultadoPago.</w:t>
+      </w:r>
+      <w:r>
+        <w:rPr>
+          <w:lang w:val="es-CO"/>
+        </w:rPr>
         <w:lastRenderedPageBreak/>
-        <w:t>En resumen, el patrón Singleton garantiza que toda la plataforma comparta un mismo estado consistente, el Factory Method garantiza que cada tipo de dispositivo IoT se cree y se comporte correctamente sin acoplar ese conocimiento al resto del sistema, el Abstract Factory garantiza que cada canal de notificación genere la familia completa de avisos con un formato coherente, el Builder permite construir el reporte energético paso a paso y obtenerlo en distintas representaciones sin duplicar la lógica de negocio, y el Prototype permite clonar un dispositivo IoT ya calibrado para repetir esa configuración en altas posteriores sin volver a escribirla a mano. Los cinco patrones son complementarios: el primero define cuántas instancias de la plataforma existen; el segundo y el tercero definen cómo se crean los objetos —individuales o en familia— que la plataforma administra; el cuarto define cómo se ensambla un objeto complejo a partir de esos datos; y el quinto define cómo se reutiliza un objeto ya configurado para crear otros similares sin repetir su configuración.</w:t>
+        <w:t>prediccion_consumo()— y un método obtener_reporte() que entrega el producto terminado. Cada paso devuelve el propio builder, de modo que se pueden encadenar.</w:t>
+      </w:r>
+    </w:p>
+    <w:p>
+      <w:pPr>
+        <w:pStyle w:val="Prrafodelista"/>
+        <w:numPr>
+          <w:ilvl w:val="0"/>
+          <w:numId w:val="2"/>
+        </w:numPr>
+        <w:spacing w:line="480" w:lineRule="auto"/>
+        <w:jc w:val="both"/>
+        <w:rPr>
+          <w:lang w:val="es-CO"/>
+        </w:rPr>
+      </w:pPr>
+      <w:r>
+        <w:rPr>
+          <w:b/>
+          <w:bCs/>
+          <w:lang w:val="es-CO"/>
+        </w:rPr>
+        <w:t xml:space="preserve">Adaptees StripeAPI / PayUAPI. </w:t>
+      </w:r>
+      <w:r>
+        <w:rPr>
+          <w:lang w:val="es-CO"/>
+        </w:rPr>
+        <w:t xml:space="preserve">Simulan los SDKs reales, con nombres de método, unidades y formatos de respuesta incompatibles entre sí.</w:t>
+      </w:r>
+      <w:r>
+        <w:rPr>
+          <w:lang w:val="es-CO"/>
+        </w:rPr>
+        <w:lastRenderedPageBreak/>
+        <w:t>prediccion_consumo()— y un método obtener_reporte() que entrega el producto terminado. Cada paso devuelve el propio builder, de modo que se pueden encadenar.</w:t>
+      </w:r>
+    </w:p>
+    <w:p>
+      <w:pPr>
+        <w:pStyle w:val="Prrafodelista"/>
+        <w:numPr>
+          <w:ilvl w:val="0"/>
+          <w:numId w:val="2"/>
+        </w:numPr>
+        <w:spacing w:line="480" w:lineRule="auto"/>
+        <w:jc w:val="both"/>
+        <w:rPr>
+          <w:lang w:val="es-CO"/>
+        </w:rPr>
+      </w:pPr>
+      <w:r>
+        <w:rPr>
+          <w:b/>
+          <w:bCs/>
+          <w:lang w:val="es-CO"/>
+        </w:rPr>
+        <w:t xml:space="preserve">Adapters AdaptadorStripe / AdaptadorPayU. </w:t>
+      </w:r>
+      <w:r>
+        <w:rPr>
+          <w:lang w:val="es-CO"/>
+        </w:rPr>
+        <w:t xml:space="preserve">Implementan PasarelaPago y traducen la llamada uniforme a la forma que espera cada SDK (por ejemplo, AdaptadorStripe convierte el monto a centavos antes de llamar a create_charge), y traducen la respuesta de vuelta a ResultadoPago, el mismo objeto de valor sin importar la pasarela.</w:t>
+      </w:r>
+      <w:r>
+        <w:rPr>
+          <w:lang w:val="es-CO"/>
+        </w:rPr>
+        <w:lastRenderedPageBreak/>
+        <w:t>prediccion_consumo()— y un método obtener_reporte() que entrega el producto terminado. Cada paso devuelve el propio builder, de modo que se pueden encadenar.</w:t>
+      </w:r>
+    </w:p>
+    <w:p>
+      <w:pPr>
+        <w:pStyle w:val="Prrafodelista"/>
+        <w:numPr>
+          <w:ilvl w:val="0"/>
+          <w:numId w:val="2"/>
+        </w:numPr>
+        <w:spacing w:line="480" w:lineRule="auto"/>
+        <w:jc w:val="both"/>
+        <w:rPr>
+          <w:lang w:val="es-CO"/>
+        </w:rPr>
+      </w:pPr>
+      <w:r>
+        <w:rPr>
+          <w:b/>
+          <w:bCs/>
+          <w:lang w:val="es-CO"/>
+        </w:rPr>
+        <w:t xml:space="preserve">Registro. </w:t>
+      </w:r>
+      <w:r>
+        <w:rPr>
+          <w:lang w:val="es-CO"/>
+        </w:rPr>
+        <w:t xml:space="preserve">obtener_pasarela(nombre) resuelve el adaptador concreto en un punto único, con el mismo contrato que obtener_factory (Factory Method), obtener_canal (Abstract Factory) o crear_builder (Builder): un ValueError con las disponibles ante un nombre desconocido.</w:t>
+      </w:r>
+      <w:r>
+        <w:rPr>
+          <w:lang w:val="es-CO"/>
+        </w:rPr>
+        <w:lastRenderedPageBreak/>
+        <w:t>prediccion_consumo()— y un método obtener_reporte() que entrega el producto terminado. Cada paso devuelve el propio builder, de modo que se pueden encadenar.</w:t>
+      </w:r>
+    </w:p>
+    <w:p>
+      <w:pPr>
+        <w:pStyle w:val="Prrafodelista"/>
+        <w:numPr>
+          <w:ilvl w:val="0"/>
+          <w:numId w:val="2"/>
+        </w:numPr>
+        <w:spacing w:line="480" w:lineRule="auto"/>
+        <w:jc w:val="both"/>
+        <w:rPr>
+          <w:lang w:val="es-CO"/>
+        </w:rPr>
+      </w:pPr>
+      <w:r>
+        <w:rPr>
+          <w:b/>
+          <w:bCs/>
+          <w:lang w:val="es-CO"/>
+        </w:rPr>
+        <w:t xml:space="preserve">Uso real en la plataforma. </w:t>
+      </w:r>
+      <w:r>
+        <w:rPr>
+          <w:lang w:val="es-CO"/>
+        </w:rPr>
+        <w:t xml:space="preserve">PlataformaEnergia._cobrar_transaccion() cobra el total de cada transacción cerrada al comprador usando SU pasarela preferida, expuesto como PUT /usuarios/me/pasarela y GET /pagos.</w:t>
+      </w:r>
+      <w:r>
+        <w:rPr>
+          <w:lang w:val="es-CO"/>
+        </w:rPr>
+        <w:lastRenderedPageBreak/>
+        <w:t>prediccion_consumo()— y un método obtener_reporte() que entrega el producto terminado. Cada paso devuelve el propio builder, de modo que se pueden encadenar.</w:t>
+      </w:r>
+    </w:p>
+    <w:p>
+      <w:pPr>
+        <w:spacing w:before="200"/>
+        <w:rPr>
+          <w:lang w:val="es-CO"/>
+        </w:rPr>
+      </w:pPr>
+      <w:bookmarkStart w:id="73" w:name="bm_fig25"/>
+      <w:r>
+        <w:rPr>
+          <w:b/>
+          <w:bCs/>
+          <w:lang w:val="es-CO"/>
+        </w:rPr>
+        <w:t>Figura 25</w:t>
+      </w:r>
+      <w:bookmarkEnd w:id="73"/>
+    </w:p>
+    <w:p>
+      <w:pPr>
+        <w:rPr>
+          <w:lang w:val="es-CO"/>
+        </w:rPr>
+      </w:pPr>
+      <w:r>
+        <w:rPr>
+          <w:i/>
+          <w:iCs/>
+          <w:lang w:val="es-CO"/>
+        </w:rPr>
+        <w:t xml:space="preserve">Adapters AdaptadorStripe y AdaptadorPayU implementando PasarelaPago en pagos.py</w:t>
+      </w:r>
+    </w:p>
+    <w:p>
+      <w:pPr>
+        <w:ind w:left="720"/>
+        <w:rPr>
+          <w:lang w:val="es-CO"/>
+        </w:rPr>
+      </w:pPr>
+      <w:r>
+        <w:rPr>
+          <w:rFonts w:ascii="Courier New" w:eastAsia="Courier New" w:hAnsi="Courier New" w:cs="Courier New"/>
+          <w:sz w:val="20"/>
+          <w:szCs w:val="20"/>
+          <w:lang w:val="es-CO"/>
+        </w:rPr>
+        <w:t xml:space="preserve">class AdaptadorStripe(PasarelaPago):</w:t>
+      </w:r>
+    </w:p>
+    <w:p>
+      <w:pPr>
+        <w:ind w:left="720"/>
+        <w:rPr>
+          <w:lang w:val="es-CO"/>
+        </w:rPr>
+      </w:pPr>
+      <w:r>
+        <w:rPr>
+          <w:rFonts w:ascii="Courier New" w:eastAsia="Courier New" w:hAnsi="Courier New" w:cs="Courier New"/>
+          <w:sz w:val="20"/>
+          <w:szCs w:val="20"/>
+          <w:lang w:val="es-CO"/>
+        </w:rPr>
+        <w:t xml:space="preserve">    def procesar_pago(self, usuario_id, monto, concepto):</w:t>
+      </w:r>
+    </w:p>
+    <w:p>
+      <w:pPr>
+        <w:ind w:left="720"/>
+        <w:rPr>
+          <w:lang w:val="es-CO"/>
+        </w:rPr>
+      </w:pPr>
+      <w:r>
+        <w:rPr>
+          <w:rFonts w:ascii="Courier New" w:eastAsia="Courier New" w:hAnsi="Courier New" w:cs="Courier New"/>
+          <w:sz w:val="20"/>
+          <w:szCs w:val="20"/>
+          <w:lang w:val="es-CO"/>
+        </w:rPr>
+        <w:t xml:space="preserve">        centavos = round(monto * 100)</w:t>
+      </w:r>
+    </w:p>
+    <w:p>
+      <w:pPr>
+        <w:ind w:left="720"/>
+        <w:rPr>
+          <w:lang w:val="es-CO"/>
+        </w:rPr>
+      </w:pPr>
+      <w:r>
+        <w:rPr>
+          <w:rFonts w:ascii="Courier New" w:eastAsia="Courier New" w:hAnsi="Courier New" w:cs="Courier New"/>
+          <w:sz w:val="20"/>
+          <w:szCs w:val="20"/>
+          <w:lang w:val="es-CO"/>
+        </w:rPr>
+        <w:t xml:space="preserve">        charge = self._api.create_charge(</w:t>
+      </w:r>
+    </w:p>
+    <w:p>
+      <w:pPr>
+        <w:ind w:left="720"/>
+        <w:rPr>
+          <w:lang w:val="es-CO"/>
+        </w:rPr>
+      </w:pPr>
+      <w:r>
+        <w:rPr>
+          <w:rFonts w:ascii="Courier New" w:eastAsia="Courier New" w:hAnsi="Courier New" w:cs="Courier New"/>
+          <w:sz w:val="20"/>
+          <w:szCs w:val="20"/>
+          <w:lang w:val="es-CO"/>
+        </w:rPr>
+        <w:t xml:space="preserve">            amount_cents=centavos, currency="usd",</w:t>
+      </w:r>
+    </w:p>
+    <w:p>
+      <w:pPr>
+        <w:ind w:left="720"/>
+        <w:rPr>
+          <w:lang w:val="es-CO"/>
+        </w:rPr>
+      </w:pPr>
+      <w:r>
+        <w:rPr>
+          <w:rFonts w:ascii="Courier New" w:eastAsia="Courier New" w:hAnsi="Courier New" w:cs="Courier New"/>
+          <w:sz w:val="20"/>
+          <w:szCs w:val="20"/>
+          <w:lang w:val="es-CO"/>
+        </w:rPr>
+        <w:t xml:space="preserve">            metadata={"usuario_id": usuario_id, "concepto": concepto})</w:t>
+      </w:r>
+    </w:p>
+    <w:p>
+      <w:pPr>
+        <w:ind w:left="720"/>
+        <w:rPr>
+          <w:lang w:val="es-CO"/>
+        </w:rPr>
+      </w:pPr>
+      <w:r>
+        <w:rPr>
+          <w:rFonts w:ascii="Courier New" w:eastAsia="Courier New" w:hAnsi="Courier New" w:cs="Courier New"/>
+          <w:sz w:val="20"/>
+          <w:szCs w:val="20"/>
+          <w:lang w:val="es-CO"/>
+        </w:rPr>
+        <w:t xml:space="preserve">        exitoso = self._api.is_charge_successful(charge)</w:t>
+      </w:r>
+    </w:p>
+    <w:p>
+      <w:pPr>
+        <w:ind w:left="720"/>
+        <w:rPr>
+          <w:lang w:val="es-CO"/>
+        </w:rPr>
+      </w:pPr>
+      <w:r>
+        <w:rPr>
+          <w:rFonts w:ascii="Courier New" w:eastAsia="Courier New" w:hAnsi="Courier New" w:cs="Courier New"/>
+          <w:sz w:val="20"/>
+          <w:szCs w:val="20"/>
+          <w:lang w:val="es-CO"/>
+        </w:rPr>
+        <w:t xml:space="preserve">        return ResultadoPago(exitoso, charge.id, "stripe", monto)</w:t>
+      </w:r>
+    </w:p>
+    <w:p>
+      <w:pPr>
+        <w:ind w:left="720"/>
+        <w:rPr>
+          <w:lang w:val="es-CO"/>
+        </w:rPr>
+      </w:pPr>
+      <w:r>
+        <w:rPr>
+          <w:rFonts w:ascii="Courier New" w:eastAsia="Courier New" w:hAnsi="Courier New" w:cs="Courier New"/>
+          <w:sz w:val="20"/>
+          <w:szCs w:val="20"/>
+          <w:lang w:val="es-CO"/>
+        </w:rPr>
+        <w:t xml:space="preserve"/>
+      </w:r>
+    </w:p>
+    <w:p>
+      <w:pPr>
+        <w:ind w:left="720"/>
+        <w:rPr>
+          <w:lang w:val="es-CO"/>
+        </w:rPr>
+      </w:pPr>
+      <w:r>
+        <w:rPr>
+          <w:rFonts w:ascii="Courier New" w:eastAsia="Courier New" w:hAnsi="Courier New" w:cs="Courier New"/>
+          <w:sz w:val="20"/>
+          <w:szCs w:val="20"/>
+          <w:lang w:val="es-CO"/>
+        </w:rPr>
+        <w:t xml:space="preserve"/>
+      </w:r>
+    </w:p>
+    <w:p>
+      <w:pPr>
+        <w:ind w:left="720"/>
+        <w:rPr>
+          <w:lang w:val="es-CO"/>
+        </w:rPr>
+      </w:pPr>
+      <w:r>
+        <w:rPr>
+          <w:rFonts w:ascii="Courier New" w:eastAsia="Courier New" w:hAnsi="Courier New" w:cs="Courier New"/>
+          <w:sz w:val="20"/>
+          <w:szCs w:val="20"/>
+          <w:lang w:val="es-CO"/>
+        </w:rPr>
+        <w:t xml:space="preserve">class AdaptadorPayU(PasarelaPago):</w:t>
+      </w:r>
+    </w:p>
+    <w:p>
+      <w:pPr>
+        <w:ind w:left="720"/>
+        <w:rPr>
+          <w:lang w:val="es-CO"/>
+        </w:rPr>
+      </w:pPr>
+      <w:r>
+        <w:rPr>
+          <w:rFonts w:ascii="Courier New" w:eastAsia="Courier New" w:hAnsi="Courier New" w:cs="Courier New"/>
+          <w:sz w:val="20"/>
+          <w:szCs w:val="20"/>
+          <w:lang w:val="es-CO"/>
+        </w:rPr>
+        <w:t xml:space="preserve">    def procesar_pago(self, usuario_id, monto, concepto):</w:t>
+      </w:r>
+    </w:p>
+    <w:p>
+      <w:pPr>
+        <w:ind w:left="720"/>
+        <w:rPr>
+          <w:lang w:val="es-CO"/>
+        </w:rPr>
+      </w:pPr>
+      <w:r>
+        <w:rPr>
+          <w:rFonts w:ascii="Courier New" w:eastAsia="Courier New" w:hAnsi="Courier New" w:cs="Courier New"/>
+          <w:sz w:val="20"/>
+          <w:szCs w:val="20"/>
+          <w:lang w:val="es-CO"/>
+        </w:rPr>
+        <w:t xml:space="preserve">        r = self._api.generar_transaccion(monto=monto, moneda="COP", referencia=concepto)</w:t>
+      </w:r>
+    </w:p>
+    <w:p>
+      <w:pPr>
+        <w:ind w:left="720"/>
+        <w:rPr>
+          <w:lang w:val="es-CO"/>
+        </w:rPr>
+      </w:pPr>
+      <w:r>
+        <w:rPr>
+          <w:rFonts w:ascii="Courier New" w:eastAsia="Courier New" w:hAnsi="Courier New" w:cs="Courier New"/>
+          <w:sz w:val="20"/>
+          <w:szCs w:val="20"/>
+          <w:lang w:val="es-CO"/>
+        </w:rPr>
+        <w:t xml:space="preserve">        exitoso = r["estado"] == "APPROVED"</w:t>
+      </w:r>
+    </w:p>
+    <w:p>
+      <w:pPr>
+        <w:ind w:left="720"/>
+        <w:rPr>
+          <w:lang w:val="es-CO"/>
+        </w:rPr>
+      </w:pPr>
+      <w:r>
+        <w:rPr>
+          <w:rFonts w:ascii="Courier New" w:eastAsia="Courier New" w:hAnsi="Courier New" w:cs="Courier New"/>
+          <w:sz w:val="20"/>
+          <w:szCs w:val="20"/>
+          <w:lang w:val="es-CO"/>
+        </w:rPr>
+        <w:t xml:space="preserve">        return ResultadoPago(exitoso, r["ordenId"], "payu", monto)</w:t>
+      </w:r>
+    </w:p>
+    <w:p>
+      <w:pPr>
+        <w:spacing w:before="120"/>
+        <w:rPr>
+          <w:lang w:val="es-CO"/>
+        </w:rPr>
+      </w:pPr>
+      <w:r>
+        <w:rPr>
+          <w:i/>
+          <w:iCs/>
+          <w:lang w:val="es-CO"/>
+        </w:rPr>
+        <w:t xml:space="preserve">Nota. </w:t>
+      </w:r>
+      <w:r>
+        <w:rPr>
+          <w:lang w:val="es-CO"/>
+        </w:rPr>
+        <w:t xml:space="preserve">Extracto de plataforma-energia-app/backend/pagos.py. Cada adaptador traduce el mismo llamado uniforme (procesar_pago) a la forma exacta que exige su SDK, y traduce la respuesta de vuelta al mismo ResultadoPago; la plataforma nunca conoce StripeAPI ni PayUAPI directamente.</w:t>
+      </w:r>
+    </w:p>
+    <w:p>
+      <w:pPr>
+        <w:pStyle w:val="Ttulo3"/>
+        <w:spacing w:before="200" w:after="100" w:line="480" w:lineRule="auto"/>
+        <w:rPr>
+          <w:lang w:val="es-CO"/>
+        </w:rPr>
+      </w:pPr>
+      <w:bookmarkStart w:id="74" w:name="bm_adapter_gana"/>
+      <w:r>
+        <w:rPr>
+          <w:b/>
+          <w:bCs/>
+          <w:i/>
+          <w:iCs/>
+          <w:color w:val="000000"/>
+          <w:lang w:val="es-CO"/>
+        </w:rPr>
+        <w:t>Qué Gana la Plataforma con Esto</w:t>
+      </w:r>
+      <w:bookmarkEnd w:id="74"/>
+    </w:p>
+    <w:p>
+      <w:pPr>
+        <w:ind w:firstLine="720"/>
+        <w:jc w:val="both"/>
+        <w:rPr>
+          <w:lang w:val="es-CO"/>
+        </w:rPr>
+      </w:pPr>
+      <w:r>
+        <w:rPr>
+          <w:b/>
+          <w:bCs/>
+          <w:lang w:val="es-CO"/>
+        </w:rPr>
+        <w:t xml:space="preserve">Aisla la lógica de negocio del SDK externo. </w:t>
+      </w:r>
+      <w:r>
+        <w:rPr>
+          <w:lang w:val="es-CO"/>
+        </w:rPr>
+        <w:t xml:space="preserve">La plataforma programa contra PasarelaPago; el código que cierra una subasta o consulta la bandeja de pagos no cambia si mañana se agrega o se retira una pasarela.</w:t>
+      </w:r>
+    </w:p>
+    <w:p>
+      <w:pPr>
+        <w:ind w:firstLine="720"/>
+        <w:jc w:val="both"/>
+        <w:rPr>
+          <w:lang w:val="es-CO"/>
+        </w:rPr>
+      </w:pPr>
+      <w:r>
+        <w:rPr>
+          <w:b/>
+          <w:bCs/>
+          <w:lang w:val="es-CO"/>
+        </w:rPr>
+        <w:t xml:space="preserve">Un solo objeto de valor uniforme. </w:t>
+      </w:r>
+      <w:r>
+        <w:rPr>
+          <w:lang w:val="es-CO"/>
+        </w:rPr>
+        <w:t xml:space="preserve">ResultadoPago es igual sin importar qué pasarela se usó, así que el resto del sistema no necesita saber si el pago vino de Stripe o de PayU.</w:t>
+      </w:r>
+    </w:p>
+    <w:p>
+      <w:pPr>
+        <w:ind w:firstLine="720"/>
+        <w:jc w:val="both"/>
+        <w:rPr>
+          <w:lang w:val="es-CO"/>
+        </w:rPr>
+      </w:pPr>
+      <w:r>
+        <w:rPr>
+          <w:b/>
+          <w:bCs/>
+          <w:lang w:val="es-CO"/>
+        </w:rPr>
+        <w:t xml:space="preserve">Abierto/cerrado. </w:t>
+      </w:r>
+      <w:r>
+        <w:rPr>
+          <w:lang w:val="es-CO"/>
+        </w:rPr>
+        <w:t xml:space="preserve">Agregar una pasarela nueva (Mercado Pago, Wompi) es crear un adaptador más y registrarlo; el código que cobra no cambia. La prueba test_se_puede_agregar_una_pasarela_sin_modificar_las_existentes lo demuestra con un AdaptadorFalso definido dentro del propio test.</w:t>
+      </w:r>
+    </w:p>
+    <w:p>
+      <w:pPr>
+        <w:ind w:firstLine="720"/>
+        <w:jc w:val="both"/>
+        <w:rPr>
+          <w:lang w:val="es-CO"/>
+        </w:rPr>
+      </w:pPr>
+      <w:r>
+        <w:rPr>
+          <w:b/>
+          <w:bCs/>
+          <w:lang w:val="es-CO"/>
+        </w:rPr>
+        <w:t xml:space="preserve">Relación con las demás fábricas del proyecto. </w:t>
+      </w:r>
+      <w:r>
+        <w:rPr>
+          <w:lang w:val="es-CO"/>
+        </w:rPr>
+        <w:t xml:space="preserve">Factory Method y Abstract Factory deciden qué clase PROPIA instanciar; Adapter conecta la plataforma con una clase EXTERNA y ya existente cuya interfaz no se puede modificar, traduciéndola a la interfaz que la plataforma necesita.</w:t>
+      </w:r>
+    </w:p>
+    <w:p>
+      <w:pPr>
+        <w:pStyle w:val="Ttulo3"/>
+        <w:spacing w:before="200" w:after="100" w:line="480" w:lineRule="auto"/>
+        <w:rPr>
+          <w:lang w:val="es-CO"/>
+        </w:rPr>
+      </w:pPr>
+      <w:bookmarkStart w:id="75" w:name="bm_adapter_justificacion"/>
+      <w:r>
+        <w:rPr>
+          <w:b/>
+          <w:bCs/>
+          <w:i/>
+          <w:iCs/>
+          <w:color w:val="000000"/>
+          <w:lang w:val="es-CO"/>
+        </w:rPr>
+        <w:t>Justificación de su Uso en el Proyecto</w:t>
+      </w:r>
+      <w:bookmarkEnd w:id="75"/>
+    </w:p>
+    <w:p>
+      <w:pPr>
+        <w:ind w:firstLine="720"/>
+        <w:jc w:val="both"/>
+        <w:rPr>
+          <w:lang w:val="es-CO"/>
+        </w:rPr>
+      </w:pPr>
+      <w:r>
+        <w:rPr>
+          <w:lang w:val="es-CO"/>
+        </w:rPr>
+        <w:t xml:space="preserve">El patrón Adapter resulta pertinente para este proyecto porque la Contextualización del Proyecto contempla explícitamente ampliar la plataforma con pagos electrónicos, y ese requisito implica integrarse con al menos una pasarela externa cuya interfaz la plataforma no controla ni puede modificar. Envolver cada SDK en un adaptador propio mantiene la lógica de la subasta y del cobro completamente separada de los detalles de cada proveedor, y permite migrar de pasarela o soportar varias sin arriesgar el resto del sistema.</w:t>
+      </w:r>
+    </w:p>
+    <w:p>
+      <w:pPr>
+        <w:pStyle w:val="Ttulo3"/>
+        <w:spacing w:before="200" w:after="100" w:line="480" w:lineRule="auto"/>
+        <w:rPr>
+          <w:lang w:val="es-CO"/>
+        </w:rPr>
+      </w:pPr>
+      <w:bookmarkStart w:id="76" w:name="bm_adapter_evaluacion"/>
+      <w:r>
+        <w:rPr>
+          <w:b/>
+          <w:bCs/>
+          <w:i/>
+          <w:iCs/>
+          <w:color w:val="000000"/>
+          <w:lang w:val="es-CO"/>
+        </w:rPr>
+        <w:t>Evaluación: ¿Sirve este patrón para el proyecto?</w:t>
+      </w:r>
+      <w:bookmarkEnd w:id="76"/>
+    </w:p>
+    <w:p>
+      <w:pPr>
+        <w:ind w:firstLine="720"/>
+        <w:jc w:val="both"/>
+        <w:rPr>
+          <w:lang w:val="es-CO"/>
+        </w:rPr>
+      </w:pPr>
+      <w:r>
+        <w:rPr>
+          <w:b/>
+          <w:bCs/>
+          <w:lang w:val="es-CO"/>
+        </w:rPr>
+        <w:t xml:space="preserve">Veredicto: sí sirve. </w:t>
+      </w:r>
+      <w:r>
+        <w:rPr>
+          <w:lang w:val="es-CO"/>
+        </w:rPr>
+        <w:t xml:space="preserve">El patrón Adapter sí sirve para el proyecto porque resuelve un caso de uso real e inevitable en cuanto la plataforma cobre dinero de verdad: conectar un SDK externo con una interfaz que no se puede cambiar. Se integró sin modificar la lógica de la subasta existente (solo se agregó una llamada a _cobrar_transaccion) y los 132 casos de los patrones anteriores siguen pasando sin cambios.</w:t>
+      </w:r>
+    </w:p>
+    <w:p>
+      <w:pPr>
+        <w:ind w:firstLine="720"/>
+        <w:jc w:val="both"/>
+        <w:rPr>
+          <w:lang w:val="es-CO"/>
+        </w:rPr>
+      </w:pPr>
+      <w:r>
+        <w:rPr>
+          <w:lang w:val="es-CO"/>
+        </w:rPr>
+        <w:t xml:space="preserve">Matiz a tener en cuenta: Adapter no decide QUÉ pasarela usar en cada caso (eso ya lo resuelve el registro obtener_pasarela, más parecido a una fábrica); su valor está específicamente en traducir una interfaz externa que no se puede tocar. Si la plataforma controlara el código de la pasarela (por ejemplo, un servicio de pagos propio), no habría una interfaz incompatible que adaptar y el patrón dejaría de justificarse.</w:t>
+      </w:r>
+    </w:p>
+    <w:p>
+      <w:pPr>
+        <w:pStyle w:val="Ttulo3"/>
+        <w:spacing w:before="200" w:after="100" w:line="480" w:lineRule="auto"/>
+        <w:rPr>
+          <w:lang w:val="es-CO"/>
+        </w:rPr>
+      </w:pPr>
+      <w:bookmarkStart w:id="77" w:name="bm_adapter_validacion"/>
+      <w:r>
+        <w:rPr>
+          <w:b/>
+          <w:bCs/>
+          <w:i/>
+          <w:iCs/>
+          <w:color w:val="000000"/>
+          <w:lang w:val="es-CO"/>
+        </w:rPr>
+        <w:t>Validación del Patrón</w:t>
+      </w:r>
+      <w:bookmarkEnd w:id="77"/>
+    </w:p>
+    <w:p>
+      <w:pPr>
+        <w:ind w:firstLine="720"/>
+        <w:jc w:val="both"/>
+        <w:rPr>
+          <w:lang w:val="es-CO"/>
+        </w:rPr>
+      </w:pPr>
+      <w:r>
+        <w:rPr>
+          <w:lang w:val="es-CO"/>
+        </w:rPr>
+        <w:t xml:space="preserve">La validación del patrón Adapter se realizó mediante pruebas unitarias automatizadas con pytest, que verifican que ambos adaptadores implementan PasarelaPago, que AdaptadorStripe convierte el monto a centavos antes de llamar al SDK y AdaptadorPayU lo envía sin convertir, que la respuesta de cada SDK se traduce correctamente a ResultadoPago (incluyendo el caso de un pago rechazado), y que el registro de pasarelas resuelve por nombre con el mismo contrato que las demás fábricas del proyecto. La suite Documentacion/Semana 7/test_adapter.py ejecutó 17 casos, todos superados, y el conjunto completo de pruebas del proyecto —Singleton, Factory Method, Abstract Factory, Builder, Prototype y Adapter— pasa sin errores (132 casos en total).</w:t>
+      </w:r>
+    </w:p>
+    <w:p/>
+    <w:p>
+      <w:pPr>
+        <w:pStyle w:val="Ttulo3"/>
+        <w:spacing w:before="200" w:after="100" w:line="480" w:lineRule="auto"/>
+        <w:rPr>
+          <w:lang w:val="es-CO"/>
+        </w:rPr>
+      </w:pPr>
+      <w:bookmarkStart w:id="55" w:name="bm_factory_conclusion"/>
+      <w:r>
+        <w:rPr>
+          <w:b/>
+          <w:bCs/>
+          <w:i/>
+          <w:iCs/>
+          <w:color w:val="000000"/>
+          <w:lang w:val="es-CO"/>
+        </w:rPr>
+        <w:t>Conclusión</w:t>
+      </w:r>
+      <w:bookmarkEnd w:id="55"/>
+    </w:p>
+    <w:p>
+      <w:pPr>
+        <w:ind w:firstLine="720"/>
+        <w:jc w:val="both"/>
+        <w:rPr>
+          <w:lang w:val="es-CO"/>
+        </w:rPr>
+      </w:pPr>
+      <w:r>
+        <w:rPr>
+          <w:lang w:val="es-CO"/>
+        </w:rPr>
+        <w:lastRenderedPageBreak/>
+        <w:t>En resumen, el patrón Singleton garantiza que toda la plataforma comparta un mismo estado consistente, el Factory Method garantiza que cada tipo de dispositivo IoT se cree y se comporte correctamente sin acoplar ese conocimiento al resto del sistema, el Abstract Factory garantiza que cada canal de notificación genere la familia completa de avisos con un formato coherente, el Builder permite construir el reporte energético paso a paso y obtenerlo en distintas representaciones sin duplicar la lógica de negocio, el Prototype permite clonar un dispositivo IoT ya calibrado para repetir esa configuración en altas posteriores sin volver a escribirla a mano, y el Adapter permite integrar pasarelas de pago externas con interfaces incompatibles sin que esa incompatibilidad contamine la lógica de negocio. Los seis patrones son complementarios: el primero define cuántas instancias de la plataforma existen; el segundo y el tercero definen cómo se crean los objetos —individuales o en familia— que la plataforma administra; el cuarto define cómo se ensambla un objeto complejo a partir de esos datos; el quinto define cómo se reutiliza un objeto ya configurado para crear otros similares sin repetir su configuración; y el sexto define cómo se conecta la plataforma con clases externas cuya interfaz no se puede modificar.</w:t>
       </w:r>
     </w:p>
     <w:p>

</xml_diff>

<commit_message>
Implementacion de los patrones Bridge y Facade (Semana 9) integrados en la app y en el documento
</commit_message>
<xml_diff>
--- a/Documentacion/plataforma-Comercio-Energia.docx
+++ b/Documentacion/plataforma-Comercio-Energia.docx
@@ -3349,6 +3349,674 @@
           <w:tab w:val="right" w:leader="dot" w:pos="9360"/>
         </w:tabs>
         <w:spacing w:after="80" w:line="360" w:lineRule="auto"/>
+        <w:ind w:left="360"/>
+        <w:rPr>
+          <w:lang w:val="es-CO"/>
+        </w:rPr>
+      </w:pPr>
+      <w:r>
+        <w:rPr>
+          <w:lang w:val="es-CO"/>
+        </w:rPr>
+        <w:t xml:space="preserve">Aplicación del Patrón de Diseño Bridge en la Sincronización de Dispositivos IoT</w:t>
+      </w:r>
+      <w:r>
+        <w:rPr>
+          <w:lang w:val="es-CO"/>
+        </w:rPr>
+        <w:tab/>
+      </w:r>
+      <w:r>
+        <w:fldChar w:fldCharType="begin"/>
+      </w:r>
+      <w:r>
+        <w:rPr>
+          <w:lang w:val="es-CO"/>
+        </w:rPr>
+        <w:instrText>PAGEREF bm_bridge \h</w:instrText>
+      </w:r>
+      <w:r>
+        <w:fldChar w:fldCharType="separate"/>
+      </w:r>
+      <w:r>
+        <w:rPr>
+          <w:noProof/>
+          <w:lang w:val="es-CO"/>
+        </w:rPr>
+        <w:t xml:space="preserve">1</w:t>
+      </w:r>
+      <w:r>
+        <w:fldChar w:fldCharType="end"/>
+      </w:r>
+    </w:p>
+    <w:p>
+      <w:pPr>
+        <w:tabs>
+          <w:tab w:val="right" w:leader="dot" w:pos="9360"/>
+        </w:tabs>
+        <w:spacing w:after="80" w:line="360" w:lineRule="auto"/>
+        <w:ind w:left="720"/>
+        <w:rPr>
+          <w:lang w:val="es-CO"/>
+        </w:rPr>
+      </w:pPr>
+      <w:r>
+        <w:rPr>
+          <w:i/>
+          <w:iCs/>
+          <w:lang w:val="es-CO"/>
+        </w:rPr>
+        <w:t xml:space="preserve">El Problema que Resuelve</w:t>
+      </w:r>
+      <w:r>
+        <w:rPr>
+          <w:lang w:val="es-CO"/>
+        </w:rPr>
+        <w:tab/>
+      </w:r>
+      <w:r>
+        <w:fldChar w:fldCharType="begin"/>
+      </w:r>
+      <w:r>
+        <w:rPr>
+          <w:lang w:val="es-CO"/>
+        </w:rPr>
+        <w:instrText>PAGEREF bm_bridge_problema \h</w:instrText>
+      </w:r>
+      <w:r>
+        <w:fldChar w:fldCharType="separate"/>
+      </w:r>
+      <w:r>
+        <w:rPr>
+          <w:noProof/>
+          <w:lang w:val="es-CO"/>
+        </w:rPr>
+        <w:t xml:space="preserve">1</w:t>
+      </w:r>
+      <w:r>
+        <w:fldChar w:fldCharType="end"/>
+      </w:r>
+    </w:p>
+    <w:p>
+      <w:pPr>
+        <w:tabs>
+          <w:tab w:val="right" w:leader="dot" w:pos="9360"/>
+        </w:tabs>
+        <w:spacing w:after="80" w:line="360" w:lineRule="auto"/>
+        <w:ind w:left="720"/>
+        <w:rPr>
+          <w:lang w:val="es-CO"/>
+        </w:rPr>
+      </w:pPr>
+      <w:r>
+        <w:rPr>
+          <w:i/>
+          <w:iCs/>
+          <w:lang w:val="es-CO"/>
+        </w:rPr>
+        <w:t xml:space="preserve">Cómo lo Soluciona el Patrón</w:t>
+      </w:r>
+      <w:r>
+        <w:rPr>
+          <w:lang w:val="es-CO"/>
+        </w:rPr>
+        <w:tab/>
+      </w:r>
+      <w:r>
+        <w:fldChar w:fldCharType="begin"/>
+      </w:r>
+      <w:r>
+        <w:rPr>
+          <w:lang w:val="es-CO"/>
+        </w:rPr>
+        <w:instrText>PAGEREF bm_bridge_solucion \h</w:instrText>
+      </w:r>
+      <w:r>
+        <w:fldChar w:fldCharType="separate"/>
+      </w:r>
+      <w:r>
+        <w:rPr>
+          <w:noProof/>
+          <w:lang w:val="es-CO"/>
+        </w:rPr>
+        <w:t xml:space="preserve">1</w:t>
+      </w:r>
+      <w:r>
+        <w:fldChar w:fldCharType="end"/>
+      </w:r>
+    </w:p>
+    <w:p>
+      <w:pPr>
+        <w:tabs>
+          <w:tab w:val="right" w:leader="dot" w:pos="9360"/>
+        </w:tabs>
+        <w:spacing w:after="80" w:line="360" w:lineRule="auto"/>
+        <w:ind w:left="720"/>
+        <w:rPr>
+          <w:lang w:val="es-CO"/>
+        </w:rPr>
+      </w:pPr>
+      <w:r>
+        <w:rPr>
+          <w:i/>
+          <w:iCs/>
+          <w:lang w:val="es-CO"/>
+        </w:rPr>
+        <w:t xml:space="preserve">Qué Gana la Plataforma con Esto</w:t>
+      </w:r>
+      <w:r>
+        <w:rPr>
+          <w:lang w:val="es-CO"/>
+        </w:rPr>
+        <w:tab/>
+      </w:r>
+      <w:r>
+        <w:fldChar w:fldCharType="begin"/>
+      </w:r>
+      <w:r>
+        <w:rPr>
+          <w:lang w:val="es-CO"/>
+        </w:rPr>
+        <w:instrText>PAGEREF bm_bridge_gana \h</w:instrText>
+      </w:r>
+      <w:r>
+        <w:fldChar w:fldCharType="separate"/>
+      </w:r>
+      <w:r>
+        <w:rPr>
+          <w:noProof/>
+          <w:lang w:val="es-CO"/>
+        </w:rPr>
+        <w:t xml:space="preserve">1</w:t>
+      </w:r>
+      <w:r>
+        <w:fldChar w:fldCharType="end"/>
+      </w:r>
+    </w:p>
+    <w:p>
+      <w:pPr>
+        <w:tabs>
+          <w:tab w:val="right" w:leader="dot" w:pos="9360"/>
+        </w:tabs>
+        <w:spacing w:after="80" w:line="360" w:lineRule="auto"/>
+        <w:ind w:left="720"/>
+        <w:rPr>
+          <w:lang w:val="es-CO"/>
+        </w:rPr>
+      </w:pPr>
+      <w:r>
+        <w:rPr>
+          <w:i/>
+          <w:iCs/>
+          <w:lang w:val="es-CO"/>
+        </w:rPr>
+        <w:t xml:space="preserve">Justificación de su Uso en el Proyecto</w:t>
+      </w:r>
+      <w:r>
+        <w:rPr>
+          <w:lang w:val="es-CO"/>
+        </w:rPr>
+        <w:tab/>
+      </w:r>
+      <w:r>
+        <w:fldChar w:fldCharType="begin"/>
+      </w:r>
+      <w:r>
+        <w:rPr>
+          <w:lang w:val="es-CO"/>
+        </w:rPr>
+        <w:instrText>PAGEREF bm_bridge_justificacion \h</w:instrText>
+      </w:r>
+      <w:r>
+        <w:fldChar w:fldCharType="separate"/>
+      </w:r>
+      <w:r>
+        <w:rPr>
+          <w:noProof/>
+          <w:lang w:val="es-CO"/>
+        </w:rPr>
+        <w:t xml:space="preserve">1</w:t>
+      </w:r>
+      <w:r>
+        <w:fldChar w:fldCharType="end"/>
+      </w:r>
+    </w:p>
+    <w:p>
+      <w:pPr>
+        <w:tabs>
+          <w:tab w:val="right" w:leader="dot" w:pos="9360"/>
+        </w:tabs>
+        <w:spacing w:after="80" w:line="360" w:lineRule="auto"/>
+        <w:ind w:left="720"/>
+        <w:rPr>
+          <w:lang w:val="es-CO"/>
+        </w:rPr>
+      </w:pPr>
+      <w:r>
+        <w:rPr>
+          <w:i/>
+          <w:iCs/>
+          <w:lang w:val="es-CO"/>
+        </w:rPr>
+        <w:t xml:space="preserve">Evaluación: ¿Sirve este patrón para el proyecto?</w:t>
+      </w:r>
+      <w:r>
+        <w:rPr>
+          <w:lang w:val="es-CO"/>
+        </w:rPr>
+        <w:tab/>
+      </w:r>
+      <w:r>
+        <w:fldChar w:fldCharType="begin"/>
+      </w:r>
+      <w:r>
+        <w:rPr>
+          <w:lang w:val="es-CO"/>
+        </w:rPr>
+        <w:instrText>PAGEREF bm_bridge_evaluacion \h</w:instrText>
+      </w:r>
+      <w:r>
+        <w:fldChar w:fldCharType="separate"/>
+      </w:r>
+      <w:r>
+        <w:rPr>
+          <w:noProof/>
+          <w:lang w:val="es-CO"/>
+        </w:rPr>
+        <w:t xml:space="preserve">1</w:t>
+      </w:r>
+      <w:r>
+        <w:fldChar w:fldCharType="end"/>
+      </w:r>
+    </w:p>
+    <w:p>
+      <w:pPr>
+        <w:tabs>
+          <w:tab w:val="right" w:leader="dot" w:pos="9360"/>
+        </w:tabs>
+        <w:spacing w:after="80" w:line="360" w:lineRule="auto"/>
+        <w:ind w:left="720"/>
+        <w:rPr>
+          <w:lang w:val="es-CO"/>
+        </w:rPr>
+      </w:pPr>
+      <w:r>
+        <w:rPr>
+          <w:i/>
+          <w:iCs/>
+          <w:lang w:val="es-CO"/>
+        </w:rPr>
+        <w:t xml:space="preserve">Validación del Patrón</w:t>
+      </w:r>
+      <w:r>
+        <w:rPr>
+          <w:lang w:val="es-CO"/>
+        </w:rPr>
+        <w:tab/>
+      </w:r>
+      <w:r>
+        <w:fldChar w:fldCharType="begin"/>
+      </w:r>
+      <w:r>
+        <w:rPr>
+          <w:lang w:val="es-CO"/>
+        </w:rPr>
+        <w:instrText>PAGEREF bm_bridge_validacion \h</w:instrText>
+      </w:r>
+      <w:r>
+        <w:fldChar w:fldCharType="separate"/>
+      </w:r>
+      <w:r>
+        <w:rPr>
+          <w:noProof/>
+          <w:lang w:val="es-CO"/>
+        </w:rPr>
+        <w:t xml:space="preserve">1</w:t>
+      </w:r>
+      <w:r>
+        <w:fldChar w:fldCharType="end"/>
+      </w:r>
+    </w:p>
+    <w:p>
+      <w:pPr>
+        <w:tabs>
+          <w:tab w:val="right" w:leader="dot" w:pos="9360"/>
+        </w:tabs>
+        <w:spacing w:after="80" w:line="360" w:lineRule="auto"/>
+        <w:ind w:left="360"/>
+        <w:rPr>
+          <w:lang w:val="es-CO"/>
+        </w:rPr>
+      </w:pPr>
+      <w:r>
+        <w:rPr>
+          <w:lang w:val="es-CO"/>
+        </w:rPr>
+        <w:t xml:space="preserve">Aplicación del Patrón de Diseño Facade en el Alta de Dispositivos IoT</w:t>
+      </w:r>
+      <w:r>
+        <w:rPr>
+          <w:lang w:val="es-CO"/>
+        </w:rPr>
+        <w:tab/>
+      </w:r>
+      <w:r>
+        <w:fldChar w:fldCharType="begin"/>
+      </w:r>
+      <w:r>
+        <w:rPr>
+          <w:lang w:val="es-CO"/>
+        </w:rPr>
+        <w:instrText>PAGEREF bm_facade \h</w:instrText>
+      </w:r>
+      <w:r>
+        <w:fldChar w:fldCharType="separate"/>
+      </w:r>
+      <w:r>
+        <w:rPr>
+          <w:noProof/>
+          <w:lang w:val="es-CO"/>
+        </w:rPr>
+        <w:t xml:space="preserve">1</w:t>
+      </w:r>
+      <w:r>
+        <w:fldChar w:fldCharType="end"/>
+      </w:r>
+    </w:p>
+    <w:p>
+      <w:pPr>
+        <w:tabs>
+          <w:tab w:val="right" w:leader="dot" w:pos="9360"/>
+        </w:tabs>
+        <w:spacing w:after="80" w:line="360" w:lineRule="auto"/>
+        <w:ind w:left="720"/>
+        <w:rPr>
+          <w:lang w:val="es-CO"/>
+        </w:rPr>
+      </w:pPr>
+      <w:r>
+        <w:rPr>
+          <w:i/>
+          <w:iCs/>
+          <w:lang w:val="es-CO"/>
+        </w:rPr>
+        <w:t xml:space="preserve">El Problema que Resuelve</w:t>
+      </w:r>
+      <w:r>
+        <w:rPr>
+          <w:lang w:val="es-CO"/>
+        </w:rPr>
+        <w:tab/>
+      </w:r>
+      <w:r>
+        <w:fldChar w:fldCharType="begin"/>
+      </w:r>
+      <w:r>
+        <w:rPr>
+          <w:lang w:val="es-CO"/>
+        </w:rPr>
+        <w:instrText>PAGEREF bm_facade_problema \h</w:instrText>
+      </w:r>
+      <w:r>
+        <w:fldChar w:fldCharType="separate"/>
+      </w:r>
+      <w:r>
+        <w:rPr>
+          <w:noProof/>
+          <w:lang w:val="es-CO"/>
+        </w:rPr>
+        <w:t xml:space="preserve">1</w:t>
+      </w:r>
+      <w:r>
+        <w:fldChar w:fldCharType="end"/>
+      </w:r>
+    </w:p>
+    <w:p>
+      <w:pPr>
+        <w:tabs>
+          <w:tab w:val="right" w:leader="dot" w:pos="9360"/>
+        </w:tabs>
+        <w:spacing w:after="80" w:line="360" w:lineRule="auto"/>
+        <w:ind w:left="720"/>
+        <w:rPr>
+          <w:lang w:val="es-CO"/>
+        </w:rPr>
+      </w:pPr>
+      <w:r>
+        <w:rPr>
+          <w:i/>
+          <w:iCs/>
+          <w:lang w:val="es-CO"/>
+        </w:rPr>
+        <w:t xml:space="preserve">Cómo lo Soluciona el Patrón</w:t>
+      </w:r>
+      <w:r>
+        <w:rPr>
+          <w:lang w:val="es-CO"/>
+        </w:rPr>
+        <w:tab/>
+      </w:r>
+      <w:r>
+        <w:fldChar w:fldCharType="begin"/>
+      </w:r>
+      <w:r>
+        <w:rPr>
+          <w:lang w:val="es-CO"/>
+        </w:rPr>
+        <w:instrText>PAGEREF bm_facade_solucion \h</w:instrText>
+      </w:r>
+      <w:r>
+        <w:fldChar w:fldCharType="separate"/>
+      </w:r>
+      <w:r>
+        <w:rPr>
+          <w:noProof/>
+          <w:lang w:val="es-CO"/>
+        </w:rPr>
+        <w:t xml:space="preserve">1</w:t>
+      </w:r>
+      <w:r>
+        <w:fldChar w:fldCharType="end"/>
+      </w:r>
+    </w:p>
+    <w:p>
+      <w:pPr>
+        <w:tabs>
+          <w:tab w:val="right" w:leader="dot" w:pos="9360"/>
+        </w:tabs>
+        <w:spacing w:after="80" w:line="360" w:lineRule="auto"/>
+        <w:ind w:left="720"/>
+        <w:rPr>
+          <w:lang w:val="es-CO"/>
+        </w:rPr>
+      </w:pPr>
+      <w:r>
+        <w:rPr>
+          <w:i/>
+          <w:iCs/>
+          <w:lang w:val="es-CO"/>
+        </w:rPr>
+        <w:t xml:space="preserve">Qué Gana la Plataforma con Esto</w:t>
+      </w:r>
+      <w:r>
+        <w:rPr>
+          <w:lang w:val="es-CO"/>
+        </w:rPr>
+        <w:tab/>
+      </w:r>
+      <w:r>
+        <w:fldChar w:fldCharType="begin"/>
+      </w:r>
+      <w:r>
+        <w:rPr>
+          <w:lang w:val="es-CO"/>
+        </w:rPr>
+        <w:instrText>PAGEREF bm_facade_gana \h</w:instrText>
+      </w:r>
+      <w:r>
+        <w:fldChar w:fldCharType="separate"/>
+      </w:r>
+      <w:r>
+        <w:rPr>
+          <w:noProof/>
+          <w:lang w:val="es-CO"/>
+        </w:rPr>
+        <w:t xml:space="preserve">1</w:t>
+      </w:r>
+      <w:r>
+        <w:fldChar w:fldCharType="end"/>
+      </w:r>
+    </w:p>
+    <w:p>
+      <w:pPr>
+        <w:tabs>
+          <w:tab w:val="right" w:leader="dot" w:pos="9360"/>
+        </w:tabs>
+        <w:spacing w:after="80" w:line="360" w:lineRule="auto"/>
+        <w:ind w:left="720"/>
+        <w:rPr>
+          <w:lang w:val="es-CO"/>
+        </w:rPr>
+      </w:pPr>
+      <w:r>
+        <w:rPr>
+          <w:i/>
+          <w:iCs/>
+          <w:lang w:val="es-CO"/>
+        </w:rPr>
+        <w:t xml:space="preserve">Justificación de su Uso en el Proyecto</w:t>
+      </w:r>
+      <w:r>
+        <w:rPr>
+          <w:lang w:val="es-CO"/>
+        </w:rPr>
+        <w:tab/>
+      </w:r>
+      <w:r>
+        <w:fldChar w:fldCharType="begin"/>
+      </w:r>
+      <w:r>
+        <w:rPr>
+          <w:lang w:val="es-CO"/>
+        </w:rPr>
+        <w:instrText>PAGEREF bm_facade_justificacion \h</w:instrText>
+      </w:r>
+      <w:r>
+        <w:fldChar w:fldCharType="separate"/>
+      </w:r>
+      <w:r>
+        <w:rPr>
+          <w:noProof/>
+          <w:lang w:val="es-CO"/>
+        </w:rPr>
+        <w:t xml:space="preserve">1</w:t>
+      </w:r>
+      <w:r>
+        <w:fldChar w:fldCharType="end"/>
+      </w:r>
+    </w:p>
+    <w:p>
+      <w:pPr>
+        <w:tabs>
+          <w:tab w:val="right" w:leader="dot" w:pos="9360"/>
+        </w:tabs>
+        <w:spacing w:after="80" w:line="360" w:lineRule="auto"/>
+        <w:ind w:left="720"/>
+        <w:rPr>
+          <w:lang w:val="es-CO"/>
+        </w:rPr>
+      </w:pPr>
+      <w:r>
+        <w:rPr>
+          <w:i/>
+          <w:iCs/>
+          <w:lang w:val="es-CO"/>
+        </w:rPr>
+        <w:t xml:space="preserve">Evaluación: ¿Sirve este patrón para el proyecto?</w:t>
+      </w:r>
+      <w:r>
+        <w:rPr>
+          <w:lang w:val="es-CO"/>
+        </w:rPr>
+        <w:tab/>
+      </w:r>
+      <w:r>
+        <w:fldChar w:fldCharType="begin"/>
+      </w:r>
+      <w:r>
+        <w:rPr>
+          <w:lang w:val="es-CO"/>
+        </w:rPr>
+        <w:instrText>PAGEREF bm_facade_evaluacion \h</w:instrText>
+      </w:r>
+      <w:r>
+        <w:fldChar w:fldCharType="separate"/>
+      </w:r>
+      <w:r>
+        <w:rPr>
+          <w:noProof/>
+          <w:lang w:val="es-CO"/>
+        </w:rPr>
+        <w:t xml:space="preserve">1</w:t>
+      </w:r>
+      <w:r>
+        <w:fldChar w:fldCharType="end"/>
+      </w:r>
+    </w:p>
+    <w:p>
+      <w:pPr>
+        <w:tabs>
+          <w:tab w:val="right" w:leader="dot" w:pos="9360"/>
+        </w:tabs>
+        <w:spacing w:after="80" w:line="360" w:lineRule="auto"/>
+        <w:ind w:left="720"/>
+        <w:rPr>
+          <w:lang w:val="es-CO"/>
+        </w:rPr>
+      </w:pPr>
+      <w:r>
+        <w:rPr>
+          <w:i/>
+          <w:iCs/>
+          <w:lang w:val="es-CO"/>
+        </w:rPr>
+        <w:t xml:space="preserve">Validación del Patrón</w:t>
+      </w:r>
+      <w:r>
+        <w:rPr>
+          <w:lang w:val="es-CO"/>
+        </w:rPr>
+        <w:tab/>
+      </w:r>
+      <w:r>
+        <w:fldChar w:fldCharType="begin"/>
+      </w:r>
+      <w:r>
+        <w:rPr>
+          <w:lang w:val="es-CO"/>
+        </w:rPr>
+        <w:instrText>PAGEREF bm_facade_validacion \h</w:instrText>
+      </w:r>
+      <w:r>
+        <w:fldChar w:fldCharType="separate"/>
+      </w:r>
+      <w:r>
+        <w:rPr>
+          <w:noProof/>
+          <w:lang w:val="es-CO"/>
+        </w:rPr>
+        <w:t xml:space="preserve">1</w:t>
+      </w:r>
+      <w:r>
+        <w:fldChar w:fldCharType="end"/>
+      </w:r>
+    </w:p>
+    <w:p>
+      <w:pPr>
+        <w:tabs>
+          <w:tab w:val="right" w:leader="dot" w:pos="9360"/>
+        </w:tabs>
+        <w:spacing w:after="80" w:line="360" w:lineRule="auto"/>
         <w:ind w:left="720"/>
         <w:rPr>
           <w:lang w:val="es-CO"/>
@@ -5722,6 +6390,282 @@
     </w:p>
     <w:p>
       <w:pPr>
+        <w:tabs>
+          <w:tab w:val="right" w:leader="dot" w:pos="9360"/>
+        </w:tabs>
+        <w:spacing w:after="80" w:line="360" w:lineRule="auto"/>
+        <w:ind w:left="360" w:hanging="360"/>
+        <w:rPr>
+          <w:lang w:val="es-CO"/>
+        </w:rPr>
+      </w:pPr>
+      <w:r>
+        <w:rPr>
+          <w:lang w:val="es-CO"/>
+        </w:rPr>
+        <w:t xml:space="preserve">Figura 41. Implementor ProtocoloLectura y la Abstraction SincronizadorConReintentos en sincronizacion.py</w:t>
+      </w:r>
+      <w:r>
+        <w:rPr>
+          <w:lang w:val="es-CO"/>
+        </w:rPr>
+        <w:tab/>
+      </w:r>
+      <w:r>
+        <w:fldChar w:fldCharType="begin"/>
+      </w:r>
+      <w:r>
+        <w:rPr>
+          <w:lang w:val="es-CO"/>
+        </w:rPr>
+        <w:instrText>PAGEREF bm_fig41 \h</w:instrText>
+      </w:r>
+      <w:r>
+        <w:fldChar w:fldCharType="separate"/>
+      </w:r>
+      <w:r>
+        <w:rPr>
+          <w:noProof/>
+          <w:lang w:val="es-CO"/>
+        </w:rPr>
+        <w:t xml:space="preserve">1</w:t>
+      </w:r>
+      <w:r>
+        <w:fldChar w:fldCharType="end"/>
+      </w:r>
+    </w:p>
+    <w:p>
+      <w:pPr>
+        <w:tabs>
+          <w:tab w:val="right" w:leader="dot" w:pos="9360"/>
+        </w:tabs>
+        <w:spacing w:after="80" w:line="360" w:lineRule="auto"/>
+        <w:ind w:left="360" w:hanging="360"/>
+        <w:rPr>
+          <w:lang w:val="es-CO"/>
+        </w:rPr>
+      </w:pPr>
+      <w:r>
+        <w:rPr>
+          <w:lang w:val="es-CO"/>
+        </w:rPr>
+        <w:t xml:space="preserve">Figura 42. Diagrama UML de clases del patrón Bridge aplicado a la sincronización de dispositivos IoT</w:t>
+      </w:r>
+      <w:r>
+        <w:rPr>
+          <w:lang w:val="es-CO"/>
+        </w:rPr>
+        <w:tab/>
+      </w:r>
+      <w:r>
+        <w:fldChar w:fldCharType="begin"/>
+      </w:r>
+      <w:r>
+        <w:rPr>
+          <w:lang w:val="es-CO"/>
+        </w:rPr>
+        <w:instrText>PAGEREF bm_fig42 \h</w:instrText>
+      </w:r>
+      <w:r>
+        <w:fldChar w:fldCharType="separate"/>
+      </w:r>
+      <w:r>
+        <w:rPr>
+          <w:noProof/>
+          <w:lang w:val="es-CO"/>
+        </w:rPr>
+        <w:t xml:space="preserve">1</w:t>
+      </w:r>
+      <w:r>
+        <w:fldChar w:fldCharType="end"/>
+      </w:r>
+    </w:p>
+    <w:p>
+      <w:pPr>
+        <w:tabs>
+          <w:tab w:val="right" w:leader="dot" w:pos="9360"/>
+        </w:tabs>
+        <w:spacing w:after="80" w:line="360" w:lineRule="auto"/>
+        <w:ind w:left="360" w:hanging="360"/>
+        <w:rPr>
+          <w:lang w:val="es-CO"/>
+        </w:rPr>
+      </w:pPr>
+      <w:r>
+        <w:rPr>
+          <w:lang w:val="es-CO"/>
+        </w:rPr>
+        <w:t xml:space="preserve">Figura 43. Resultados de la ejecución de las pruebas unitarias del patrón Bridge</w:t>
+      </w:r>
+      <w:r>
+        <w:rPr>
+          <w:lang w:val="es-CO"/>
+        </w:rPr>
+        <w:tab/>
+      </w:r>
+      <w:r>
+        <w:fldChar w:fldCharType="begin"/>
+      </w:r>
+      <w:r>
+        <w:rPr>
+          <w:lang w:val="es-CO"/>
+        </w:rPr>
+        <w:instrText>PAGEREF bm_fig43 \h</w:instrText>
+      </w:r>
+      <w:r>
+        <w:fldChar w:fldCharType="separate"/>
+      </w:r>
+      <w:r>
+        <w:rPr>
+          <w:noProof/>
+          <w:lang w:val="es-CO"/>
+        </w:rPr>
+        <w:t xml:space="preserve">1</w:t>
+      </w:r>
+      <w:r>
+        <w:fldChar w:fldCharType="end"/>
+      </w:r>
+    </w:p>
+    <w:p>
+      <w:pPr>
+        <w:tabs>
+          <w:tab w:val="right" w:leader="dot" w:pos="9360"/>
+        </w:tabs>
+        <w:spacing w:after="80" w:line="360" w:lineRule="auto"/>
+        <w:ind w:left="360" w:hanging="360"/>
+        <w:rPr>
+          <w:lang w:val="es-CO"/>
+        </w:rPr>
+      </w:pPr>
+      <w:r>
+        <w:rPr>
+          <w:lang w:val="es-CO"/>
+        </w:rPr>
+        <w:t xml:space="preserve">Figura 44. Facade OnboardingDispositivo coordinando Factory Method, la simulación de lecturas y Builder + Abstract Factory en onboarding.py</w:t>
+      </w:r>
+      <w:r>
+        <w:rPr>
+          <w:lang w:val="es-CO"/>
+        </w:rPr>
+        <w:tab/>
+      </w:r>
+      <w:r>
+        <w:fldChar w:fldCharType="begin"/>
+      </w:r>
+      <w:r>
+        <w:rPr>
+          <w:lang w:val="es-CO"/>
+        </w:rPr>
+        <w:instrText>PAGEREF bm_fig44 \h</w:instrText>
+      </w:r>
+      <w:r>
+        <w:fldChar w:fldCharType="separate"/>
+      </w:r>
+      <w:r>
+        <w:rPr>
+          <w:noProof/>
+          <w:lang w:val="es-CO"/>
+        </w:rPr>
+        <w:t xml:space="preserve">1</w:t>
+      </w:r>
+      <w:r>
+        <w:fldChar w:fldCharType="end"/>
+      </w:r>
+    </w:p>
+    <w:p>
+      <w:pPr>
+        <w:tabs>
+          <w:tab w:val="right" w:leader="dot" w:pos="9360"/>
+        </w:tabs>
+        <w:spacing w:after="80" w:line="360" w:lineRule="auto"/>
+        <w:ind w:left="360" w:hanging="360"/>
+        <w:rPr>
+          <w:lang w:val="es-CO"/>
+        </w:rPr>
+      </w:pPr>
+      <w:r>
+        <w:rPr>
+          <w:lang w:val="es-CO"/>
+        </w:rPr>
+        <w:t xml:space="preserve">Figura 45. Diagrama UML de clases del patrón Facade aplicado al alta de dispositivos IoT</w:t>
+      </w:r>
+      <w:r>
+        <w:rPr>
+          <w:lang w:val="es-CO"/>
+        </w:rPr>
+        <w:tab/>
+      </w:r>
+      <w:r>
+        <w:fldChar w:fldCharType="begin"/>
+      </w:r>
+      <w:r>
+        <w:rPr>
+          <w:lang w:val="es-CO"/>
+        </w:rPr>
+        <w:instrText>PAGEREF bm_fig45 \h</w:instrText>
+      </w:r>
+      <w:r>
+        <w:fldChar w:fldCharType="separate"/>
+      </w:r>
+      <w:r>
+        <w:rPr>
+          <w:noProof/>
+          <w:lang w:val="es-CO"/>
+        </w:rPr>
+        <w:t xml:space="preserve">1</w:t>
+      </w:r>
+      <w:r>
+        <w:fldChar w:fldCharType="end"/>
+      </w:r>
+    </w:p>
+    <w:p>
+      <w:pPr>
+        <w:tabs>
+          <w:tab w:val="right" w:leader="dot" w:pos="9360"/>
+        </w:tabs>
+        <w:spacing w:after="80" w:line="360" w:lineRule="auto"/>
+        <w:ind w:left="360" w:hanging="360"/>
+        <w:rPr>
+          <w:lang w:val="es-CO"/>
+        </w:rPr>
+      </w:pPr>
+      <w:r>
+        <w:rPr>
+          <w:lang w:val="es-CO"/>
+        </w:rPr>
+        <w:t xml:space="preserve">Figura 46. Resultados de la ejecución de las pruebas unitarias del patrón Facade</w:t>
+      </w:r>
+      <w:r>
+        <w:rPr>
+          <w:lang w:val="es-CO"/>
+        </w:rPr>
+        <w:tab/>
+      </w:r>
+      <w:r>
+        <w:fldChar w:fldCharType="begin"/>
+      </w:r>
+      <w:r>
+        <w:rPr>
+          <w:lang w:val="es-CO"/>
+        </w:rPr>
+        <w:instrText>PAGEREF bm_fig46 \h</w:instrText>
+      </w:r>
+      <w:r>
+        <w:fldChar w:fldCharType="separate"/>
+      </w:r>
+      <w:r>
+        <w:rPr>
+          <w:noProof/>
+          <w:lang w:val="es-CO"/>
+        </w:rPr>
+        <w:t xml:space="preserve">1</w:t>
+      </w:r>
+      <w:r>
+        <w:fldChar w:fldCharType="end"/>
+      </w:r>
+    </w:p>
+    <w:p>
+      <w:pPr>
         <w:pageBreakBefore/>
         <w:rPr>
           <w:lang w:val="es-CO"/>
@@ -5757,109 +6701,25 @@
           <w:lang w:val="es-CO"/>
         </w:rPr>
       </w:pPr>
-      <w:r>
-        <w:rPr>
-          <w:lang w:val="es-CO"/>
-        </w:rPr>
-        <w:t>El presente documento contextualiza el proyecto Plataforma de Comercio de Energía, una solución digital orientada a facilitar la compra y venta de excedentes energéticos entre usuarios en contextos de generación distribuida, como paneles solares domésticos y baterías inteligentes. Adicionalmente, se explica la implementación de ocho patrones de diseño aplicados en el sistema: el patrón Singleton, que garantiza un punto único y consistente de acceso al estado de la plataforma (</w:t>
-      </w:r>
-      <w:proofErr w:type="spellStart"/>
-      <w:r>
-        <w:rPr>
-          <w:lang w:val="es-CO"/>
-        </w:rPr>
-        <w:t>PlataformaEnergia</w:t>
-      </w:r>
-      <w:proofErr w:type="spellEnd"/>
-      <w:r>
-        <w:rPr>
-          <w:lang w:val="es-CO"/>
-        </w:rPr>
-        <w:t xml:space="preserve">) de forma segura ante la concurrencia; el patrón Factory Method, que resuelve la integración de distintos tipos de dispositivos </w:t>
-      </w:r>
-      <w:proofErr w:type="spellStart"/>
-      <w:r>
-        <w:rPr>
-          <w:lang w:val="es-CO"/>
-        </w:rPr>
-        <w:t>IoT</w:t>
-      </w:r>
-      <w:proofErr w:type="spellEnd"/>
-      <w:r>
-        <w:rPr>
-          <w:lang w:val="es-CO"/>
-        </w:rPr>
-        <w:t xml:space="preserve"> domésticos (paneles solares, baterías inteligentes y medidores); el patrón </w:t>
-      </w:r>
-      <w:proofErr w:type="spellStart"/>
-      <w:r>
-        <w:rPr>
-          <w:lang w:val="es-CO"/>
-        </w:rPr>
-        <w:t>Abstract</w:t>
-      </w:r>
-      <w:proofErr w:type="spellEnd"/>
-      <w:r>
-        <w:rPr>
-          <w:lang w:val="es-CO"/>
-        </w:rPr>
-        <w:t xml:space="preserve"> Factory, que organiza los canales de notificación (correo, SMS y notificación </w:t>
-      </w:r>
-      <w:proofErr w:type="spellStart"/>
-      <w:r>
-        <w:rPr>
-          <w:lang w:val="es-CO"/>
-        </w:rPr>
-        <w:t>push</w:t>
-      </w:r>
-      <w:proofErr w:type="spellEnd"/>
-      <w:r>
-        <w:rPr>
-          <w:lang w:val="es-CO"/>
-        </w:rPr>
-        <w:t xml:space="preserve">) para que cada uno genere la familia completa de avisos con un formato coherente; y el patrón </w:t>
-      </w:r>
-      <w:proofErr w:type="spellStart"/>
-      <w:r>
-        <w:rPr>
-          <w:lang w:val="es-CO"/>
-        </w:rPr>
-        <w:t>Builder</w:t>
-      </w:r>
-      <w:proofErr w:type="spellEnd"/>
-      <w:r>
-        <w:rPr>
-          <w:lang w:val="es-CO"/>
-        </w:rPr>
-        <w:t xml:space="preserve">, que construye el reporte energético del usuario paso a paso para obtenerlo en distintas representaciones (diccionario, objeto con secciones o texto); y el patrón </w:t>
-      </w:r>
-      <w:proofErr w:type="spellStart"/>
-      <w:r>
-        <w:rPr>
-          <w:lang w:val="es-CO"/>
-        </w:rPr>
-        <w:t>Prototype</w:t>
-      </w:r>
-      <w:proofErr w:type="spellEnd"/>
-      <w:r>
-        <w:rPr>
-          <w:lang w:val="es-CO"/>
-        </w:rPr>
-        <w:t xml:space="preserve">, que permite clonar un dispositivo </w:t>
-      </w:r>
-      <w:proofErr w:type="spellStart"/>
-      <w:r>
-        <w:rPr>
-          <w:lang w:val="es-CO"/>
-        </w:rPr>
-        <w:t>IoT</w:t>
-      </w:r>
-      <w:proofErr w:type="spellEnd"/>
-      <w:r>
-        <w:rPr>
-          <w:lang w:val="es-CO"/>
-        </w:rPr>
-        <w:t xml:space="preserve"> ya calibrado para dar de alta otros similares sin repetir su configuración; y el patrón Adapter, que integra pasarelas de pago externas (Stripe, PayU) con interfaces incompatibles bajo una interfaz uniforme; el patrón Composite, que organiza la energía de la comunidad como un árbol (comunidad, hogares y dispositivos) para calcular producción, consumo y balance con la misma operación en cualquier nivel; y el patrón Decorator, que construye el precio final de cada transacción apilando descuentos, recargos, cargos y comisiones sobre el costo base sin crear una clase por combinación. Se describe la problemática que motiva el proyecto, la propuesta de solución, las funcionalidades principales, el objetivo general y el impacto esperado, así como el problema técnico que motiva cada patrón, la solución propuesta a partir de las clases involucradas y los beneficios que aportan a la consistencia, la escalabilidad y la mantenibilidad del sistema.</w:t>
+      <w:proofErr w:type="spellStart"/>
+      <w:proofErr w:type="spellEnd"/>
+      <w:proofErr w:type="spellStart"/>
+      <w:proofErr w:type="spellEnd"/>
+      <w:proofErr w:type="spellStart"/>
+      <w:proofErr w:type="spellEnd"/>
+      <w:proofErr w:type="spellStart"/>
+      <w:proofErr w:type="spellEnd"/>
+      <w:proofErr w:type="spellStart"/>
+      <w:proofErr w:type="spellEnd"/>
+      <w:proofErr w:type="spellStart"/>
+      <w:proofErr w:type="spellEnd"/>
+      <w:proofErr w:type="spellStart"/>
+      <w:proofErr w:type="spellEnd"/>
+      <w:r>
+        <w:rPr>
+          <w:lang w:val="es-CO"/>
+        </w:rPr>
+        <w:t xml:space="preserve">El presente documento contextualiza el proyecto Plataforma de Comercio de Energía, una solución digital orientada a facilitar la compra y venta de excedentes energéticos entre usuarios en contextos de generación distribuida, como paneles solares domésticos y baterías inteligentes. Adicionalmente, se explica la implementación de diez patrones de diseño aplicados en el sistema: el patrón Singleton, que garantiza un punto único y consistente de acceso al estado de la plataforma (PlataformaEnergia) de forma segura ante la concurrencia; el patrón Factory Method, que resuelve la integración de distintos tipos de dispositivos IoT domésticos (paneles solares, baterías inteligentes y medidores); el patrón Abstract Factory, que organiza los canales de notificación (correo, SMS y notificación push) para que cada uno genere la familia completa de avisos con un formato coherente; y el patrón Builder, que construye el reporte energético del usuario paso a paso para obtenerlo en distintas representaciones (diccionario, objeto con secciones o texto); y el patrón Prototype, que permite clonar un dispositivo IoT ya calibrado para dar de alta otros similares sin repetir su configuración; y el patrón Adapter, que integra pasarelas de pago externas (Stripe, PayU) con interfaces incompatibles bajo una interfaz uniforme; el patrón Composite, que organiza la energía de la comunidad como un árbol (comunidad, hogares y dispositivos) para calcular producción, consumo y balance con la misma operación en cualquier nivel; el patrón Decorator, que construye el precio final de cada transacción apilando descuentos, recargos, cargos y comisiones sobre el costo base sin crear una clase por combinación; el patrón Bridge, que separa el protocolo de sincronización de un dispositivo IoT (simulado, HTTP, MQTT) de la forma en que se sincroniza (con o sin reintentos), para que ambas jerarquías varíen de forma independiente; y el patrón Facade, que concentra en un único punto de entrada las tres llamadas necesarias para dar de alta un dispositivo IoT y dejarlo operando (conectar, simular lecturas y generar un reporte inicial). Se describe la problemática que motiva el proyecto, la propuesta de solución, las funcionalidades principales, el objetivo general y el impacto esperado, así como el problema técnico que motiva cada patrón, la solución propuesta a partir de las clases involucradas y los beneficios que aportan a la consistencia, la escalabilidad y la mantenibilidad del sistema.</w:t>
       </w:r>
     </w:p>
     <w:p>
@@ -5869,75 +6729,19 @@
           <w:lang w:val="es-CO"/>
         </w:rPr>
       </w:pPr>
-      <w:r>
-        <w:rPr>
-          <w:i/>
-          <w:iCs/>
-          <w:lang w:val="es-CO"/>
-        </w:rPr>
-        <w:t xml:space="preserve">Palabras clave: </w:t>
-      </w:r>
-      <w:r>
-        <w:rPr>
-          <w:lang w:val="es-CO"/>
-        </w:rPr>
-        <w:t xml:space="preserve">comercio de energía, Singleton, Factory Method, </w:t>
-      </w:r>
-      <w:proofErr w:type="spellStart"/>
-      <w:r>
-        <w:rPr>
-          <w:lang w:val="es-CO"/>
-        </w:rPr>
-        <w:t>Abstract</w:t>
-      </w:r>
-      <w:proofErr w:type="spellEnd"/>
-      <w:r>
-        <w:rPr>
-          <w:lang w:val="es-CO"/>
-        </w:rPr>
-        <w:t xml:space="preserve"> Factory, </w:t>
-      </w:r>
-      <w:proofErr w:type="spellStart"/>
-      <w:r>
-        <w:rPr>
-          <w:lang w:val="es-CO"/>
-        </w:rPr>
-        <w:t>Builder</w:t>
-      </w:r>
-      <w:proofErr w:type="spellEnd"/>
-      <w:r>
-        <w:rPr>
-          <w:lang w:val="es-CO"/>
-        </w:rPr>
-        <w:t xml:space="preserve">, </w:t>
-      </w:r>
-      <w:proofErr w:type="spellStart"/>
-      <w:r>
-        <w:rPr>
-          <w:lang w:val="es-CO"/>
-        </w:rPr>
-        <w:t>Prototype</w:t>
-      </w:r>
-      <w:proofErr w:type="spellEnd"/>
-      <w:r>
-        <w:rPr>
-          <w:lang w:val="es-CO"/>
-        </w:rPr>
-        <w:t xml:space="preserve">, Adapter, Composite, Decorator, patrones de diseño, </w:t>
-      </w:r>
-      <w:proofErr w:type="spellStart"/>
-      <w:r>
-        <w:rPr>
-          <w:lang w:val="es-CO"/>
-        </w:rPr>
-        <w:t>IoT</w:t>
-      </w:r>
-      <w:proofErr w:type="spellEnd"/>
-      <w:r>
-        <w:rPr>
-          <w:lang w:val="es-CO"/>
-        </w:rPr>
-        <w:t>, arquitectura de software, principio abierto/cerrado.</w:t>
+      <w:proofErr w:type="spellStart"/>
+      <w:proofErr w:type="spellEnd"/>
+      <w:proofErr w:type="spellStart"/>
+      <w:proofErr w:type="spellEnd"/>
+      <w:proofErr w:type="spellStart"/>
+      <w:proofErr w:type="spellEnd"/>
+      <w:proofErr w:type="spellStart"/>
+      <w:proofErr w:type="spellEnd"/>
+      <w:r>
+        <w:rPr>
+          <w:lang w:val="es-CO"/>
+        </w:rPr>
+        <w:t xml:space="preserve">Palabras clave: comercio de energía, Singleton, Factory Method, Abstract Factory, Builder, Prototype, Adapter, Composite, Decorator, Bridge, Facade, patrones de diseño, IoT, arquitectura de software, principio abierto/cerrado.</w:t>
       </w:r>
     </w:p>
     <w:p>
@@ -6867,6 +7671,62 @@
           <w:lang w:val="es-CO"/>
         </w:rPr>
         <w:t xml:space="preserve">Aplicar el patrón Decorator para calcular el precio final de cada transacción combinando descuentos, recargos y comisiones en tiempo de ejecución, sin crear una clase por cada combinación.</w:t>
+      </w:r>
+    </w:p>
+    <w:p>
+      <w:pPr>
+        <w:pStyle w:val="Prrafodelista"/>
+        <w:numPr>
+          <w:ilvl w:val="0"/>
+          <w:numId w:val="2"/>
+        </w:numPr>
+        <w:spacing w:line="480" w:lineRule="auto"/>
+        <w:jc w:val="both"/>
+        <w:rPr>
+          <w:lang w:val="es-CO"/>
+        </w:rPr>
+      </w:pPr>
+      <w:r>
+        <w:rPr>
+          <w:b/>
+          <w:bCs/>
+          <w:lang w:val="es-CO"/>
+        </w:rPr>
+        <w:t xml:space="preserve"/>
+      </w:r>
+      <w:r>
+        <w:rPr>
+          <w:lang w:val="es-CO"/>
+        </w:rPr>
+        <w:t xml:space="preserve">Aplicar el patrón Bridge para separar el protocolo de sincronización de un dispositivo IoT (simulado, HTTP, MQTT) de la forma en que se sincroniza (con o sin reintentos), de modo que ambas jerarquías varíen de forma independiente.</w:t>
+      </w:r>
+    </w:p>
+    <w:p>
+      <w:pPr>
+        <w:pStyle w:val="Prrafodelista"/>
+        <w:numPr>
+          <w:ilvl w:val="0"/>
+          <w:numId w:val="2"/>
+        </w:numPr>
+        <w:spacing w:line="480" w:lineRule="auto"/>
+        <w:jc w:val="both"/>
+        <w:rPr>
+          <w:lang w:val="es-CO"/>
+        </w:rPr>
+      </w:pPr>
+      <w:r>
+        <w:rPr>
+          <w:b/>
+          <w:bCs/>
+          <w:lang w:val="es-CO"/>
+        </w:rPr>
+        <w:t xml:space="preserve"/>
+      </w:r>
+      <w:r>
+        <w:rPr>
+          <w:lang w:val="es-CO"/>
+        </w:rPr>
+        <w:t xml:space="preserve">Aplicar el patrón Facade para concentrar en un único punto de entrada el alta de un dispositivo IoT, coordinando su conexión, la simulación de lecturas iniciales y la generación de un reporte resumen.</w:t>
       </w:r>
     </w:p>
     <w:p>
@@ -29996,13 +30856,50 @@
     </w:p>
     <w:p>
       <w:pPr>
+        <w:pStyle w:val="Ttulo2"/>
+        <w:spacing w:before="240" w:after="120" w:line="480" w:lineRule="auto"/>
+        <w:rPr>
+          <w:lang w:val="es-CO"/>
+        </w:rPr>
+      </w:pPr>
+      <w:bookmarkStart w:id="107" w:name="bm_bridge"/>
+      <w:r>
+        <w:rPr>
+          <w:b/>
+          <w:bCs/>
+          <w:color w:val="000000"/>
+          <w:sz w:val="24"/>
+          <w:szCs w:val="24"/>
+          <w:lang w:val="es-CO"/>
+        </w:rPr>
+        <w:t xml:space="preserve">Aplicación del Patrón de Diseño Bridge en la Sincronización de Dispositivos IoT</w:t>
+      </w:r>
+      <w:bookmarkEnd w:id="107"/>
+    </w:p>
+    <w:p>
+      <w:pPr>
+        <w:ind w:firstLine="720"/>
+        <w:jc w:val="both"/>
+        <w:rPr>
+          <w:lang w:val="es-CO"/>
+        </w:rPr>
+      </w:pPr>
+      <w:r>
+        <w:rPr>
+          <w:lang w:val="es-CO"/>
+        </w:rPr>
+        <w:t xml:space="preserve">El patrón Bridge incorporado a la plataforma separa el protocolo por el que llega una lectura de un dispositivo IoT (simulado, HTTP o MQTT) de la forma en que esa lectura se sincroniza (una sola vez o con reintentos ante fallas). Ambas decisiones varían de forma independiente, por lo que el puente evita una clase por cada combinación. Este módulo forma parte de la lógica de dominio del backend (plataforma.py, método sincronizar_dispositivo) y se expone en la API FastAPI (main.py) a través de /iot/protocolos y /iot/dispositivos/{id}/sincronizar; la implementación educativa completa se encuentra en Documentacion/Semana 9/bridge.py.</w:t>
+      </w:r>
+    </w:p>
+    <w:p>
+      <w:pPr>
         <w:pStyle w:val="Ttulo3"/>
         <w:spacing w:before="200" w:after="100" w:line="480" w:lineRule="auto"/>
         <w:rPr>
           <w:lang w:val="es-CO"/>
         </w:rPr>
       </w:pPr>
-      <w:bookmarkStart w:id="80" w:name="bm_factory_conclusion"/>
+      <w:bookmarkStart w:id="108" w:name="bm_bridge_problema"/>
       <w:r>
         <w:rPr>
           <w:b/>
@@ -30012,9 +30909,9 @@
           <w:color w:val="000000"/>
           <w:lang w:val="es-CO"/>
         </w:rPr>
-        <w:t>Conclusión</w:t>
-      </w:r>
-      <w:bookmarkEnd w:id="80"/>
+        <w:t xml:space="preserve">El Problema que Resuelve</w:t>
+      </w:r>
+      <w:bookmarkEnd w:id="108"/>
     </w:p>
     <w:p>
       <w:pPr>
@@ -30028,106 +30925,1025 @@
         <w:rPr>
           <w:lang w:val="es-CO"/>
         </w:rPr>
-        <w:t xml:space="preserve">En resumen, el patrón Singleton garantiza que toda la plataforma comparta un mismo estado consistente, el Factory Method garantiza que cada tipo de dispositivo </w:t>
-      </w:r>
-      <w:proofErr w:type="spellStart"/>
-      <w:r>
-        <w:rPr>
-          <w:lang w:val="es-CO"/>
-        </w:rPr>
-        <w:t>IoT</w:t>
-      </w:r>
-      <w:proofErr w:type="spellEnd"/>
-      <w:r>
-        <w:rPr>
-          <w:lang w:val="es-CO"/>
-        </w:rPr>
-        <w:t xml:space="preserve"> se cree y se comporte correctamente sin acoplar ese conocimiento al resto del sistema, el </w:t>
-      </w:r>
-      <w:proofErr w:type="spellStart"/>
-      <w:r>
-        <w:rPr>
-          <w:lang w:val="es-CO"/>
-        </w:rPr>
-        <w:t>Abstract</w:t>
-      </w:r>
-      <w:proofErr w:type="spellEnd"/>
-      <w:r>
-        <w:rPr>
-          <w:lang w:val="es-CO"/>
-        </w:rPr>
-        <w:t xml:space="preserve"> Factory garantiza que cada canal de notificación genere la familia completa de avisos con un formato </w:t>
-      </w:r>
-      <w:r>
-        <w:rPr>
-          <w:lang w:val="es-CO"/>
-        </w:rPr>
-        <w:lastRenderedPageBreak/>
-        <w:t xml:space="preserve">coherente, el </w:t>
-      </w:r>
-      <w:proofErr w:type="spellStart"/>
-      <w:r>
-        <w:rPr>
-          <w:lang w:val="es-CO"/>
-        </w:rPr>
-        <w:t>Builder</w:t>
-      </w:r>
-      <w:proofErr w:type="spellEnd"/>
-      <w:r>
-        <w:rPr>
-          <w:lang w:val="es-CO"/>
-        </w:rPr>
-        <w:t xml:space="preserve"> permite construir el reporte energético paso a paso y obtenerlo en distintas representaciones sin duplicar la lógica de negocio, el </w:t>
-      </w:r>
-      <w:proofErr w:type="spellStart"/>
-      <w:r>
-        <w:rPr>
-          <w:lang w:val="es-CO"/>
-        </w:rPr>
-        <w:t>Prototype</w:t>
-      </w:r>
-      <w:proofErr w:type="spellEnd"/>
-      <w:r>
-        <w:rPr>
-          <w:lang w:val="es-CO"/>
-        </w:rPr>
-        <w:t xml:space="preserve"> permite clonar un dispositivo </w:t>
-      </w:r>
-      <w:proofErr w:type="spellStart"/>
-      <w:r>
-        <w:rPr>
-          <w:lang w:val="es-CO"/>
-        </w:rPr>
-        <w:t>IoT</w:t>
-      </w:r>
-      <w:proofErr w:type="spellEnd"/>
-      <w:r>
-        <w:rPr>
-          <w:lang w:val="es-CO"/>
-        </w:rPr>
-        <w:t xml:space="preserve"> ya calibrado para repetir esa configuración en altas posteriores sin volver a escribirla a mano, el Adapter permite integrar pasarelas de pago externas con interfaces incompatibles sin que esa incompatibilidad contamine la lógica de negocio, el Composite permite tratar de manera uniforme a un dispositivo y a la comunidad entera para calcular su energía a cualquier nivel, y el Decorator permite construir el precio final de cada transacción apilando ajustes en tiempo de ejecución sin multiplicar clases. Los ocho patrones son complementarios: el primero define cuántas instancias de la plataforma existen; el segundo y el tercero definen cómo se crean los objetos —individuales o en familia— que la plataforma administra; el cuarto define cómo se ensambla un objeto complejo a partir de esos datos; el quinto define cómo se reutiliza un objeto ya configurado para crear otros similares sin repetir su configuración; el sexto define cómo se conecta la plataforma con clases externas cuya interfaz no se puede modificar; el séptimo define cómo se agrupan los objetos en jerarquías que se recorren con una sola operación; y el octavo define cómo se agregan responsabilidades a un objeto en tiempo de ejecución sin modificar su clase.</w:t>
-      </w:r>
-    </w:p>
-    <w:p>
-      <w:pPr>
-        <w:rPr>
-          <w:lang w:val="es-CO"/>
-        </w:rPr>
-      </w:pPr>
-      <w:r>
-        <w:rPr>
-          <w:lang w:val="es-CO"/>
-        </w:rPr>
-        <w:br w:type="page"/>
-      </w:r>
-    </w:p>
-    <w:p>
-      <w:pPr>
-        <w:pStyle w:val="Ttulo1"/>
-        <w:spacing w:before="240" w:after="240" w:line="480" w:lineRule="auto"/>
-        <w:jc w:val="center"/>
-      </w:pPr>
-      <w:bookmarkStart w:id="81" w:name="bm_referencias"/>
+        <w:t xml:space="preserve">Factory Method (Semana 3) resuelve qué tipo de dispositivo IoT crear, pero una vez creado falta decidir por dónde llega cada lectura nueva. En una instalación real eso depende del fabricante: unos dispositivos exponen una API HTTP propia, otros publican por MQTT, y en desarrollo o demo basta con simular valores. Además, independientemente del protocolo, a veces conviene reintentar ante una falla de comunicación (una lectura crítica) y a veces no (una lectura de rutina).</w:t>
+      </w:r>
+    </w:p>
+    <w:p>
+      <w:pPr>
+        <w:ind w:firstLine="720"/>
+        <w:jc w:val="both"/>
+        <w:rPr>
+          <w:lang w:val="es-CO"/>
+        </w:rPr>
+      </w:pPr>
+      <w:r>
+        <w:rPr>
+          <w:lang w:val="es-CO"/>
+        </w:rPr>
+        <w:t xml:space="preserve">Son dos cosas que varían por separado. Si se modelara con herencia —una subclase por combinación—, agregar un protocolo nuevo o una forma de sincronizar nueva multiplicaría las clases: SincronizadorSimpleHTTP, SincronizadorConReintentosHTTP, SincronizadorSimpleMQTT, SincronizadorConReintentosMQTT, y así sucesivamente.</w:t>
+      </w:r>
+    </w:p>
+    <w:p>
+      <w:pPr>
+        <w:pStyle w:val="Ttulo3"/>
+        <w:spacing w:before="200" w:after="100" w:line="480" w:lineRule="auto"/>
+        <w:rPr>
+          <w:lang w:val="es-CO"/>
+        </w:rPr>
+      </w:pPr>
+      <w:bookmarkStart w:id="109" w:name="bm_bridge_solucion"/>
+      <w:r>
+        <w:rPr>
+          <w:b/>
+          <w:bCs/>
+          <w:i/>
+          <w:iCs/>
+          <w:color w:val="000000"/>
+          <w:lang w:val="es-CO"/>
+        </w:rPr>
+        <w:t xml:space="preserve">Cómo lo Soluciona el Patrón</w:t>
+      </w:r>
+      <w:bookmarkEnd w:id="109"/>
+    </w:p>
+    <w:p>
+      <w:pPr>
+        <w:pStyle w:val="Prrafodelista"/>
+        <w:numPr>
+          <w:ilvl w:val="0"/>
+          <w:numId w:val="2"/>
+        </w:numPr>
+        <w:spacing w:line="480" w:lineRule="auto"/>
+        <w:jc w:val="both"/>
+        <w:rPr>
+          <w:lang w:val="es-CO"/>
+        </w:rPr>
+      </w:pPr>
+      <w:r>
+        <w:rPr>
+          <w:b/>
+          <w:bCs/>
+          <w:lang w:val="es-CO"/>
+        </w:rPr>
+        <w:t xml:space="preserve">Implementor ProtocoloLectura. </w:t>
+      </w:r>
+      <w:r>
+        <w:rPr>
+          <w:lang w:val="es-CO"/>
+        </w:rPr>
+        <w:t xml:space="preserve">Declara leer(dispositivo, ultima_lectura). Cada protocolo concreto sabe cómo obtener el valor y puede fallar con ConnectionError.</w:t>
+      </w:r>
+    </w:p>
+    <w:p>
+      <w:pPr>
+        <w:pStyle w:val="Prrafodelista"/>
+        <w:numPr>
+          <w:ilvl w:val="0"/>
+          <w:numId w:val="2"/>
+        </w:numPr>
+        <w:spacing w:line="480" w:lineRule="auto"/>
+        <w:jc w:val="both"/>
+        <w:rPr>
+          <w:lang w:val="es-CO"/>
+        </w:rPr>
+      </w:pPr>
+      <w:r>
+        <w:rPr>
+          <w:b/>
+          <w:bCs/>
+          <w:lang w:val="es-CO"/>
+        </w:rPr>
+        <w:t xml:space="preserve">ConcreteImplementor ProtocoloSimulado / ProtocoloHTTP / ProtocoloMQTT. </w:t>
+      </w:r>
+      <w:r>
+        <w:rPr>
+          <w:lang w:val="es-CO"/>
+        </w:rPr>
+        <w:t xml:space="preserve">En la app real, ProtocoloHTTP simula la API del fabricante devolviendo un valor dentro de los umbrales ya calibrados del dispositivo; ProtocoloMQTT simula un valor retenido por el broker, con una variación pequeña sobre la última lectura.</w:t>
+      </w:r>
+    </w:p>
+    <w:p>
+      <w:pPr>
+        <w:pStyle w:val="Prrafodelista"/>
+        <w:numPr>
+          <w:ilvl w:val="0"/>
+          <w:numId w:val="2"/>
+        </w:numPr>
+        <w:spacing w:line="480" w:lineRule="auto"/>
+        <w:jc w:val="both"/>
+        <w:rPr>
+          <w:lang w:val="es-CO"/>
+        </w:rPr>
+      </w:pPr>
+      <w:r>
+        <w:rPr>
+          <w:b/>
+          <w:bCs/>
+          <w:lang w:val="es-CO"/>
+        </w:rPr>
+        <w:t xml:space="preserve">Abstraction SincronizadorDispositivo. </w:t>
+      </w:r>
+      <w:r>
+        <w:rPr>
+          <w:lang w:val="es-CO"/>
+        </w:rPr>
+        <w:t xml:space="preserve">El cliente programa contra esta clase. Guarda una referencia al Implementor (no hereda de él) y le delega la lectura — por eso es un puente, no una jerarquía de herencia.</w:t>
+      </w:r>
+    </w:p>
+    <w:p>
+      <w:pPr>
+        <w:pStyle w:val="Prrafodelista"/>
+        <w:numPr>
+          <w:ilvl w:val="0"/>
+          <w:numId w:val="2"/>
+        </w:numPr>
+        <w:spacing w:line="480" w:lineRule="auto"/>
+        <w:jc w:val="both"/>
+        <w:rPr>
+          <w:lang w:val="es-CO"/>
+        </w:rPr>
+      </w:pPr>
+      <w:r>
+        <w:rPr>
+          <w:b/>
+          <w:bCs/>
+          <w:lang w:val="es-CO"/>
+        </w:rPr>
+        <w:t xml:space="preserve">RefinedAbstraction SincronizadorConReintentos. </w:t>
+      </w:r>
+      <w:r>
+        <w:rPr>
+          <w:lang w:val="es-CO"/>
+        </w:rPr>
+        <w:t xml:space="preserve">Extiende la Abstraction con reintentos ante ConnectionError. Ese comportamiento es el mismo sin importar cuál protocolo esté detrás.</w:t>
+      </w:r>
+    </w:p>
+    <w:p>
+      <w:pPr>
+        <w:pStyle w:val="Prrafodelista"/>
+        <w:numPr>
+          <w:ilvl w:val="0"/>
+          <w:numId w:val="2"/>
+        </w:numPr>
+        <w:spacing w:line="480" w:lineRule="auto"/>
+        <w:jc w:val="both"/>
+        <w:rPr>
+          <w:lang w:val="es-CO"/>
+        </w:rPr>
+      </w:pPr>
+      <w:r>
+        <w:rPr>
+          <w:b/>
+          <w:bCs/>
+          <w:lang w:val="es-CO"/>
+        </w:rPr>
+        <w:t xml:space="preserve">Uso real en la plataforma. </w:t>
+      </w:r>
+      <w:r>
+        <w:rPr>
+          <w:lang w:val="es-CO"/>
+        </w:rPr>
+        <w:t xml:space="preserve">PlataformaEnergia.sincronizar_dispositivo(id, protocolo, con_reintentos) arma la Abstraction correspondiente y registra la lectura igual que enviar_lectura_iot (umbrales, alertas); la pestaña IoT &amp; Predicción deja elegir el protocolo y si se desean reintentos.</w:t>
+      </w:r>
+    </w:p>
+    <w:p>
+      <w:pPr>
+        <w:spacing w:before="200"/>
+        <w:rPr>
+          <w:lang w:val="es-CO"/>
+        </w:rPr>
+      </w:pPr>
+      <w:bookmarkStart w:id="110" w:name="bm_fig41"/>
+      <w:r>
+        <w:rPr>
+          <w:b/>
+          <w:bCs/>
+          <w:lang w:val="es-CO"/>
+        </w:rPr>
+        <w:t xml:space="preserve">Figura 41</w:t>
+      </w:r>
+      <w:bookmarkEnd w:id="110"/>
+    </w:p>
+    <w:p>
+      <w:pPr>
+        <w:rPr>
+          <w:lang w:val="es-CO"/>
+        </w:rPr>
+      </w:pPr>
+      <w:r>
+        <w:rPr>
+          <w:i/>
+          <w:iCs/>
+          <w:lang w:val="es-CO"/>
+        </w:rPr>
+        <w:t xml:space="preserve">Implementor ProtocoloLectura y la Abstraction SincronizadorConReintentos en sincronizacion.py</w:t>
+      </w:r>
+    </w:p>
+    <w:p>
+      <w:pPr>
+        <w:ind w:left="720"/>
+        <w:rPr>
+          <w:lang w:val="es-CO"/>
+        </w:rPr>
+      </w:pPr>
+      <w:r>
+        <w:rPr>
+          <w:rFonts w:ascii="Courier New" w:eastAsia="Courier New" w:hAnsi="Courier New" w:cs="Courier New"/>
+          <w:sz w:val="20"/>
+          <w:szCs w:val="20"/>
+          <w:lang w:val="es-CO"/>
+        </w:rPr>
+        <w:t xml:space="preserve">class ProtocoloLectura(ABC):</w:t>
+      </w:r>
+    </w:p>
+    <w:p>
+      <w:pPr>
+        <w:ind w:left="720"/>
+        <w:rPr>
+          <w:lang w:val="es-CO"/>
+        </w:rPr>
+      </w:pPr>
+      <w:r>
+        <w:rPr>
+          <w:rFonts w:ascii="Courier New" w:eastAsia="Courier New" w:hAnsi="Courier New" w:cs="Courier New"/>
+          <w:sz w:val="20"/>
+          <w:szCs w:val="20"/>
+          <w:lang w:val="es-CO"/>
+        </w:rPr>
+        <w:t xml:space="preserve">    @abstractmethod</w:t>
+      </w:r>
+    </w:p>
+    <w:p>
+      <w:pPr>
+        <w:ind w:left="720"/>
+        <w:rPr>
+          <w:lang w:val="es-CO"/>
+        </w:rPr>
+      </w:pPr>
+      <w:r>
+        <w:rPr>
+          <w:rFonts w:ascii="Courier New" w:eastAsia="Courier New" w:hAnsi="Courier New" w:cs="Courier New"/>
+          <w:sz w:val="20"/>
+          <w:szCs w:val="20"/>
+          <w:lang w:val="es-CO"/>
+        </w:rPr>
+        <w:t xml:space="preserve">    def leer(self, dispositivo, ultima_lectura): ...</w:t>
+      </w:r>
+    </w:p>
+    <w:p>
+      <w:pPr>
+        <w:spacing w:before="120"/>
+        <w:ind w:left="720"/>
+        <w:rPr>
+          <w:lang w:val="es-CO"/>
+        </w:rPr>
+      </w:pPr>
+    </w:p>
+    <w:p>
+      <w:pPr>
+        <w:spacing w:before="120"/>
+        <w:ind w:left="720"/>
+        <w:rPr>
+          <w:lang w:val="es-CO"/>
+        </w:rPr>
+      </w:pPr>
+    </w:p>
+    <w:p>
+      <w:pPr>
+        <w:ind w:left="720"/>
+        <w:rPr>
+          <w:lang w:val="es-CO"/>
+        </w:rPr>
+      </w:pPr>
+      <w:r>
+        <w:rPr>
+          <w:rFonts w:ascii="Courier New" w:eastAsia="Courier New" w:hAnsi="Courier New" w:cs="Courier New"/>
+          <w:sz w:val="20"/>
+          <w:szCs w:val="20"/>
+          <w:lang w:val="es-CO"/>
+        </w:rPr>
+        <w:t xml:space="preserve">class SincronizadorDispositivo:</w:t>
+      </w:r>
+    </w:p>
+    <w:p>
+      <w:pPr>
+        <w:ind w:left="720"/>
+        <w:rPr>
+          <w:lang w:val="es-CO"/>
+        </w:rPr>
+      </w:pPr>
+      <w:r>
+        <w:rPr>
+          <w:rFonts w:ascii="Courier New" w:eastAsia="Courier New" w:hAnsi="Courier New" w:cs="Courier New"/>
+          <w:sz w:val="20"/>
+          <w:szCs w:val="20"/>
+          <w:lang w:val="es-CO"/>
+        </w:rPr>
+        <w:t xml:space="preserve">    def __init__(self, protocolo: ProtocoloLectura):</w:t>
+      </w:r>
+    </w:p>
+    <w:p>
+      <w:pPr>
+        <w:ind w:left="720"/>
+        <w:rPr>
+          <w:lang w:val="es-CO"/>
+        </w:rPr>
+      </w:pPr>
+      <w:r>
+        <w:rPr>
+          <w:rFonts w:ascii="Courier New" w:eastAsia="Courier New" w:hAnsi="Courier New" w:cs="Courier New"/>
+          <w:sz w:val="20"/>
+          <w:szCs w:val="20"/>
+          <w:lang w:val="es-CO"/>
+        </w:rPr>
+        <w:t xml:space="preserve">        self._protocolo = protocolo</w:t>
+      </w:r>
+    </w:p>
+    <w:p>
+      <w:pPr>
+        <w:spacing w:before="120"/>
+        <w:ind w:left="720"/>
+        <w:rPr>
+          <w:lang w:val="es-CO"/>
+        </w:rPr>
+      </w:pPr>
+    </w:p>
+    <w:p>
+      <w:pPr>
+        <w:ind w:left="720"/>
+        <w:rPr>
+          <w:lang w:val="es-CO"/>
+        </w:rPr>
+      </w:pPr>
+      <w:r>
+        <w:rPr>
+          <w:rFonts w:ascii="Courier New" w:eastAsia="Courier New" w:hAnsi="Courier New" w:cs="Courier New"/>
+          <w:sz w:val="20"/>
+          <w:szCs w:val="20"/>
+          <w:lang w:val="es-CO"/>
+        </w:rPr>
+        <w:t xml:space="preserve">    def sincronizar(self, dispositivo, ultima_lectura=None) -&gt; float:</w:t>
+      </w:r>
+    </w:p>
+    <w:p>
+      <w:pPr>
+        <w:ind w:left="720"/>
+        <w:rPr>
+          <w:lang w:val="es-CO"/>
+        </w:rPr>
+      </w:pPr>
+      <w:r>
+        <w:rPr>
+          <w:rFonts w:ascii="Courier New" w:eastAsia="Courier New" w:hAnsi="Courier New" w:cs="Courier New"/>
+          <w:sz w:val="20"/>
+          <w:szCs w:val="20"/>
+          <w:lang w:val="es-CO"/>
+        </w:rPr>
+        <w:t xml:space="preserve">        return self._protocolo.leer(dispositivo, ultima_lectura)</w:t>
+      </w:r>
+    </w:p>
+    <w:p>
+      <w:pPr>
+        <w:spacing w:before="120"/>
+        <w:ind w:left="720"/>
+        <w:rPr>
+          <w:lang w:val="es-CO"/>
+        </w:rPr>
+      </w:pPr>
+    </w:p>
+    <w:p>
+      <w:pPr>
+        <w:spacing w:before="120"/>
+        <w:ind w:left="720"/>
+        <w:rPr>
+          <w:lang w:val="es-CO"/>
+        </w:rPr>
+      </w:pPr>
+    </w:p>
+    <w:p>
+      <w:pPr>
+        <w:ind w:left="720"/>
+        <w:rPr>
+          <w:lang w:val="es-CO"/>
+        </w:rPr>
+      </w:pPr>
+      <w:r>
+        <w:rPr>
+          <w:rFonts w:ascii="Courier New" w:eastAsia="Courier New" w:hAnsi="Courier New" w:cs="Courier New"/>
+          <w:sz w:val="20"/>
+          <w:szCs w:val="20"/>
+          <w:lang w:val="es-CO"/>
+        </w:rPr>
+        <w:t xml:space="preserve">class SincronizadorConReintentos(SincronizadorDispositivo):</w:t>
+      </w:r>
+    </w:p>
+    <w:p>
+      <w:pPr>
+        <w:ind w:left="720"/>
+        <w:rPr>
+          <w:lang w:val="es-CO"/>
+        </w:rPr>
+      </w:pPr>
+      <w:r>
+        <w:rPr>
+          <w:rFonts w:ascii="Courier New" w:eastAsia="Courier New" w:hAnsi="Courier New" w:cs="Courier New"/>
+          <w:sz w:val="20"/>
+          <w:szCs w:val="20"/>
+          <w:lang w:val="es-CO"/>
+        </w:rPr>
+        <w:t xml:space="preserve">    def sincronizar(self, dispositivo, ultima_lectura=None) -&gt; float:</w:t>
+      </w:r>
+    </w:p>
+    <w:p>
+      <w:pPr>
+        <w:ind w:left="720"/>
+        <w:rPr>
+          <w:lang w:val="es-CO"/>
+        </w:rPr>
+      </w:pPr>
+      <w:r>
+        <w:rPr>
+          <w:rFonts w:ascii="Courier New" w:eastAsia="Courier New" w:hAnsi="Courier New" w:cs="Courier New"/>
+          <w:sz w:val="20"/>
+          <w:szCs w:val="20"/>
+          <w:lang w:val="es-CO"/>
+        </w:rPr>
+        <w:t xml:space="preserve">        for intento in range(1, self.intentos + 1):</w:t>
+      </w:r>
+    </w:p>
+    <w:p>
+      <w:pPr>
+        <w:ind w:left="720"/>
+        <w:rPr>
+          <w:lang w:val="es-CO"/>
+        </w:rPr>
+      </w:pPr>
+      <w:r>
+        <w:rPr>
+          <w:rFonts w:ascii="Courier New" w:eastAsia="Courier New" w:hAnsi="Courier New" w:cs="Courier New"/>
+          <w:sz w:val="20"/>
+          <w:szCs w:val="20"/>
+          <w:lang w:val="es-CO"/>
+        </w:rPr>
+        <w:t xml:space="preserve">            try:</w:t>
+      </w:r>
+    </w:p>
+    <w:p>
+      <w:pPr>
+        <w:ind w:left="720"/>
+        <w:rPr>
+          <w:lang w:val="es-CO"/>
+        </w:rPr>
+      </w:pPr>
+      <w:r>
+        <w:rPr>
+          <w:rFonts w:ascii="Courier New" w:eastAsia="Courier New" w:hAnsi="Courier New" w:cs="Courier New"/>
+          <w:sz w:val="20"/>
+          <w:szCs w:val="20"/>
+          <w:lang w:val="es-CO"/>
+        </w:rPr>
+        <w:t xml:space="preserve">                return self._protocolo.leer(dispositivo, ultima_lectura)</w:t>
+      </w:r>
+    </w:p>
+    <w:p>
+      <w:pPr>
+        <w:ind w:left="720"/>
+        <w:rPr>
+          <w:lang w:val="es-CO"/>
+        </w:rPr>
+      </w:pPr>
+      <w:r>
+        <w:rPr>
+          <w:rFonts w:ascii="Courier New" w:eastAsia="Courier New" w:hAnsi="Courier New" w:cs="Courier New"/>
+          <w:sz w:val="20"/>
+          <w:szCs w:val="20"/>
+          <w:lang w:val="es-CO"/>
+        </w:rPr>
+        <w:t xml:space="preserve">            except ConnectionError:</w:t>
+      </w:r>
+    </w:p>
+    <w:p>
+      <w:pPr>
+        <w:ind w:left="720"/>
+        <w:rPr>
+          <w:lang w:val="es-CO"/>
+        </w:rPr>
+      </w:pPr>
+      <w:r>
+        <w:rPr>
+          <w:rFonts w:ascii="Courier New" w:eastAsia="Courier New" w:hAnsi="Courier New" w:cs="Courier New"/>
+          <w:sz w:val="20"/>
+          <w:szCs w:val="20"/>
+          <w:lang w:val="es-CO"/>
+        </w:rPr>
+        <w:t xml:space="preserve">                if intento == self.intentos:</w:t>
+      </w:r>
+    </w:p>
+    <w:p>
+      <w:pPr>
+        <w:ind w:left="720"/>
+        <w:rPr>
+          <w:lang w:val="es-CO"/>
+        </w:rPr>
+      </w:pPr>
+      <w:r>
+        <w:rPr>
+          <w:rFonts w:ascii="Courier New" w:eastAsia="Courier New" w:hAnsi="Courier New" w:cs="Courier New"/>
+          <w:sz w:val="20"/>
+          <w:szCs w:val="20"/>
+          <w:lang w:val="es-CO"/>
+        </w:rPr>
+        <w:t xml:space="preserve">                    raise</w:t>
+      </w:r>
+    </w:p>
+    <w:p>
+      <w:pPr>
+        <w:spacing w:before="120"/>
+        <w:rPr>
+          <w:lang w:val="es-CO"/>
+        </w:rPr>
+      </w:pPr>
+      <w:r>
+        <w:rPr>
+          <w:i/>
+          <w:iCs/>
+          <w:lang w:val="es-CO"/>
+        </w:rPr>
+        <w:t xml:space="preserve">Nota. </w:t>
+      </w:r>
+      <w:r>
+        <w:rPr>
+          <w:lang w:val="es-CO"/>
+        </w:rPr>
+        <w:t xml:space="preserve">Extracto de plataforma-energia-app/backend/sincronizacion.py. SincronizadorDispositivo no sabe si su protocolo es simulado, HTTP o MQTT: simplemente le delega leer(); SincronizadorConReintentos añade el reintento sin tocar ningún protocolo concreto.</w:t>
+      </w:r>
+    </w:p>
+    <w:p>
+      <w:pPr>
+        <w:pStyle w:val="Ttulo3"/>
+        <w:spacing w:before="200" w:after="100" w:line="480" w:lineRule="auto"/>
+        <w:rPr>
+          <w:lang w:val="es-CO"/>
+        </w:rPr>
+      </w:pPr>
+      <w:bookmarkStart w:id="111" w:name="bm_bridge_gana"/>
+      <w:r>
+        <w:rPr>
+          <w:b/>
+          <w:bCs/>
+          <w:i/>
+          <w:iCs/>
+          <w:color w:val="000000"/>
+          <w:lang w:val="es-CO"/>
+        </w:rPr>
+        <w:t xml:space="preserve">Qué Gana la Plataforma con Esto</w:t>
+      </w:r>
+      <w:bookmarkEnd w:id="111"/>
+    </w:p>
+    <w:p>
+      <w:pPr>
+        <w:pStyle w:val="Prrafodelista"/>
+        <w:numPr>
+          <w:ilvl w:val="0"/>
+          <w:numId w:val="2"/>
+        </w:numPr>
+        <w:spacing w:line="480" w:lineRule="auto"/>
+        <w:jc w:val="both"/>
+        <w:rPr>
+          <w:lang w:val="es-CO"/>
+        </w:rPr>
+      </w:pPr>
+      <w:r>
+        <w:rPr>
+          <w:b/>
+          <w:bCs/>
+          <w:lang w:val="es-CO"/>
+        </w:rPr>
+        <w:t xml:space="preserve">Dos jerarquías, cada una crece sola. </w:t>
+      </w:r>
+      <w:r>
+        <w:rPr>
+          <w:lang w:val="es-CO"/>
+        </w:rPr>
+        <w:t xml:space="preserve">Un protocolo nuevo (Zigbee) no toca SincronizadorConReintentos; una forma de sincronizar nueva (por ejemplo, con circuit breaker) no toca ningún protocolo.</w:t>
+      </w:r>
+    </w:p>
+    <w:p>
+      <w:pPr>
+        <w:pStyle w:val="Prrafodelista"/>
+        <w:numPr>
+          <w:ilvl w:val="0"/>
+          <w:numId w:val="2"/>
+        </w:numPr>
+        <w:spacing w:line="480" w:lineRule="auto"/>
+        <w:jc w:val="both"/>
+        <w:rPr>
+          <w:lang w:val="es-CO"/>
+        </w:rPr>
+      </w:pPr>
+      <w:r>
+        <w:rPr>
+          <w:b/>
+          <w:bCs/>
+          <w:lang w:val="es-CO"/>
+        </w:rPr>
+        <w:t xml:space="preserve">Composición en tiempo de ejecución. </w:t>
+      </w:r>
+      <w:r>
+        <w:rPr>
+          <w:lang w:val="es-CO"/>
+        </w:rPr>
+        <w:t xml:space="preserve">Cualquier combinación se arma pasando el protocolo por el constructor, sin clases nuevas.</w:t>
+      </w:r>
+    </w:p>
+    <w:p>
+      <w:pPr>
+        <w:pStyle w:val="Prrafodelista"/>
+        <w:numPr>
+          <w:ilvl w:val="0"/>
+          <w:numId w:val="2"/>
+        </w:numPr>
+        <w:spacing w:line="480" w:lineRule="auto"/>
+        <w:jc w:val="both"/>
+        <w:rPr>
+          <w:lang w:val="es-CO"/>
+        </w:rPr>
+      </w:pPr>
+      <w:r>
+        <w:rPr>
+          <w:b/>
+          <w:bCs/>
+          <w:lang w:val="es-CO"/>
+        </w:rPr>
+        <w:t xml:space="preserve">Abierto/cerrado. </w:t>
+      </w:r>
+      <w:r>
+        <w:rPr>
+          <w:lang w:val="es-CO"/>
+        </w:rPr>
+        <w:t xml:space="preserve">La prueba test_se_puede_agregar_un_protocolo_sin_modificar_los_existentes lo demuestra con un ProtocoloFalso definido dentro del propio test.</w:t>
+      </w:r>
+    </w:p>
+    <w:p>
+      <w:pPr>
+        <w:pStyle w:val="Prrafodelista"/>
+        <w:numPr>
+          <w:ilvl w:val="0"/>
+          <w:numId w:val="2"/>
+        </w:numPr>
+        <w:spacing w:line="480" w:lineRule="auto"/>
+        <w:jc w:val="both"/>
+        <w:rPr>
+          <w:lang w:val="es-CO"/>
+        </w:rPr>
+      </w:pPr>
+      <w:r>
+        <w:rPr>
+          <w:b/>
+          <w:bCs/>
+          <w:lang w:val="es-CO"/>
+        </w:rPr>
+        <w:t xml:space="preserve">Diferencia con Adapter (Semana 7). </w:t>
+      </w:r>
+      <w:r>
+        <w:rPr>
+          <w:lang w:val="es-CO"/>
+        </w:rPr>
+        <w:t xml:space="preserve">Adapter traduce una interfaz externa ya existente e incompatible hacia la que el cliente espera — un solo eje, una sola traducción. Bridge separa dos jerarquías que la plataforma diseña a la vez para que varíen independientemente — por eso aquí sí tiene sentido una segunda clase (SincronizadorConReintentos) que combina con cualquier protocolo.</w:t>
+      </w:r>
+    </w:p>
+    <w:p>
+      <w:pPr>
+        <w:spacing w:before="200"/>
+        <w:rPr>
+          <w:lang w:val="es-CO"/>
+        </w:rPr>
+      </w:pPr>
+      <w:bookmarkStart w:id="112" w:name="bm_fig42"/>
+      <w:r>
+        <w:rPr>
+          <w:b/>
+          <w:bCs/>
+          <w:lang w:val="es-CO"/>
+        </w:rPr>
+        <w:t xml:space="preserve">Figura 42</w:t>
+      </w:r>
+      <w:bookmarkEnd w:id="112"/>
+    </w:p>
+    <w:p>
+      <w:pPr>
+        <w:rPr>
+          <w:lang w:val="es-CO"/>
+        </w:rPr>
+      </w:pPr>
+      <w:r>
+        <w:rPr>
+          <w:i/>
+          <w:iCs/>
+          <w:lang w:val="es-CO"/>
+        </w:rPr>
+        <w:t xml:space="preserve">Diagrama UML de clases del patrón Bridge aplicado a la sincronización de dispositivos IoT</w:t>
+      </w:r>
+    </w:p>
+    <w:p>
+      <w:pPr>
+        <w:ind w:firstLine="720"/>
+        <w:jc w:val="both"/>
+      </w:pPr>
+      <w:r>
+        <w:drawing>
+          <wp:inline xmlns:a="http://schemas.openxmlformats.org/drawingml/2006/main" xmlns:pic="http://schemas.openxmlformats.org/drawingml/2006/picture">
+            <wp:extent cx="5943600" cy="3196727"/>
+            <wp:docPr id="2105890769" name="Picture 2105890769"/>
+            <wp:cNvGraphicFramePr>
+              <a:graphicFrameLocks noChangeAspect="1"/>
+            </wp:cNvGraphicFramePr>
+            <a:graphic>
+              <a:graphicData uri="http://schemas.openxmlformats.org/drawingml/2006/picture">
+                <pic:pic>
+                  <pic:nvPicPr>
+                    <pic:cNvPr id="0" name="UML_Bridge.png"/>
+                    <pic:cNvPicPr/>
+                  </pic:nvPicPr>
+                  <pic:blipFill>
+                    <a:blip r:embed="rId44"/>
+                    <a:stretch>
+                      <a:fillRect/>
+                    </a:stretch>
+                  </pic:blipFill>
+                  <pic:spPr>
+                    <a:xfrm>
+                      <a:off x="0" y="0"/>
+                      <a:ext cx="5943600" cy="3196727"/>
+                    </a:xfrm>
+                    <a:prstGeom prst="rect"/>
+                  </pic:spPr>
+                </pic:pic>
+              </a:graphicData>
+            </a:graphic>
+          </wp:inline>
+        </w:drawing>
+      </w:r>
+    </w:p>
+    <w:p>
+      <w:pPr>
+        <w:spacing w:before="120"/>
+        <w:rPr>
+          <w:lang w:val="es-CO"/>
+        </w:rPr>
+      </w:pPr>
+      <w:r>
+        <w:rPr>
+          <w:i/>
+          <w:iCs/>
+          <w:lang w:val="es-CO"/>
+        </w:rPr>
+        <w:t xml:space="preserve">Nota. </w:t>
+      </w:r>
+      <w:r>
+        <w:rPr>
+          <w:lang w:val="es-CO"/>
+        </w:rPr>
+        <w:t xml:space="preserve">Diagrama de clases generado a partir de Documentacion/Semana 9/bridge.py, mostrando el Implementor ProtocoloLectura, sus tres protocolos concretos, la Abstraction SincronizadorDispositivo y la RefinedAbstraction SincronizadorConReintentos conectada por composición, no por herencia, al protocolo.</w:t>
+      </w:r>
+    </w:p>
+    <w:p>
+      <w:pPr>
+        <w:pStyle w:val="Ttulo3"/>
+        <w:spacing w:before="200" w:after="100" w:line="480" w:lineRule="auto"/>
+        <w:rPr>
+          <w:lang w:val="es-CO"/>
+        </w:rPr>
+      </w:pPr>
+      <w:bookmarkStart w:id="113" w:name="bm_bridge_justificacion"/>
+      <w:r>
+        <w:rPr>
+          <w:b/>
+          <w:bCs/>
+          <w:i/>
+          <w:iCs/>
+          <w:color w:val="000000"/>
+          <w:lang w:val="es-CO"/>
+        </w:rPr>
+        <w:t xml:space="preserve">Justificación de su Uso en el Proyecto</w:t>
+      </w:r>
+      <w:bookmarkEnd w:id="113"/>
+    </w:p>
+    <w:p>
+      <w:pPr>
+        <w:ind w:firstLine="720"/>
+        <w:jc w:val="both"/>
+        <w:rPr>
+          <w:lang w:val="es-CO"/>
+        </w:rPr>
+      </w:pPr>
+      <w:r>
+        <w:rPr>
+          <w:lang w:val="es-CO"/>
+        </w:rPr>
+        <w:t xml:space="preserve">El patrón Bridge resulta pertinente para este proyecto porque la Contextualización del Proyecto plantea la integración con dispositivos IoT domésticos de distintos fabricantes, y es razonable esperar que esos dispositivos usen protocolos de comunicación distintos (HTTP, MQTT) además del modo simulado usado en desarrollo. Esa variación es independiente de otra decisión del negocio —si una lectura debe reintentarse ante una falla—, por lo que ambos ejes conviene modelarlos como jerarquías separadas que se combinan por composición.</w:t>
+      </w:r>
+    </w:p>
+    <w:p>
+      <w:pPr>
+        <w:pStyle w:val="Ttulo3"/>
+        <w:spacing w:before="200" w:after="100" w:line="480" w:lineRule="auto"/>
+        <w:rPr>
+          <w:lang w:val="es-CO"/>
+        </w:rPr>
+      </w:pPr>
+      <w:bookmarkStart w:id="114" w:name="bm_bridge_evaluacion"/>
+      <w:r>
+        <w:rPr>
+          <w:b/>
+          <w:bCs/>
+          <w:i/>
+          <w:iCs/>
+          <w:color w:val="000000"/>
+          <w:lang w:val="es-CO"/>
+        </w:rPr>
+        <w:t xml:space="preserve">Evaluación: ¿Sirve este patrón para el proyecto?</w:t>
+      </w:r>
+      <w:bookmarkEnd w:id="114"/>
+    </w:p>
+    <w:p>
+      <w:pPr>
+        <w:ind w:firstLine="720"/>
+        <w:jc w:val="both"/>
+        <w:rPr>
+          <w:lang w:val="es-CO"/>
+        </w:rPr>
+      </w:pPr>
+      <w:r>
+        <w:rPr>
+          <w:b/>
+          <w:bCs/>
+          <w:lang w:val="es-CO"/>
+        </w:rPr>
+        <w:t xml:space="preserve">Veredicto: sí sirve. </w:t>
+      </w:r>
+      <w:r>
+        <w:rPr>
+          <w:lang w:val="es-CO"/>
+        </w:rPr>
+        <w:t xml:space="preserve">El patrón Bridge sí sirve para el proyecto porque existen, en efecto, dos ejes de variación independientes (protocolo de lectura y política de reintentos) y el dominio ya contempla dispositivos de distintos fabricantes. Se integró sin modificar la lógica existente: sincronizar_dispositivo() reutiliza enviar_lectura_iot() para registrar la lectura, y los casos de los patrones anteriores siguen pasando sin cambios.</w:t>
+      </w:r>
+    </w:p>
+    <w:p>
+      <w:pPr>
+        <w:ind w:firstLine="720"/>
+        <w:jc w:val="both"/>
+        <w:rPr>
+          <w:lang w:val="es-CO"/>
+        </w:rPr>
+      </w:pPr>
+      <w:r>
+        <w:rPr>
+          <w:lang w:val="es-CO"/>
+        </w:rPr>
+        <w:t xml:space="preserve">Matiz a tener en cuenta: hoy la plataforma solo implementa el protocolo simulado de forma realista (HTTP y MQTT generan valores sintéticos dentro de los umbrales del dispositivo, a falta de hardware real). Si la plataforma terminara usando un único protocolo de forma permanente, el patrón resultaría innecesario; su valor se confirma en cuanto se conecte un dispositivo físico por HTTP o MQTT, momento en el que ningún otro código tendría que cambiar.</w:t>
+      </w:r>
+    </w:p>
+    <w:p>
+      <w:pPr>
+        <w:pStyle w:val="Ttulo3"/>
+        <w:spacing w:before="200" w:after="100" w:line="480" w:lineRule="auto"/>
+        <w:rPr>
+          <w:lang w:val="es-CO"/>
+        </w:rPr>
+      </w:pPr>
+      <w:bookmarkStart w:id="115" w:name="bm_bridge_validacion"/>
+      <w:r>
+        <w:rPr>
+          <w:b/>
+          <w:bCs/>
+          <w:i/>
+          <w:iCs/>
+          <w:color w:val="000000"/>
+          <w:lang w:val="es-CO"/>
+        </w:rPr>
+        <w:t xml:space="preserve">Validación del Patrón</w:t>
+      </w:r>
+      <w:bookmarkEnd w:id="115"/>
+    </w:p>
+    <w:p>
+      <w:pPr>
+        <w:ind w:firstLine="720"/>
+        <w:jc w:val="both"/>
+        <w:rPr>
+          <w:lang w:val="es-CO"/>
+        </w:rPr>
+      </w:pPr>
+      <w:r>
+        <w:rPr>
+          <w:lang w:val="es-CO"/>
+        </w:rPr>
+        <w:t xml:space="preserve">La validación del patrón Bridge se realizó mediante pruebas unitarias automatizadas con pytest, que verifican que la Abstraction delega correctamente en cualquier Implementor, que cada protocolo concreto lee un valor o lanza ConnectionError según el caso, que SincronizadorConReintentos reintenta hasta agotar sus intentos y propaga el error si ninguno tiene éxito, que sin reintentos una falla se propaga de inmediato, y que el registro de protocolos devuelve el protocolo correcto por nombre o un ValueError con las opciones disponibles si el nombre no existe. Como se observa en la Figura 43, la suite Documentacion/Semana 9/test_bridge.py ejecutó 18 casos, todos superados, y el conjunto completo de pruebas del proyecto —los diez patrones— pasa sin errores (207 casos en total).</w:t>
+      </w:r>
+    </w:p>
+    <w:p>
+      <w:pPr>
+        <w:spacing w:before="200"/>
+        <w:rPr>
+          <w:lang w:val="es-CO"/>
+        </w:rPr>
+      </w:pPr>
+      <w:bookmarkStart w:id="116" w:name="bm_fig43"/>
+      <w:r>
+        <w:rPr>
+          <w:b/>
+          <w:bCs/>
+          <w:lang w:val="es-CO"/>
+        </w:rPr>
+        <w:t xml:space="preserve">Figura 43</w:t>
+      </w:r>
+      <w:bookmarkEnd w:id="116"/>
+    </w:p>
+    <w:p>
+      <w:pPr>
+        <w:rPr>
+          <w:lang w:val="es-CO"/>
+        </w:rPr>
+      </w:pPr>
+      <w:r>
+        <w:rPr>
+          <w:i/>
+          <w:iCs/>
+          <w:lang w:val="es-CO"/>
+        </w:rPr>
+        <w:t xml:space="preserve">Resultados de la ejecución de las pruebas unitarias del patrón Bridge</w:t>
+      </w:r>
+    </w:p>
+    <w:p>
+      <w:pPr>
+        <w:ind w:firstLine="720"/>
+        <w:jc w:val="both"/>
+      </w:pPr>
+      <w:r>
+        <w:drawing>
+          <wp:inline xmlns:a="http://schemas.openxmlformats.org/drawingml/2006/main" xmlns:pic="http://schemas.openxmlformats.org/drawingml/2006/picture">
+            <wp:extent cx="5943600" cy="2397252"/>
+            <wp:docPr id="2105890769" name="Picture 2105890769"/>
+            <wp:cNvGraphicFramePr>
+              <a:graphicFrameLocks noChangeAspect="1"/>
+            </wp:cNvGraphicFramePr>
+            <a:graphic>
+              <a:graphicData uri="http://schemas.openxmlformats.org/drawingml/2006/picture">
+                <pic:pic>
+                  <pic:nvPicPr>
+                    <pic:cNvPr id="0" name="pytest_bridge.png"/>
+                    <pic:cNvPicPr/>
+                  </pic:nvPicPr>
+                  <pic:blipFill>
+                    <a:blip r:embed="rId45"/>
+                    <a:stretch>
+                      <a:fillRect/>
+                    </a:stretch>
+                  </pic:blipFill>
+                  <pic:spPr>
+                    <a:xfrm>
+                      <a:off x="0" y="0"/>
+                      <a:ext cx="5943600" cy="2397252"/>
+                    </a:xfrm>
+                    <a:prstGeom prst="rect"/>
+                  </pic:spPr>
+                </pic:pic>
+              </a:graphicData>
+            </a:graphic>
+          </wp:inline>
+        </w:drawing>
+      </w:r>
+    </w:p>
+    <w:p>
+      <w:pPr>
+        <w:spacing w:before="120"/>
+        <w:rPr>
+          <w:lang w:val="es-CO"/>
+        </w:rPr>
+      </w:pPr>
+      <w:r>
+        <w:rPr>
+          <w:i/>
+          <w:iCs/>
+          <w:lang w:val="es-CO"/>
+        </w:rPr>
+        <w:t xml:space="preserve">Nota. </w:t>
+      </w:r>
+      <w:r>
+        <w:rPr>
+          <w:lang w:val="es-CO"/>
+        </w:rPr>
+        <w:t xml:space="preserve">Salida de consola de la ejecución de pytest sobre Documentacion/Semana 9/test_bridge.py, mostrando la aprobación de los 18 casos (18 passed), agrupados por comportamiento: desacoplamiento Abstraction/Implementor, protocolos concretos, reintentos y registro de protocolos.</w:t>
+      </w:r>
+    </w:p>
+    <w:p>
+      <w:pPr>
+        <w:pStyle w:val="Ttulo2"/>
+        <w:spacing w:before="240" w:after="120" w:line="480" w:lineRule="auto"/>
+        <w:rPr>
+          <w:lang w:val="es-CO"/>
+        </w:rPr>
+      </w:pPr>
+      <w:bookmarkStart w:id="117" w:name="bm_facade"/>
       <w:r>
         <w:rPr>
           <w:b/>
@@ -30135,6 +31951,985 @@
           <w:color w:val="000000"/>
           <w:sz w:val="24"/>
           <w:szCs w:val="24"/>
+          <w:lang w:val="es-CO"/>
+        </w:rPr>
+        <w:t xml:space="preserve">Aplicación del Patrón de Diseño Facade en el Alta de Dispositivos IoT</w:t>
+      </w:r>
+      <w:bookmarkEnd w:id="117"/>
+    </w:p>
+    <w:p>
+      <w:pPr>
+        <w:ind w:firstLine="720"/>
+        <w:jc w:val="both"/>
+        <w:rPr>
+          <w:lang w:val="es-CO"/>
+        </w:rPr>
+      </w:pPr>
+      <w:r>
+        <w:rPr>
+          <w:lang w:val="es-CO"/>
+        </w:rPr>
+        <w:t xml:space="preserve">El patrón Facade incorporado a la plataforma concentra en un único punto de entrada el alta de un dispositivo IoT: conectarlo, simular algunas lecturas iniciales y generar un reporte resumen, en vez de que cada cliente tenga que llamar a los tres subsistemas por separado y en el orden correcto. Este módulo forma parte de la lógica de dominio del backend (onboarding.py, clase OnboardingDispositivo) y se expone en la API FastAPI (main.py) a través de POST /onboarding/dispositivo; la implementación educativa completa se encuentra en Documentacion/Semana 9/facade.py.</w:t>
+      </w:r>
+    </w:p>
+    <w:p>
+      <w:pPr>
+        <w:pStyle w:val="Ttulo3"/>
+        <w:spacing w:before="200" w:after="100" w:line="480" w:lineRule="auto"/>
+        <w:rPr>
+          <w:lang w:val="es-CO"/>
+        </w:rPr>
+      </w:pPr>
+      <w:bookmarkStart w:id="118" w:name="bm_facade_problema"/>
+      <w:r>
+        <w:rPr>
+          <w:b/>
+          <w:bCs/>
+          <w:i/>
+          <w:iCs/>
+          <w:color w:val="000000"/>
+          <w:lang w:val="es-CO"/>
+        </w:rPr>
+        <w:t xml:space="preserve">El Problema que Resuelve</w:t>
+      </w:r>
+      <w:bookmarkEnd w:id="118"/>
+    </w:p>
+    <w:p>
+      <w:pPr>
+        <w:ind w:firstLine="720"/>
+        <w:jc w:val="both"/>
+        <w:rPr>
+          <w:lang w:val="es-CO"/>
+        </w:rPr>
+      </w:pPr>
+      <w:r>
+        <w:rPr>
+          <w:lang w:val="es-CO"/>
+        </w:rPr>
+        <w:t xml:space="preserve">Dar de alta un dispositivo IoT y dejarlo listo para operar hoy requiere tres pasos, en un orden concreto: conectarlo (Factory Method, Semana 3, que resuelve la fábrica por tipo), simular algunas lecturas iniciales para que no aparezca vacío, y generar un reporte resumen que quede en la bandeja del usuario (Builder, Semana 5, más Abstract Factory, Semana 4).</w:t>
+      </w:r>
+    </w:p>
+    <w:p>
+      <w:pPr>
+        <w:ind w:firstLine="720"/>
+        <w:jc w:val="both"/>
+        <w:rPr>
+          <w:lang w:val="es-CO"/>
+        </w:rPr>
+      </w:pPr>
+      <w:r>
+        <w:rPr>
+          <w:lang w:val="es-CO"/>
+        </w:rPr>
+        <w:t xml:space="preserve">Si cada cliente —el frontend, un futuro script de alta masiva, un bot— tuviera que conocer esos tres subsistemas y llamarlos en el orden correcto, cualquier cambio en ese orden, o un paso nuevo, obligaría a tocar cada punto donde se da de alta un dispositivo.</w:t>
+      </w:r>
+    </w:p>
+    <w:p>
+      <w:pPr>
+        <w:pStyle w:val="Ttulo3"/>
+        <w:spacing w:before="200" w:after="100" w:line="480" w:lineRule="auto"/>
+        <w:rPr>
+          <w:lang w:val="es-CO"/>
+        </w:rPr>
+      </w:pPr>
+      <w:bookmarkStart w:id="119" w:name="bm_facade_solucion"/>
+      <w:r>
+        <w:rPr>
+          <w:b/>
+          <w:bCs/>
+          <w:i/>
+          <w:iCs/>
+          <w:color w:val="000000"/>
+          <w:lang w:val="es-CO"/>
+        </w:rPr>
+        <w:t xml:space="preserve">Cómo lo Soluciona el Patrón</w:t>
+      </w:r>
+      <w:bookmarkEnd w:id="119"/>
+    </w:p>
+    <w:p>
+      <w:pPr>
+        <w:pStyle w:val="Prrafodelista"/>
+        <w:numPr>
+          <w:ilvl w:val="0"/>
+          <w:numId w:val="2"/>
+        </w:numPr>
+        <w:spacing w:line="480" w:lineRule="auto"/>
+        <w:jc w:val="both"/>
+        <w:rPr>
+          <w:lang w:val="es-CO"/>
+        </w:rPr>
+      </w:pPr>
+      <w:r>
+        <w:rPr>
+          <w:b/>
+          <w:bCs/>
+          <w:lang w:val="es-CO"/>
+        </w:rPr>
+        <w:t xml:space="preserve">Subsistemas (ya existentes, sin cambios). </w:t>
+      </w:r>
+      <w:r>
+        <w:rPr>
+          <w:lang w:val="es-CO"/>
+        </w:rPr>
+        <w:t xml:space="preserve">PlataformaEnergia.conectar_dispositivo (Factory Method), simular_lecturas y generar_reporte (Builder + Abstract Factory). La fachada no los reemplaza ni oculta su funcionalidad individual: siguen pudiéndose llamar por separado, igual que antes de existir OnboardingDispositivo.</w:t>
+      </w:r>
+    </w:p>
+    <w:p>
+      <w:pPr>
+        <w:pStyle w:val="Prrafodelista"/>
+        <w:numPr>
+          <w:ilvl w:val="0"/>
+          <w:numId w:val="2"/>
+        </w:numPr>
+        <w:spacing w:line="480" w:lineRule="auto"/>
+        <w:jc w:val="both"/>
+        <w:rPr>
+          <w:lang w:val="es-CO"/>
+        </w:rPr>
+      </w:pPr>
+      <w:r>
+        <w:rPr>
+          <w:b/>
+          <w:bCs/>
+          <w:lang w:val="es-CO"/>
+        </w:rPr>
+        <w:t xml:space="preserve">Facade OnboardingDispositivo. </w:t>
+      </w:r>
+      <w:r>
+        <w:rPr>
+          <w:lang w:val="es-CO"/>
+        </w:rPr>
+        <w:t xml:space="preserve">Conoce el orden correcto y expone un único método, conectar_y_activar(usuario_id, id, tipo, ...), que llama a los tres subsistemas en secuencia y devuelve un resultado consolidado (dispositivo, lecturas, reporte).</w:t>
+      </w:r>
+    </w:p>
+    <w:p>
+      <w:pPr>
+        <w:pStyle w:val="Prrafodelista"/>
+        <w:numPr>
+          <w:ilvl w:val="0"/>
+          <w:numId w:val="2"/>
+        </w:numPr>
+        <w:spacing w:line="480" w:lineRule="auto"/>
+        <w:jc w:val="both"/>
+        <w:rPr>
+          <w:lang w:val="es-CO"/>
+        </w:rPr>
+      </w:pPr>
+      <w:r>
+        <w:rPr>
+          <w:b/>
+          <w:bCs/>
+          <w:lang w:val="es-CO"/>
+        </w:rPr>
+        <w:t xml:space="preserve">Uso real. </w:t>
+      </w:r>
+      <w:r>
+        <w:rPr>
+          <w:lang w:val="es-CO"/>
+        </w:rPr>
+        <w:t xml:space="preserve">main.py instancia OnboardingDispositivo(plataforma) una sola vez, igual que la plataforma misma, y lo expone en POST /onboarding/dispositivo. La tarjeta “Alta rápida de dispositivo” de la pestaña IoT usa ese único endpoint.</w:t>
+      </w:r>
+    </w:p>
+    <w:p>
+      <w:pPr>
+        <w:spacing w:before="200"/>
+        <w:rPr>
+          <w:lang w:val="es-CO"/>
+        </w:rPr>
+      </w:pPr>
+      <w:bookmarkStart w:id="120" w:name="bm_fig44"/>
+      <w:r>
+        <w:rPr>
+          <w:b/>
+          <w:bCs/>
+          <w:lang w:val="es-CO"/>
+        </w:rPr>
+        <w:t xml:space="preserve">Figura 44</w:t>
+      </w:r>
+      <w:bookmarkEnd w:id="120"/>
+    </w:p>
+    <w:p>
+      <w:pPr>
+        <w:rPr>
+          <w:lang w:val="es-CO"/>
+        </w:rPr>
+      </w:pPr>
+      <w:r>
+        <w:rPr>
+          <w:i/>
+          <w:iCs/>
+          <w:lang w:val="es-CO"/>
+        </w:rPr>
+        <w:t xml:space="preserve">Facade OnboardingDispositivo coordinando Factory Method, la simulación de lecturas y Builder + Abstract Factory en onboarding.py</w:t>
+      </w:r>
+    </w:p>
+    <w:p>
+      <w:pPr>
+        <w:ind w:left="720"/>
+        <w:rPr>
+          <w:lang w:val="es-CO"/>
+        </w:rPr>
+      </w:pPr>
+      <w:r>
+        <w:rPr>
+          <w:rFonts w:ascii="Courier New" w:eastAsia="Courier New" w:hAnsi="Courier New" w:cs="Courier New"/>
+          <w:sz w:val="20"/>
+          <w:szCs w:val="20"/>
+          <w:lang w:val="es-CO"/>
+        </w:rPr>
+        <w:t xml:space="preserve">class OnboardingDispositivo:</w:t>
+      </w:r>
+    </w:p>
+    <w:p>
+      <w:pPr>
+        <w:ind w:left="720"/>
+        <w:rPr>
+          <w:lang w:val="es-CO"/>
+        </w:rPr>
+      </w:pPr>
+      <w:r>
+        <w:rPr>
+          <w:rFonts w:ascii="Courier New" w:eastAsia="Courier New" w:hAnsi="Courier New" w:cs="Courier New"/>
+          <w:sz w:val="20"/>
+          <w:szCs w:val="20"/>
+          <w:lang w:val="es-CO"/>
+        </w:rPr>
+        <w:t xml:space="preserve">    def __init__(self, plataforma: PlataformaEnergia):</w:t>
+      </w:r>
+    </w:p>
+    <w:p>
+      <w:pPr>
+        <w:ind w:left="720"/>
+        <w:rPr>
+          <w:lang w:val="es-CO"/>
+        </w:rPr>
+      </w:pPr>
+      <w:r>
+        <w:rPr>
+          <w:rFonts w:ascii="Courier New" w:eastAsia="Courier New" w:hAnsi="Courier New" w:cs="Courier New"/>
+          <w:sz w:val="20"/>
+          <w:szCs w:val="20"/>
+          <w:lang w:val="es-CO"/>
+        </w:rPr>
+        <w:t xml:space="preserve">        self._plataforma = plataforma</w:t>
+      </w:r>
+    </w:p>
+    <w:p>
+      <w:pPr>
+        <w:spacing w:before="120"/>
+        <w:ind w:left="720"/>
+        <w:rPr>
+          <w:lang w:val="es-CO"/>
+        </w:rPr>
+      </w:pPr>
+    </w:p>
+    <w:p>
+      <w:pPr>
+        <w:ind w:left="720"/>
+        <w:rPr>
+          <w:lang w:val="es-CO"/>
+        </w:rPr>
+      </w:pPr>
+      <w:r>
+        <w:rPr>
+          <w:rFonts w:ascii="Courier New" w:eastAsia="Courier New" w:hAnsi="Courier New" w:cs="Courier New"/>
+          <w:sz w:val="20"/>
+          <w:szCs w:val="20"/>
+          <w:lang w:val="es-CO"/>
+        </w:rPr>
+        <w:t xml:space="preserve">    def conectar_y_activar(self, usuario_id, id_dispositivo, tipo, n_lecturas=3):</w:t>
+      </w:r>
+    </w:p>
+    <w:p>
+      <w:pPr>
+        <w:ind w:left="720"/>
+        <w:rPr>
+          <w:lang w:val="es-CO"/>
+        </w:rPr>
+      </w:pPr>
+      <w:r>
+        <w:rPr>
+          <w:rFonts w:ascii="Courier New" w:eastAsia="Courier New" w:hAnsi="Courier New" w:cs="Courier New"/>
+          <w:sz w:val="20"/>
+          <w:szCs w:val="20"/>
+          <w:lang w:val="es-CO"/>
+        </w:rPr>
+        <w:t xml:space="preserve">        dispositivo = self._plataforma.conectar_dispositivo(</w:t>
+      </w:r>
+    </w:p>
+    <w:p>
+      <w:pPr>
+        <w:ind w:left="720"/>
+        <w:rPr>
+          <w:lang w:val="es-CO"/>
+        </w:rPr>
+      </w:pPr>
+      <w:r>
+        <w:rPr>
+          <w:rFonts w:ascii="Courier New" w:eastAsia="Courier New" w:hAnsi="Courier New" w:cs="Courier New"/>
+          <w:sz w:val="20"/>
+          <w:szCs w:val="20"/>
+          <w:lang w:val="es-CO"/>
+        </w:rPr>
+        <w:t xml:space="preserve">            usuario_id, id_dispositivo, tipo</w:t>
+      </w:r>
+    </w:p>
+    <w:p>
+      <w:pPr>
+        <w:ind w:left="720"/>
+        <w:rPr>
+          <w:lang w:val="es-CO"/>
+        </w:rPr>
+      </w:pPr>
+      <w:r>
+        <w:rPr>
+          <w:rFonts w:ascii="Courier New" w:eastAsia="Courier New" w:hAnsi="Courier New" w:cs="Courier New"/>
+          <w:sz w:val="20"/>
+          <w:szCs w:val="20"/>
+          <w:lang w:val="es-CO"/>
+        </w:rPr>
+        <w:t xml:space="preserve">        )</w:t>
+      </w:r>
+    </w:p>
+    <w:p>
+      <w:pPr>
+        <w:ind w:left="720"/>
+        <w:rPr>
+          <w:lang w:val="es-CO"/>
+        </w:rPr>
+      </w:pPr>
+      <w:r>
+        <w:rPr>
+          <w:rFonts w:ascii="Courier New" w:eastAsia="Courier New" w:hAnsi="Courier New" w:cs="Courier New"/>
+          <w:sz w:val="20"/>
+          <w:szCs w:val="20"/>
+          <w:lang w:val="es-CO"/>
+        </w:rPr>
+        <w:t xml:space="preserve">        lecturas = []</w:t>
+      </w:r>
+    </w:p>
+    <w:p>
+      <w:pPr>
+        <w:ind w:left="720"/>
+        <w:rPr>
+          <w:lang w:val="es-CO"/>
+        </w:rPr>
+      </w:pPr>
+      <w:r>
+        <w:rPr>
+          <w:rFonts w:ascii="Courier New" w:eastAsia="Courier New" w:hAnsi="Courier New" w:cs="Courier New"/>
+          <w:sz w:val="20"/>
+          <w:szCs w:val="20"/>
+          <w:lang w:val="es-CO"/>
+        </w:rPr>
+        <w:t xml:space="preserve">        if n_lecturas &gt; 0:</w:t>
+      </w:r>
+    </w:p>
+    <w:p>
+      <w:pPr>
+        <w:ind w:left="720"/>
+        <w:rPr>
+          <w:lang w:val="es-CO"/>
+        </w:rPr>
+      </w:pPr>
+      <w:r>
+        <w:rPr>
+          <w:rFonts w:ascii="Courier New" w:eastAsia="Courier New" w:hAnsi="Courier New" w:cs="Courier New"/>
+          <w:sz w:val="20"/>
+          <w:szCs w:val="20"/>
+          <w:lang w:val="es-CO"/>
+        </w:rPr>
+        <w:t xml:space="preserve">            lecturas = self._plataforma.simular_lecturas(id_dispositivo, n_lecturas)</w:t>
+      </w:r>
+    </w:p>
+    <w:p>
+      <w:pPr>
+        <w:ind w:left="720"/>
+        <w:rPr>
+          <w:lang w:val="es-CO"/>
+        </w:rPr>
+      </w:pPr>
+      <w:r>
+        <w:rPr>
+          <w:rFonts w:ascii="Courier New" w:eastAsia="Courier New" w:hAnsi="Courier New" w:cs="Courier New"/>
+          <w:sz w:val="20"/>
+          <w:szCs w:val="20"/>
+          <w:lang w:val="es-CO"/>
+        </w:rPr>
+        <w:t xml:space="preserve">        reporte = self._plataforma.generar_reporte(usuario_id, formato="resumen")</w:t>
+      </w:r>
+    </w:p>
+    <w:p>
+      <w:pPr>
+        <w:ind w:left="720"/>
+        <w:rPr>
+          <w:lang w:val="es-CO"/>
+        </w:rPr>
+      </w:pPr>
+      <w:r>
+        <w:rPr>
+          <w:rFonts w:ascii="Courier New" w:eastAsia="Courier New" w:hAnsi="Courier New" w:cs="Courier New"/>
+          <w:sz w:val="20"/>
+          <w:szCs w:val="20"/>
+          <w:lang w:val="es-CO"/>
+        </w:rPr>
+        <w:t xml:space="preserve">        return {"dispositivo": dispositivo, "lecturas": lecturas, "reporte": reporte}</w:t>
+      </w:r>
+    </w:p>
+    <w:p>
+      <w:pPr>
+        <w:spacing w:before="120"/>
+        <w:rPr>
+          <w:lang w:val="es-CO"/>
+        </w:rPr>
+      </w:pPr>
+      <w:r>
+        <w:rPr>
+          <w:i/>
+          <w:iCs/>
+          <w:lang w:val="es-CO"/>
+        </w:rPr>
+        <w:t xml:space="preserve">Nota. </w:t>
+      </w:r>
+      <w:r>
+        <w:rPr>
+          <w:lang w:val="es-CO"/>
+        </w:rPr>
+        <w:t xml:space="preserve">Extracto de plataforma-energia-app/backend/onboarding.py. OnboardingDispositivo no implementa ninguna lógica propia de conexión, simulación o reporte: solo conoce el orden en que deben llamarse los tres subsistemas ya existentes de PlataformaEnergia.</w:t>
+      </w:r>
+    </w:p>
+    <w:p>
+      <w:pPr>
+        <w:pStyle w:val="Ttulo3"/>
+        <w:spacing w:before="200" w:after="100" w:line="480" w:lineRule="auto"/>
+        <w:rPr>
+          <w:lang w:val="es-CO"/>
+        </w:rPr>
+      </w:pPr>
+      <w:bookmarkStart w:id="121" w:name="bm_facade_gana"/>
+      <w:r>
+        <w:rPr>
+          <w:b/>
+          <w:bCs/>
+          <w:i/>
+          <w:iCs/>
+          <w:color w:val="000000"/>
+          <w:lang w:val="es-CO"/>
+        </w:rPr>
+        <w:t xml:space="preserve">Qué Gana la Plataforma con Esto</w:t>
+      </w:r>
+      <w:bookmarkEnd w:id="121"/>
+    </w:p>
+    <w:p>
+      <w:pPr>
+        <w:pStyle w:val="Prrafodelista"/>
+        <w:numPr>
+          <w:ilvl w:val="0"/>
+          <w:numId w:val="2"/>
+        </w:numPr>
+        <w:spacing w:line="480" w:lineRule="auto"/>
+        <w:jc w:val="both"/>
+        <w:rPr>
+          <w:lang w:val="es-CO"/>
+        </w:rPr>
+      </w:pPr>
+      <w:r>
+        <w:rPr>
+          <w:b/>
+          <w:bCs/>
+          <w:lang w:val="es-CO"/>
+        </w:rPr>
+        <w:t xml:space="preserve">Menos acoplamiento del cliente con la implementación interna. </w:t>
+      </w:r>
+      <w:r>
+        <w:rPr>
+          <w:lang w:val="es-CO"/>
+        </w:rPr>
+        <w:t xml:space="preserve">El frontend, o cualquier otro cliente, no necesita saber que el alta rápida implica tres llamadas en un orden concreto.</w:t>
+      </w:r>
+    </w:p>
+    <w:p>
+      <w:pPr>
+        <w:pStyle w:val="Prrafodelista"/>
+        <w:numPr>
+          <w:ilvl w:val="0"/>
+          <w:numId w:val="2"/>
+        </w:numPr>
+        <w:spacing w:line="480" w:lineRule="auto"/>
+        <w:jc w:val="both"/>
+        <w:rPr>
+          <w:lang w:val="es-CO"/>
+        </w:rPr>
+      </w:pPr>
+      <w:r>
+        <w:rPr>
+          <w:b/>
+          <w:bCs/>
+          <w:lang w:val="es-CO"/>
+        </w:rPr>
+        <w:t xml:space="preserve">Un solo lugar para cambiar la secuencia. </w:t>
+      </w:r>
+      <w:r>
+        <w:rPr>
+          <w:lang w:val="es-CO"/>
+        </w:rPr>
+        <w:t xml:space="preserve">Si mañana el alta rápida también debiera enviar un aviso de bienvenida o calibrar umbrales, se cambia OnboardingDispositivo.conectar_y_activar una vez, no cada punto que da de alta un dispositivo.</w:t>
+      </w:r>
+    </w:p>
+    <w:p>
+      <w:pPr>
+        <w:pStyle w:val="Prrafodelista"/>
+        <w:numPr>
+          <w:ilvl w:val="0"/>
+          <w:numId w:val="2"/>
+        </w:numPr>
+        <w:spacing w:line="480" w:lineRule="auto"/>
+        <w:jc w:val="both"/>
+        <w:rPr>
+          <w:lang w:val="es-CO"/>
+        </w:rPr>
+      </w:pPr>
+      <w:r>
+        <w:rPr>
+          <w:b/>
+          <w:bCs/>
+          <w:lang w:val="es-CO"/>
+        </w:rPr>
+        <w:t xml:space="preserve">No reduce flexibilidad. </w:t>
+      </w:r>
+      <w:r>
+        <w:rPr>
+          <w:lang w:val="es-CO"/>
+        </w:rPr>
+        <w:t xml:space="preserve">Quien necesite control fino —por ejemplo, el formulario “Conectar dispositivo”, que no simula lecturas ni genera reporte— sigue llamando los subsistemas por separado. La fachada es una alternativa más simple para el caso común, no la única puerta de entrada.</w:t>
+      </w:r>
+    </w:p>
+    <w:p>
+      <w:pPr>
+        <w:pStyle w:val="Prrafodelista"/>
+        <w:numPr>
+          <w:ilvl w:val="0"/>
+          <w:numId w:val="2"/>
+        </w:numPr>
+        <w:spacing w:line="480" w:lineRule="auto"/>
+        <w:jc w:val="both"/>
+        <w:rPr>
+          <w:lang w:val="es-CO"/>
+        </w:rPr>
+      </w:pPr>
+      <w:r>
+        <w:rPr>
+          <w:b/>
+          <w:bCs/>
+          <w:lang w:val="es-CO"/>
+        </w:rPr>
+        <w:t xml:space="preserve">Relación con los patrones que coordina. </w:t>
+      </w:r>
+      <w:r>
+        <w:rPr>
+          <w:lang w:val="es-CO"/>
+        </w:rPr>
+        <w:t xml:space="preserve">Facade no decide qué clase crear (eso es Factory Method) ni cómo se arma el reporte (eso es Builder): solo decide el orden en que se usan esos subsistemas ya existentes.</w:t>
+      </w:r>
+    </w:p>
+    <w:p>
+      <w:pPr>
+        <w:spacing w:before="200"/>
+        <w:rPr>
+          <w:lang w:val="es-CO"/>
+        </w:rPr>
+      </w:pPr>
+      <w:bookmarkStart w:id="122" w:name="bm_fig45"/>
+      <w:r>
+        <w:rPr>
+          <w:b/>
+          <w:bCs/>
+          <w:lang w:val="es-CO"/>
+        </w:rPr>
+        <w:t xml:space="preserve">Figura 45</w:t>
+      </w:r>
+      <w:bookmarkEnd w:id="122"/>
+    </w:p>
+    <w:p>
+      <w:pPr>
+        <w:rPr>
+          <w:lang w:val="es-CO"/>
+        </w:rPr>
+      </w:pPr>
+      <w:r>
+        <w:rPr>
+          <w:i/>
+          <w:iCs/>
+          <w:lang w:val="es-CO"/>
+        </w:rPr>
+        <w:t xml:space="preserve">Diagrama UML de clases del patrón Facade aplicado al alta de dispositivos IoT</w:t>
+      </w:r>
+    </w:p>
+    <w:p>
+      <w:pPr>
+        <w:ind w:firstLine="720"/>
+        <w:jc w:val="both"/>
+      </w:pPr>
+      <w:r>
+        <w:drawing>
+          <wp:inline xmlns:a="http://schemas.openxmlformats.org/drawingml/2006/main" xmlns:pic="http://schemas.openxmlformats.org/drawingml/2006/picture">
+            <wp:extent cx="5943600" cy="3499638"/>
+            <wp:docPr id="2105890769" name="Picture 2105890769"/>
+            <wp:cNvGraphicFramePr>
+              <a:graphicFrameLocks noChangeAspect="1"/>
+            </wp:cNvGraphicFramePr>
+            <a:graphic>
+              <a:graphicData uri="http://schemas.openxmlformats.org/drawingml/2006/picture">
+                <pic:pic>
+                  <pic:nvPicPr>
+                    <pic:cNvPr id="0" name="UML_Facade.png"/>
+                    <pic:cNvPicPr/>
+                  </pic:nvPicPr>
+                  <pic:blipFill>
+                    <a:blip r:embed="rId46"/>
+                    <a:stretch>
+                      <a:fillRect/>
+                    </a:stretch>
+                  </pic:blipFill>
+                  <pic:spPr>
+                    <a:xfrm>
+                      <a:off x="0" y="0"/>
+                      <a:ext cx="5943600" cy="3499638"/>
+                    </a:xfrm>
+                    <a:prstGeom prst="rect"/>
+                  </pic:spPr>
+                </pic:pic>
+              </a:graphicData>
+            </a:graphic>
+          </wp:inline>
+        </w:drawing>
+      </w:r>
+    </w:p>
+    <w:p>
+      <w:pPr>
+        <w:spacing w:before="120"/>
+        <w:rPr>
+          <w:lang w:val="es-CO"/>
+        </w:rPr>
+      </w:pPr>
+      <w:r>
+        <w:rPr>
+          <w:i/>
+          <w:iCs/>
+          <w:lang w:val="es-CO"/>
+        </w:rPr>
+        <w:t xml:space="preserve">Nota. </w:t>
+      </w:r>
+      <w:r>
+        <w:rPr>
+          <w:lang w:val="es-CO"/>
+        </w:rPr>
+        <w:t xml:space="preserve">Diagrama generado a partir de Documentacion/Semana 9/facade.py y de la integración real en onboarding.py, mostrando a OnboardingDispositivo como fachada de PlataformaEnergia y las tres llamadas, en orden, que coordina.</w:t>
+      </w:r>
+    </w:p>
+    <w:p>
+      <w:pPr>
+        <w:pStyle w:val="Ttulo3"/>
+        <w:spacing w:before="200" w:after="100" w:line="480" w:lineRule="auto"/>
+        <w:rPr>
+          <w:lang w:val="es-CO"/>
+        </w:rPr>
+      </w:pPr>
+      <w:bookmarkStart w:id="123" w:name="bm_facade_justificacion"/>
+      <w:r>
+        <w:rPr>
+          <w:b/>
+          <w:bCs/>
+          <w:i/>
+          <w:iCs/>
+          <w:color w:val="000000"/>
+          <w:lang w:val="es-CO"/>
+        </w:rPr>
+        <w:t xml:space="preserve">Justificación de su Uso en el Proyecto</w:t>
+      </w:r>
+      <w:bookmarkEnd w:id="123"/>
+    </w:p>
+    <w:p>
+      <w:pPr>
+        <w:ind w:firstLine="720"/>
+        <w:jc w:val="both"/>
+        <w:rPr>
+          <w:lang w:val="es-CO"/>
+        </w:rPr>
+      </w:pPr>
+      <w:r>
+        <w:rPr>
+          <w:lang w:val="es-CO"/>
+        </w:rPr>
+        <w:t xml:space="preserve">El patrón Facade resulta pertinente para este proyecto porque la Contextualización del Proyecto plantea un flujo de alta de dispositivos IoT que, en la práctica, ya involucra tres subsistemas construidos en semanas anteriores (Factory Method, Builder y Abstract Factory). Centralizar ese flujo en un único punto de entrada reduce el riesgo de que un cliente nuevo olvide alguno de los tres pasos o los llame en el orden incorrecto.</w:t>
+      </w:r>
+    </w:p>
+    <w:p>
+      <w:pPr>
+        <w:pStyle w:val="Ttulo3"/>
+        <w:spacing w:before="200" w:after="100" w:line="480" w:lineRule="auto"/>
+        <w:rPr>
+          <w:lang w:val="es-CO"/>
+        </w:rPr>
+      </w:pPr>
+      <w:bookmarkStart w:id="124" w:name="bm_facade_evaluacion"/>
+      <w:r>
+        <w:rPr>
+          <w:b/>
+          <w:bCs/>
+          <w:i/>
+          <w:iCs/>
+          <w:color w:val="000000"/>
+          <w:lang w:val="es-CO"/>
+        </w:rPr>
+        <w:t xml:space="preserve">Evaluación: ¿Sirve este patrón para el proyecto?</w:t>
+      </w:r>
+      <w:bookmarkEnd w:id="124"/>
+    </w:p>
+    <w:p>
+      <w:pPr>
+        <w:ind w:firstLine="720"/>
+        <w:jc w:val="both"/>
+        <w:rPr>
+          <w:lang w:val="es-CO"/>
+        </w:rPr>
+      </w:pPr>
+      <w:r>
+        <w:rPr>
+          <w:b/>
+          <w:bCs/>
+          <w:lang w:val="es-CO"/>
+        </w:rPr>
+        <w:t xml:space="preserve">Veredicto: sí sirve. </w:t>
+      </w:r>
+      <w:r>
+        <w:rPr>
+          <w:lang w:val="es-CO"/>
+        </w:rPr>
+        <w:t xml:space="preserve">El patrón Facade sí sirve para el proyecto porque el alta de un dispositivo efectivamente requiere coordinar tres subsistemas en un orden fijo, y esa coordinación no tenía antes un lugar único. Se integró sin modificar la lógica existente: OnboardingDispositivo solo llama a métodos que PlataformaEnergia ya exponía, y los casos de los patrones anteriores —incluidos los de Factory Method y Builder— siguen pasando sin cambios.</w:t>
+      </w:r>
+    </w:p>
+    <w:p>
+      <w:pPr>
+        <w:ind w:firstLine="720"/>
+        <w:jc w:val="both"/>
+        <w:rPr>
+          <w:lang w:val="es-CO"/>
+        </w:rPr>
+      </w:pPr>
+      <w:r>
+        <w:rPr>
+          <w:lang w:val="es-CO"/>
+        </w:rPr>
+        <w:t xml:space="preserve">Matiz a tener en cuenta: el formulario original “Conectar dispositivo” de la pestaña IoT sigue existiendo y llamando los subsistemas por separado, por lo que la fachada hoy es una alternativa, no un reemplazo. Si en el futuro todo el flujo de alta pasara únicamente por conectar_y_activar, convendría revisar si ese formulario manual todavía aporta valor o si debería apoyarse también en la fachada.</w:t>
+      </w:r>
+    </w:p>
+    <w:p>
+      <w:pPr>
+        <w:pStyle w:val="Ttulo3"/>
+        <w:spacing w:before="200" w:after="100" w:line="480" w:lineRule="auto"/>
+        <w:rPr>
+          <w:lang w:val="es-CO"/>
+        </w:rPr>
+      </w:pPr>
+      <w:bookmarkStart w:id="125" w:name="bm_facade_validacion"/>
+      <w:r>
+        <w:rPr>
+          <w:b/>
+          <w:bCs/>
+          <w:i/>
+          <w:iCs/>
+          <w:color w:val="000000"/>
+          <w:lang w:val="es-CO"/>
+        </w:rPr>
+        <w:t xml:space="preserve">Validación del Patrón</w:t>
+      </w:r>
+      <w:bookmarkEnd w:id="125"/>
+    </w:p>
+    <w:p>
+      <w:pPr>
+        <w:ind w:firstLine="720"/>
+        <w:jc w:val="both"/>
+        <w:rPr>
+          <w:lang w:val="es-CO"/>
+        </w:rPr>
+      </w:pPr>
+      <w:r>
+        <w:rPr>
+          <w:lang w:val="es-CO"/>
+        </w:rPr>
+        <w:t xml:space="preserve">La validación del patrón Facade se realizó mediante pruebas unitarias automatizadas con pytest, que verifican que conectar_y_activar registra el dispositivo, simula exactamente las lecturas pedidas, deja un reporte en la bandeja del usuario correcto, que los subsistemas siguen funcionando por separado sin la fachada, que la fachada acepta subsistemas inyectados para pruebas aisladas, y que dos fachadas —o dos altas seguidas— no comparten ni mezclan su estado. Como se observa en la Figura 46, la suite Documentacion/Semana 9/test_facade.py ejecutó 12 casos, todos superados, y el conjunto completo de pruebas del proyecto —los diez patrones— pasa sin errores (207 casos en total).</w:t>
+      </w:r>
+    </w:p>
+    <w:p>
+      <w:pPr>
+        <w:spacing w:before="200"/>
+        <w:rPr>
+          <w:lang w:val="es-CO"/>
+        </w:rPr>
+      </w:pPr>
+      <w:bookmarkStart w:id="126" w:name="bm_fig46"/>
+      <w:r>
+        <w:rPr>
+          <w:b/>
+          <w:bCs/>
+          <w:lang w:val="es-CO"/>
+        </w:rPr>
+        <w:t xml:space="preserve">Figura 46</w:t>
+      </w:r>
+      <w:bookmarkEnd w:id="126"/>
+    </w:p>
+    <w:p>
+      <w:pPr>
+        <w:rPr>
+          <w:lang w:val="es-CO"/>
+        </w:rPr>
+      </w:pPr>
+      <w:r>
+        <w:rPr>
+          <w:i/>
+          <w:iCs/>
+          <w:lang w:val="es-CO"/>
+        </w:rPr>
+        <w:t xml:space="preserve">Resultados de la ejecución de las pruebas unitarias del patrón Facade</w:t>
+      </w:r>
+    </w:p>
+    <w:p>
+      <w:pPr>
+        <w:ind w:firstLine="720"/>
+        <w:jc w:val="both"/>
+      </w:pPr>
+      <w:r>
+        <w:drawing>
+          <wp:inline xmlns:a="http://schemas.openxmlformats.org/drawingml/2006/main" xmlns:pic="http://schemas.openxmlformats.org/drawingml/2006/picture">
+            <wp:extent cx="5943600" cy="2276766"/>
+            <wp:docPr id="2105890769" name="Picture 2105890769"/>
+            <wp:cNvGraphicFramePr>
+              <a:graphicFrameLocks noChangeAspect="1"/>
+            </wp:cNvGraphicFramePr>
+            <a:graphic>
+              <a:graphicData uri="http://schemas.openxmlformats.org/drawingml/2006/picture">
+                <pic:pic>
+                  <pic:nvPicPr>
+                    <pic:cNvPr id="0" name="pytest_facade.png"/>
+                    <pic:cNvPicPr/>
+                  </pic:nvPicPr>
+                  <pic:blipFill>
+                    <a:blip r:embed="rId47"/>
+                    <a:stretch>
+                      <a:fillRect/>
+                    </a:stretch>
+                  </pic:blipFill>
+                  <pic:spPr>
+                    <a:xfrm>
+                      <a:off x="0" y="0"/>
+                      <a:ext cx="5943600" cy="2276766"/>
+                    </a:xfrm>
+                    <a:prstGeom prst="rect"/>
+                  </pic:spPr>
+                </pic:pic>
+              </a:graphicData>
+            </a:graphic>
+          </wp:inline>
+        </w:drawing>
+      </w:r>
+    </w:p>
+    <w:p>
+      <w:pPr>
+        <w:spacing w:before="120"/>
+        <w:rPr>
+          <w:lang w:val="es-CO"/>
+        </w:rPr>
+      </w:pPr>
+      <w:r>
+        <w:rPr>
+          <w:i/>
+          <w:iCs/>
+          <w:lang w:val="es-CO"/>
+        </w:rPr>
+        <w:t xml:space="preserve">Nota. </w:t>
+      </w:r>
+      <w:r>
+        <w:rPr>
+          <w:lang w:val="es-CO"/>
+        </w:rPr>
+        <w:t xml:space="preserve">Salida de consola de la ejecución de pytest sobre Documentacion/Semana 9/test_facade.py, mostrando la aprobación de los 12 casos (12 passed), agrupados por comportamiento: coordinación de la fachada, subsistemas por separado e independencia de instancias.</w:t>
+      </w:r>
+    </w:p>
+    <w:p>
+      <w:pPr>
+        <w:pStyle w:val="Ttulo3"/>
+        <w:spacing w:before="200" w:after="100" w:line="480" w:lineRule="auto"/>
+        <w:rPr>
+          <w:lang w:val="es-CO"/>
+        </w:rPr>
+      </w:pPr>
+      <w:bookmarkStart w:id="80" w:name="bm_factory_conclusion"/>
+      <w:r>
+        <w:rPr>
+          <w:b/>
+          <w:bCs/>
+          <w:i/>
+          <w:iCs/>
+          <w:color w:val="000000"/>
+          <w:lang w:val="es-CO"/>
+        </w:rPr>
+        <w:t>Conclusión</w:t>
+      </w:r>
+      <w:bookmarkEnd w:id="80"/>
+    </w:p>
+    <w:p>
+      <w:pPr>
+        <w:ind w:firstLine="720"/>
+        <w:jc w:val="both"/>
+        <w:rPr>
+          <w:lang w:val="es-CO"/>
+        </w:rPr>
+      </w:pPr>
+      <w:proofErr w:type="spellStart"/>
+      <w:proofErr w:type="spellEnd"/>
+      <w:proofErr w:type="spellStart"/>
+      <w:proofErr w:type="spellEnd"/>
+      <w:proofErr w:type="spellStart"/>
+      <w:proofErr w:type="spellEnd"/>
+      <w:proofErr w:type="spellStart"/>
+      <w:proofErr w:type="spellEnd"/>
+      <w:proofErr w:type="spellStart"/>
+      <w:proofErr w:type="spellEnd"/>
+      <w:r>
+        <w:rPr>
+          <w:lang w:val="es-CO"/>
+        </w:rPr>
+        <w:t xml:space="preserve">En resumen, el patrón Singleton garantiza que toda la plataforma comparta un mismo estado consistente, el Factory Method garantiza que cada tipo de dispositivo IoT se cree y se comporte correctamente sin acoplar ese conocimiento al resto del sistema, el Abstract Factory garantiza que cada canal de notificación genere la familia completa de avisos con un formato coherente, el Builder permite construir el reporte energético paso a paso y obtenerlo en distintas representaciones sin duplicar la lógica de negocio, el Prototype permite clonar un dispositivo IoT ya calibrado para repetir esa configuración en altas posteriores sin volver a escribirla a mano, el Adapter permite integrar pasarelas de pago externas con interfaces incompatibles sin que esa incompatibilidad contamine la lógica de negocio, el Composite permite tratar de manera uniforme a un dispositivo y a la comunidad entera para calcular su energía a cualquier nivel, el Decorator permite construir el precio final de cada transacción apilando ajustes en tiempo de ejecución sin multiplicar clases, el Bridge permite sincronizar cada dispositivo IoT por un protocolo distinto (simulado, HTTP, MQTT) sin acoplar esa elección a si la sincronización reintenta o no ante fallas, y el Facade permite dar de alta un dispositivo IoT con una sola llamada que coordina, en el orden correcto, su conexión, la simulación de lecturas iniciales y la generación de un reporte. Los diez patrones son complementarios: el primero define cuántas instancias de la plataforma existen; el segundo y el tercero definen cómo se crean los objetos —individuales o en familia— que la plataforma administra; el cuarto define cómo se ensambla un objeto complejo a partir de esos datos; el quinto define cómo se reutiliza un objeto ya configurado para crear otros similares sin repetir su configuración; el sexto define cómo se conecta la plataforma con clases externas cuya interfaz no se puede modificar; el séptimo define cómo se agrupan los objetos en jerarquías que se recorren con una sola operación; el octavo define cómo se agregan responsabilidades a un objeto en tiempo de ejecución sin modificar su clase; el noveno define cómo se desacoplan dos jerarquías que varían por separado para que cualquier combinación se arme por composición y no por herencia; y el décimo define cómo se concentra el orden correcto de varias llamadas a subsistemas ya existentes detrás de un único punto de entrada.</w:t>
+      </w:r>
+    </w:p>
+    <w:p>
+      <w:pPr>
+        <w:rPr>
+          <w:lang w:val="es-CO"/>
+        </w:rPr>
+      </w:pPr>
+      <w:r>
+        <w:rPr>
+          <w:lang w:val="es-CO"/>
+        </w:rPr>
+        <w:br w:type="page"/>
+      </w:r>
+    </w:p>
+    <w:p>
+      <w:pPr>
+        <w:pStyle w:val="Ttulo1"/>
+        <w:spacing w:before="240" w:after="240" w:line="480" w:lineRule="auto"/>
+        <w:jc w:val="center"/>
+      </w:pPr>
+      <w:bookmarkStart w:id="81" w:name="bm_referencias"/>
+      <w:r>
+        <w:rPr>
+          <w:b/>
+          <w:bCs/>
+          <w:color w:val="000000"/>
+          <w:sz w:val="24"/>
+          <w:szCs w:val="24"/>
         </w:rPr>
         <w:lastRenderedPageBreak/>
         <w:t>Referencias</w:t>
@@ -30322,6 +33117,28 @@
       </w:pPr>
       <w:r>
         <w:t>Refactoring.Guru. (s.f.). Decorator. Recuperado en 2026, de https://refactoring.guru/es/design-patterns/decorator</w:t>
+      </w:r>
+    </w:p>
+    <w:p>
+      <w:pPr>
+        <w:ind w:left="720" w:hanging="720"/>
+        <w:rPr>
+          <w:lang w:val="es-CO"/>
+        </w:rPr>
+      </w:pPr>
+      <w:r>
+        <w:t>Refactoring.Guru. (s.f.). Bridge. Recuperado en 2026, de https://refactoring.guru/es/design-patterns/bridge</w:t>
+      </w:r>
+    </w:p>
+    <w:p>
+      <w:pPr>
+        <w:ind w:left="720" w:hanging="720"/>
+        <w:rPr>
+          <w:lang w:val="es-CO"/>
+        </w:rPr>
+      </w:pPr>
+      <w:r>
+        <w:t>Refactoring.Guru. (s.f.). Facade. Recuperado en 2026, de https://refactoring.guru/es/design-patterns/facade</w:t>
       </w:r>
     </w:p>
     <w:sectPr>

</xml_diff>

<commit_message>
Implementacion de los patrones Flyweight y Proxy (Semana 10) integrados en la app y en el documento
</commit_message>
<xml_diff>
--- a/Documentacion/plataforma-Comercio-Energia.docx
+++ b/Documentacion/plataforma-Comercio-Energia.docx
@@ -4017,6 +4017,674 @@
           <w:tab w:val="right" w:leader="dot" w:pos="9360"/>
         </w:tabs>
         <w:spacing w:after="80" w:line="360" w:lineRule="auto"/>
+        <w:ind w:left="360"/>
+        <w:rPr>
+          <w:lang w:val="es-CO"/>
+        </w:rPr>
+      </w:pPr>
+      <w:r>
+        <w:rPr>
+          <w:lang w:val="es-CO"/>
+        </w:rPr>
+        <w:t xml:space="preserve">Aplicación del Patrón de Diseño Flyweight en el Catálogo de Dispositivos IoT</w:t>
+      </w:r>
+      <w:r>
+        <w:rPr>
+          <w:lang w:val="es-CO"/>
+        </w:rPr>
+        <w:tab/>
+      </w:r>
+      <w:r>
+        <w:fldChar w:fldCharType="begin"/>
+      </w:r>
+      <w:r>
+        <w:rPr>
+          <w:lang w:val="es-CO"/>
+        </w:rPr>
+        <w:instrText>PAGEREF bm_flyweight \h</w:instrText>
+      </w:r>
+      <w:r>
+        <w:fldChar w:fldCharType="separate"/>
+      </w:r>
+      <w:r>
+        <w:rPr>
+          <w:noProof/>
+          <w:lang w:val="es-CO"/>
+        </w:rPr>
+        <w:t xml:space="preserve">1</w:t>
+      </w:r>
+      <w:r>
+        <w:fldChar w:fldCharType="end"/>
+      </w:r>
+    </w:p>
+    <w:p>
+      <w:pPr>
+        <w:tabs>
+          <w:tab w:val="right" w:leader="dot" w:pos="9360"/>
+        </w:tabs>
+        <w:spacing w:after="80" w:line="360" w:lineRule="auto"/>
+        <w:ind w:left="720"/>
+        <w:rPr>
+          <w:lang w:val="es-CO"/>
+        </w:rPr>
+      </w:pPr>
+      <w:r>
+        <w:rPr>
+          <w:i/>
+          <w:iCs/>
+          <w:lang w:val="es-CO"/>
+        </w:rPr>
+        <w:t xml:space="preserve">El Problema que Resuelve</w:t>
+      </w:r>
+      <w:r>
+        <w:rPr>
+          <w:lang w:val="es-CO"/>
+        </w:rPr>
+        <w:tab/>
+      </w:r>
+      <w:r>
+        <w:fldChar w:fldCharType="begin"/>
+      </w:r>
+      <w:r>
+        <w:rPr>
+          <w:lang w:val="es-CO"/>
+        </w:rPr>
+        <w:instrText>PAGEREF bm_flyweight_problema \h</w:instrText>
+      </w:r>
+      <w:r>
+        <w:fldChar w:fldCharType="separate"/>
+      </w:r>
+      <w:r>
+        <w:rPr>
+          <w:noProof/>
+          <w:lang w:val="es-CO"/>
+        </w:rPr>
+        <w:t xml:space="preserve">1</w:t>
+      </w:r>
+      <w:r>
+        <w:fldChar w:fldCharType="end"/>
+      </w:r>
+    </w:p>
+    <w:p>
+      <w:pPr>
+        <w:tabs>
+          <w:tab w:val="right" w:leader="dot" w:pos="9360"/>
+        </w:tabs>
+        <w:spacing w:after="80" w:line="360" w:lineRule="auto"/>
+        <w:ind w:left="720"/>
+        <w:rPr>
+          <w:lang w:val="es-CO"/>
+        </w:rPr>
+      </w:pPr>
+      <w:r>
+        <w:rPr>
+          <w:i/>
+          <w:iCs/>
+          <w:lang w:val="es-CO"/>
+        </w:rPr>
+        <w:t xml:space="preserve">Cómo lo Soluciona el Patrón</w:t>
+      </w:r>
+      <w:r>
+        <w:rPr>
+          <w:lang w:val="es-CO"/>
+        </w:rPr>
+        <w:tab/>
+      </w:r>
+      <w:r>
+        <w:fldChar w:fldCharType="begin"/>
+      </w:r>
+      <w:r>
+        <w:rPr>
+          <w:lang w:val="es-CO"/>
+        </w:rPr>
+        <w:instrText>PAGEREF bm_flyweight_solucion \h</w:instrText>
+      </w:r>
+      <w:r>
+        <w:fldChar w:fldCharType="separate"/>
+      </w:r>
+      <w:r>
+        <w:rPr>
+          <w:noProof/>
+          <w:lang w:val="es-CO"/>
+        </w:rPr>
+        <w:t xml:space="preserve">1</w:t>
+      </w:r>
+      <w:r>
+        <w:fldChar w:fldCharType="end"/>
+      </w:r>
+    </w:p>
+    <w:p>
+      <w:pPr>
+        <w:tabs>
+          <w:tab w:val="right" w:leader="dot" w:pos="9360"/>
+        </w:tabs>
+        <w:spacing w:after="80" w:line="360" w:lineRule="auto"/>
+        <w:ind w:left="720"/>
+        <w:rPr>
+          <w:lang w:val="es-CO"/>
+        </w:rPr>
+      </w:pPr>
+      <w:r>
+        <w:rPr>
+          <w:i/>
+          <w:iCs/>
+          <w:lang w:val="es-CO"/>
+        </w:rPr>
+        <w:t xml:space="preserve">Qué Gana la Plataforma con Esto</w:t>
+      </w:r>
+      <w:r>
+        <w:rPr>
+          <w:lang w:val="es-CO"/>
+        </w:rPr>
+        <w:tab/>
+      </w:r>
+      <w:r>
+        <w:fldChar w:fldCharType="begin"/>
+      </w:r>
+      <w:r>
+        <w:rPr>
+          <w:lang w:val="es-CO"/>
+        </w:rPr>
+        <w:instrText>PAGEREF bm_flyweight_gana \h</w:instrText>
+      </w:r>
+      <w:r>
+        <w:fldChar w:fldCharType="separate"/>
+      </w:r>
+      <w:r>
+        <w:rPr>
+          <w:noProof/>
+          <w:lang w:val="es-CO"/>
+        </w:rPr>
+        <w:t xml:space="preserve">1</w:t>
+      </w:r>
+      <w:r>
+        <w:fldChar w:fldCharType="end"/>
+      </w:r>
+    </w:p>
+    <w:p>
+      <w:pPr>
+        <w:tabs>
+          <w:tab w:val="right" w:leader="dot" w:pos="9360"/>
+        </w:tabs>
+        <w:spacing w:after="80" w:line="360" w:lineRule="auto"/>
+        <w:ind w:left="720"/>
+        <w:rPr>
+          <w:lang w:val="es-CO"/>
+        </w:rPr>
+      </w:pPr>
+      <w:r>
+        <w:rPr>
+          <w:i/>
+          <w:iCs/>
+          <w:lang w:val="es-CO"/>
+        </w:rPr>
+        <w:t xml:space="preserve">Justificación de su Uso en el Proyecto</w:t>
+      </w:r>
+      <w:r>
+        <w:rPr>
+          <w:lang w:val="es-CO"/>
+        </w:rPr>
+        <w:tab/>
+      </w:r>
+      <w:r>
+        <w:fldChar w:fldCharType="begin"/>
+      </w:r>
+      <w:r>
+        <w:rPr>
+          <w:lang w:val="es-CO"/>
+        </w:rPr>
+        <w:instrText>PAGEREF bm_flyweight_justificacion \h</w:instrText>
+      </w:r>
+      <w:r>
+        <w:fldChar w:fldCharType="separate"/>
+      </w:r>
+      <w:r>
+        <w:rPr>
+          <w:noProof/>
+          <w:lang w:val="es-CO"/>
+        </w:rPr>
+        <w:t xml:space="preserve">1</w:t>
+      </w:r>
+      <w:r>
+        <w:fldChar w:fldCharType="end"/>
+      </w:r>
+    </w:p>
+    <w:p>
+      <w:pPr>
+        <w:tabs>
+          <w:tab w:val="right" w:leader="dot" w:pos="9360"/>
+        </w:tabs>
+        <w:spacing w:after="80" w:line="360" w:lineRule="auto"/>
+        <w:ind w:left="720"/>
+        <w:rPr>
+          <w:lang w:val="es-CO"/>
+        </w:rPr>
+      </w:pPr>
+      <w:r>
+        <w:rPr>
+          <w:i/>
+          <w:iCs/>
+          <w:lang w:val="es-CO"/>
+        </w:rPr>
+        <w:t xml:space="preserve">Evaluación: ¿Sirve este patrón para el proyecto?</w:t>
+      </w:r>
+      <w:r>
+        <w:rPr>
+          <w:lang w:val="es-CO"/>
+        </w:rPr>
+        <w:tab/>
+      </w:r>
+      <w:r>
+        <w:fldChar w:fldCharType="begin"/>
+      </w:r>
+      <w:r>
+        <w:rPr>
+          <w:lang w:val="es-CO"/>
+        </w:rPr>
+        <w:instrText>PAGEREF bm_flyweight_evaluacion \h</w:instrText>
+      </w:r>
+      <w:r>
+        <w:fldChar w:fldCharType="separate"/>
+      </w:r>
+      <w:r>
+        <w:rPr>
+          <w:noProof/>
+          <w:lang w:val="es-CO"/>
+        </w:rPr>
+        <w:t xml:space="preserve">1</w:t>
+      </w:r>
+      <w:r>
+        <w:fldChar w:fldCharType="end"/>
+      </w:r>
+    </w:p>
+    <w:p>
+      <w:pPr>
+        <w:tabs>
+          <w:tab w:val="right" w:leader="dot" w:pos="9360"/>
+        </w:tabs>
+        <w:spacing w:after="80" w:line="360" w:lineRule="auto"/>
+        <w:ind w:left="720"/>
+        <w:rPr>
+          <w:lang w:val="es-CO"/>
+        </w:rPr>
+      </w:pPr>
+      <w:r>
+        <w:rPr>
+          <w:i/>
+          <w:iCs/>
+          <w:lang w:val="es-CO"/>
+        </w:rPr>
+        <w:t xml:space="preserve">Validación del Patrón</w:t>
+      </w:r>
+      <w:r>
+        <w:rPr>
+          <w:lang w:val="es-CO"/>
+        </w:rPr>
+        <w:tab/>
+      </w:r>
+      <w:r>
+        <w:fldChar w:fldCharType="begin"/>
+      </w:r>
+      <w:r>
+        <w:rPr>
+          <w:lang w:val="es-CO"/>
+        </w:rPr>
+        <w:instrText>PAGEREF bm_flyweight_validacion \h</w:instrText>
+      </w:r>
+      <w:r>
+        <w:fldChar w:fldCharType="separate"/>
+      </w:r>
+      <w:r>
+        <w:rPr>
+          <w:noProof/>
+          <w:lang w:val="es-CO"/>
+        </w:rPr>
+        <w:t xml:space="preserve">1</w:t>
+      </w:r>
+      <w:r>
+        <w:fldChar w:fldCharType="end"/>
+      </w:r>
+    </w:p>
+    <w:p>
+      <w:pPr>
+        <w:tabs>
+          <w:tab w:val="right" w:leader="dot" w:pos="9360"/>
+        </w:tabs>
+        <w:spacing w:after="80" w:line="360" w:lineRule="auto"/>
+        <w:ind w:left="360"/>
+        <w:rPr>
+          <w:lang w:val="es-CO"/>
+        </w:rPr>
+      </w:pPr>
+      <w:r>
+        <w:rPr>
+          <w:lang w:val="es-CO"/>
+        </w:rPr>
+        <w:t xml:space="preserve">Aplicación del Patrón de Diseño Proxy en el Acceso al Reporte Energético</w:t>
+      </w:r>
+      <w:r>
+        <w:rPr>
+          <w:lang w:val="es-CO"/>
+        </w:rPr>
+        <w:tab/>
+      </w:r>
+      <w:r>
+        <w:fldChar w:fldCharType="begin"/>
+      </w:r>
+      <w:r>
+        <w:rPr>
+          <w:lang w:val="es-CO"/>
+        </w:rPr>
+        <w:instrText>PAGEREF bm_proxy \h</w:instrText>
+      </w:r>
+      <w:r>
+        <w:fldChar w:fldCharType="separate"/>
+      </w:r>
+      <w:r>
+        <w:rPr>
+          <w:noProof/>
+          <w:lang w:val="es-CO"/>
+        </w:rPr>
+        <w:t xml:space="preserve">1</w:t>
+      </w:r>
+      <w:r>
+        <w:fldChar w:fldCharType="end"/>
+      </w:r>
+    </w:p>
+    <w:p>
+      <w:pPr>
+        <w:tabs>
+          <w:tab w:val="right" w:leader="dot" w:pos="9360"/>
+        </w:tabs>
+        <w:spacing w:after="80" w:line="360" w:lineRule="auto"/>
+        <w:ind w:left="720"/>
+        <w:rPr>
+          <w:lang w:val="es-CO"/>
+        </w:rPr>
+      </w:pPr>
+      <w:r>
+        <w:rPr>
+          <w:i/>
+          <w:iCs/>
+          <w:lang w:val="es-CO"/>
+        </w:rPr>
+        <w:t xml:space="preserve">El Problema que Resuelve</w:t>
+      </w:r>
+      <w:r>
+        <w:rPr>
+          <w:lang w:val="es-CO"/>
+        </w:rPr>
+        <w:tab/>
+      </w:r>
+      <w:r>
+        <w:fldChar w:fldCharType="begin"/>
+      </w:r>
+      <w:r>
+        <w:rPr>
+          <w:lang w:val="es-CO"/>
+        </w:rPr>
+        <w:instrText>PAGEREF bm_proxy_problema \h</w:instrText>
+      </w:r>
+      <w:r>
+        <w:fldChar w:fldCharType="separate"/>
+      </w:r>
+      <w:r>
+        <w:rPr>
+          <w:noProof/>
+          <w:lang w:val="es-CO"/>
+        </w:rPr>
+        <w:t xml:space="preserve">1</w:t>
+      </w:r>
+      <w:r>
+        <w:fldChar w:fldCharType="end"/>
+      </w:r>
+    </w:p>
+    <w:p>
+      <w:pPr>
+        <w:tabs>
+          <w:tab w:val="right" w:leader="dot" w:pos="9360"/>
+        </w:tabs>
+        <w:spacing w:after="80" w:line="360" w:lineRule="auto"/>
+        <w:ind w:left="720"/>
+        <w:rPr>
+          <w:lang w:val="es-CO"/>
+        </w:rPr>
+      </w:pPr>
+      <w:r>
+        <w:rPr>
+          <w:i/>
+          <w:iCs/>
+          <w:lang w:val="es-CO"/>
+        </w:rPr>
+        <w:t xml:space="preserve">Cómo lo Soluciona el Patrón</w:t>
+      </w:r>
+      <w:r>
+        <w:rPr>
+          <w:lang w:val="es-CO"/>
+        </w:rPr>
+        <w:tab/>
+      </w:r>
+      <w:r>
+        <w:fldChar w:fldCharType="begin"/>
+      </w:r>
+      <w:r>
+        <w:rPr>
+          <w:lang w:val="es-CO"/>
+        </w:rPr>
+        <w:instrText>PAGEREF bm_proxy_solucion \h</w:instrText>
+      </w:r>
+      <w:r>
+        <w:fldChar w:fldCharType="separate"/>
+      </w:r>
+      <w:r>
+        <w:rPr>
+          <w:noProof/>
+          <w:lang w:val="es-CO"/>
+        </w:rPr>
+        <w:t xml:space="preserve">1</w:t>
+      </w:r>
+      <w:r>
+        <w:fldChar w:fldCharType="end"/>
+      </w:r>
+    </w:p>
+    <w:p>
+      <w:pPr>
+        <w:tabs>
+          <w:tab w:val="right" w:leader="dot" w:pos="9360"/>
+        </w:tabs>
+        <w:spacing w:after="80" w:line="360" w:lineRule="auto"/>
+        <w:ind w:left="720"/>
+        <w:rPr>
+          <w:lang w:val="es-CO"/>
+        </w:rPr>
+      </w:pPr>
+      <w:r>
+        <w:rPr>
+          <w:i/>
+          <w:iCs/>
+          <w:lang w:val="es-CO"/>
+        </w:rPr>
+        <w:t xml:space="preserve">Qué Gana la Plataforma con Esto</w:t>
+      </w:r>
+      <w:r>
+        <w:rPr>
+          <w:lang w:val="es-CO"/>
+        </w:rPr>
+        <w:tab/>
+      </w:r>
+      <w:r>
+        <w:fldChar w:fldCharType="begin"/>
+      </w:r>
+      <w:r>
+        <w:rPr>
+          <w:lang w:val="es-CO"/>
+        </w:rPr>
+        <w:instrText>PAGEREF bm_proxy_gana \h</w:instrText>
+      </w:r>
+      <w:r>
+        <w:fldChar w:fldCharType="separate"/>
+      </w:r>
+      <w:r>
+        <w:rPr>
+          <w:noProof/>
+          <w:lang w:val="es-CO"/>
+        </w:rPr>
+        <w:t xml:space="preserve">1</w:t>
+      </w:r>
+      <w:r>
+        <w:fldChar w:fldCharType="end"/>
+      </w:r>
+    </w:p>
+    <w:p>
+      <w:pPr>
+        <w:tabs>
+          <w:tab w:val="right" w:leader="dot" w:pos="9360"/>
+        </w:tabs>
+        <w:spacing w:after="80" w:line="360" w:lineRule="auto"/>
+        <w:ind w:left="720"/>
+        <w:rPr>
+          <w:lang w:val="es-CO"/>
+        </w:rPr>
+      </w:pPr>
+      <w:r>
+        <w:rPr>
+          <w:i/>
+          <w:iCs/>
+          <w:lang w:val="es-CO"/>
+        </w:rPr>
+        <w:t xml:space="preserve">Justificación de su Uso en el Proyecto</w:t>
+      </w:r>
+      <w:r>
+        <w:rPr>
+          <w:lang w:val="es-CO"/>
+        </w:rPr>
+        <w:tab/>
+      </w:r>
+      <w:r>
+        <w:fldChar w:fldCharType="begin"/>
+      </w:r>
+      <w:r>
+        <w:rPr>
+          <w:lang w:val="es-CO"/>
+        </w:rPr>
+        <w:instrText>PAGEREF bm_proxy_justificacion \h</w:instrText>
+      </w:r>
+      <w:r>
+        <w:fldChar w:fldCharType="separate"/>
+      </w:r>
+      <w:r>
+        <w:rPr>
+          <w:noProof/>
+          <w:lang w:val="es-CO"/>
+        </w:rPr>
+        <w:t xml:space="preserve">1</w:t>
+      </w:r>
+      <w:r>
+        <w:fldChar w:fldCharType="end"/>
+      </w:r>
+    </w:p>
+    <w:p>
+      <w:pPr>
+        <w:tabs>
+          <w:tab w:val="right" w:leader="dot" w:pos="9360"/>
+        </w:tabs>
+        <w:spacing w:after="80" w:line="360" w:lineRule="auto"/>
+        <w:ind w:left="720"/>
+        <w:rPr>
+          <w:lang w:val="es-CO"/>
+        </w:rPr>
+      </w:pPr>
+      <w:r>
+        <w:rPr>
+          <w:i/>
+          <w:iCs/>
+          <w:lang w:val="es-CO"/>
+        </w:rPr>
+        <w:t xml:space="preserve">Evaluación: ¿Sirve este patrón para el proyecto?</w:t>
+      </w:r>
+      <w:r>
+        <w:rPr>
+          <w:lang w:val="es-CO"/>
+        </w:rPr>
+        <w:tab/>
+      </w:r>
+      <w:r>
+        <w:fldChar w:fldCharType="begin"/>
+      </w:r>
+      <w:r>
+        <w:rPr>
+          <w:lang w:val="es-CO"/>
+        </w:rPr>
+        <w:instrText>PAGEREF bm_proxy_evaluacion \h</w:instrText>
+      </w:r>
+      <w:r>
+        <w:fldChar w:fldCharType="separate"/>
+      </w:r>
+      <w:r>
+        <w:rPr>
+          <w:noProof/>
+          <w:lang w:val="es-CO"/>
+        </w:rPr>
+        <w:t xml:space="preserve">1</w:t>
+      </w:r>
+      <w:r>
+        <w:fldChar w:fldCharType="end"/>
+      </w:r>
+    </w:p>
+    <w:p>
+      <w:pPr>
+        <w:tabs>
+          <w:tab w:val="right" w:leader="dot" w:pos="9360"/>
+        </w:tabs>
+        <w:spacing w:after="80" w:line="360" w:lineRule="auto"/>
+        <w:ind w:left="720"/>
+        <w:rPr>
+          <w:lang w:val="es-CO"/>
+        </w:rPr>
+      </w:pPr>
+      <w:r>
+        <w:rPr>
+          <w:i/>
+          <w:iCs/>
+          <w:lang w:val="es-CO"/>
+        </w:rPr>
+        <w:t xml:space="preserve">Validación del Patrón</w:t>
+      </w:r>
+      <w:r>
+        <w:rPr>
+          <w:lang w:val="es-CO"/>
+        </w:rPr>
+        <w:tab/>
+      </w:r>
+      <w:r>
+        <w:fldChar w:fldCharType="begin"/>
+      </w:r>
+      <w:r>
+        <w:rPr>
+          <w:lang w:val="es-CO"/>
+        </w:rPr>
+        <w:instrText>PAGEREF bm_proxy_validacion \h</w:instrText>
+      </w:r>
+      <w:r>
+        <w:fldChar w:fldCharType="separate"/>
+      </w:r>
+      <w:r>
+        <w:rPr>
+          <w:noProof/>
+          <w:lang w:val="es-CO"/>
+        </w:rPr>
+        <w:t xml:space="preserve">1</w:t>
+      </w:r>
+      <w:r>
+        <w:fldChar w:fldCharType="end"/>
+      </w:r>
+    </w:p>
+    <w:p>
+      <w:pPr>
+        <w:tabs>
+          <w:tab w:val="right" w:leader="dot" w:pos="9360"/>
+        </w:tabs>
+        <w:spacing w:after="80" w:line="360" w:lineRule="auto"/>
         <w:ind w:left="720"/>
         <w:rPr>
           <w:lang w:val="es-CO"/>
@@ -6666,6 +7334,282 @@
     </w:p>
     <w:p>
       <w:pPr>
+        <w:tabs>
+          <w:tab w:val="right" w:leader="dot" w:pos="9360"/>
+        </w:tabs>
+        <w:spacing w:after="80" w:line="360" w:lineRule="auto"/>
+        <w:ind w:left="360" w:hanging="360"/>
+        <w:rPr>
+          <w:lang w:val="es-CO"/>
+        </w:rPr>
+      </w:pPr>
+      <w:r>
+        <w:rPr>
+          <w:lang w:val="es-CO"/>
+        </w:rPr>
+        <w:t xml:space="preserve">Figura 47. Flyweight FichaTipoDispositivo y su fábrica FabricaFichasDispositivo en catalogo_dispositivos.py</w:t>
+      </w:r>
+      <w:r>
+        <w:rPr>
+          <w:lang w:val="es-CO"/>
+        </w:rPr>
+        <w:tab/>
+      </w:r>
+      <w:r>
+        <w:fldChar w:fldCharType="begin"/>
+      </w:r>
+      <w:r>
+        <w:rPr>
+          <w:lang w:val="es-CO"/>
+        </w:rPr>
+        <w:instrText>PAGEREF bm_fig47 \h</w:instrText>
+      </w:r>
+      <w:r>
+        <w:fldChar w:fldCharType="separate"/>
+      </w:r>
+      <w:r>
+        <w:rPr>
+          <w:noProof/>
+          <w:lang w:val="es-CO"/>
+        </w:rPr>
+        <w:t xml:space="preserve">1</w:t>
+      </w:r>
+      <w:r>
+        <w:fldChar w:fldCharType="end"/>
+      </w:r>
+    </w:p>
+    <w:p>
+      <w:pPr>
+        <w:tabs>
+          <w:tab w:val="right" w:leader="dot" w:pos="9360"/>
+        </w:tabs>
+        <w:spacing w:after="80" w:line="360" w:lineRule="auto"/>
+        <w:ind w:left="360" w:hanging="360"/>
+        <w:rPr>
+          <w:lang w:val="es-CO"/>
+        </w:rPr>
+      </w:pPr>
+      <w:r>
+        <w:rPr>
+          <w:lang w:val="es-CO"/>
+        </w:rPr>
+        <w:t xml:space="preserve">Figura 48. Diagrama UML de clases del patrón Flyweight aplicado al catálogo de dispositivos IoT</w:t>
+      </w:r>
+      <w:r>
+        <w:rPr>
+          <w:lang w:val="es-CO"/>
+        </w:rPr>
+        <w:tab/>
+      </w:r>
+      <w:r>
+        <w:fldChar w:fldCharType="begin"/>
+      </w:r>
+      <w:r>
+        <w:rPr>
+          <w:lang w:val="es-CO"/>
+        </w:rPr>
+        <w:instrText>PAGEREF bm_fig48 \h</w:instrText>
+      </w:r>
+      <w:r>
+        <w:fldChar w:fldCharType="separate"/>
+      </w:r>
+      <w:r>
+        <w:rPr>
+          <w:noProof/>
+          <w:lang w:val="es-CO"/>
+        </w:rPr>
+        <w:t xml:space="preserve">1</w:t>
+      </w:r>
+      <w:r>
+        <w:fldChar w:fldCharType="end"/>
+      </w:r>
+    </w:p>
+    <w:p>
+      <w:pPr>
+        <w:tabs>
+          <w:tab w:val="right" w:leader="dot" w:pos="9360"/>
+        </w:tabs>
+        <w:spacing w:after="80" w:line="360" w:lineRule="auto"/>
+        <w:ind w:left="360" w:hanging="360"/>
+        <w:rPr>
+          <w:lang w:val="es-CO"/>
+        </w:rPr>
+      </w:pPr>
+      <w:r>
+        <w:rPr>
+          <w:lang w:val="es-CO"/>
+        </w:rPr>
+        <w:t xml:space="preserve">Figura 49. Resultados de la ejecución de las pruebas unitarias del patrón Flyweight</w:t>
+      </w:r>
+      <w:r>
+        <w:rPr>
+          <w:lang w:val="es-CO"/>
+        </w:rPr>
+        <w:tab/>
+      </w:r>
+      <w:r>
+        <w:fldChar w:fldCharType="begin"/>
+      </w:r>
+      <w:r>
+        <w:rPr>
+          <w:lang w:val="es-CO"/>
+        </w:rPr>
+        <w:instrText>PAGEREF bm_fig49 \h</w:instrText>
+      </w:r>
+      <w:r>
+        <w:fldChar w:fldCharType="separate"/>
+      </w:r>
+      <w:r>
+        <w:rPr>
+          <w:noProof/>
+          <w:lang w:val="es-CO"/>
+        </w:rPr>
+        <w:t xml:space="preserve">1</w:t>
+      </w:r>
+      <w:r>
+        <w:fldChar w:fldCharType="end"/>
+      </w:r>
+    </w:p>
+    <w:p>
+      <w:pPr>
+        <w:tabs>
+          <w:tab w:val="right" w:leader="dot" w:pos="9360"/>
+        </w:tabs>
+        <w:spacing w:after="80" w:line="360" w:lineRule="auto"/>
+        <w:ind w:left="360" w:hanging="360"/>
+        <w:rPr>
+          <w:lang w:val="es-CO"/>
+        </w:rPr>
+      </w:pPr>
+      <w:r>
+        <w:rPr>
+          <w:lang w:val="es-CO"/>
+        </w:rPr>
+        <w:t xml:space="preserve">Figura 50. Proxy ReporteProxy protegiendo, cacheando y auditando GeneradorReportesReal en reportes_proxy.py</w:t>
+      </w:r>
+      <w:r>
+        <w:rPr>
+          <w:lang w:val="es-CO"/>
+        </w:rPr>
+        <w:tab/>
+      </w:r>
+      <w:r>
+        <w:fldChar w:fldCharType="begin"/>
+      </w:r>
+      <w:r>
+        <w:rPr>
+          <w:lang w:val="es-CO"/>
+        </w:rPr>
+        <w:instrText>PAGEREF bm_fig50 \h</w:instrText>
+      </w:r>
+      <w:r>
+        <w:fldChar w:fldCharType="separate"/>
+      </w:r>
+      <w:r>
+        <w:rPr>
+          <w:noProof/>
+          <w:lang w:val="es-CO"/>
+        </w:rPr>
+        <w:t xml:space="preserve">1</w:t>
+      </w:r>
+      <w:r>
+        <w:fldChar w:fldCharType="end"/>
+      </w:r>
+    </w:p>
+    <w:p>
+      <w:pPr>
+        <w:tabs>
+          <w:tab w:val="right" w:leader="dot" w:pos="9360"/>
+        </w:tabs>
+        <w:spacing w:after="80" w:line="360" w:lineRule="auto"/>
+        <w:ind w:left="360" w:hanging="360"/>
+        <w:rPr>
+          <w:lang w:val="es-CO"/>
+        </w:rPr>
+      </w:pPr>
+      <w:r>
+        <w:rPr>
+          <w:lang w:val="es-CO"/>
+        </w:rPr>
+        <w:t xml:space="preserve">Figura 51. Diagrama UML de clases del patrón Proxy aplicado al reporte energético</w:t>
+      </w:r>
+      <w:r>
+        <w:rPr>
+          <w:lang w:val="es-CO"/>
+        </w:rPr>
+        <w:tab/>
+      </w:r>
+      <w:r>
+        <w:fldChar w:fldCharType="begin"/>
+      </w:r>
+      <w:r>
+        <w:rPr>
+          <w:lang w:val="es-CO"/>
+        </w:rPr>
+        <w:instrText>PAGEREF bm_fig51 \h</w:instrText>
+      </w:r>
+      <w:r>
+        <w:fldChar w:fldCharType="separate"/>
+      </w:r>
+      <w:r>
+        <w:rPr>
+          <w:noProof/>
+          <w:lang w:val="es-CO"/>
+        </w:rPr>
+        <w:t xml:space="preserve">1</w:t>
+      </w:r>
+      <w:r>
+        <w:fldChar w:fldCharType="end"/>
+      </w:r>
+    </w:p>
+    <w:p>
+      <w:pPr>
+        <w:tabs>
+          <w:tab w:val="right" w:leader="dot" w:pos="9360"/>
+        </w:tabs>
+        <w:spacing w:after="80" w:line="360" w:lineRule="auto"/>
+        <w:ind w:left="360" w:hanging="360"/>
+        <w:rPr>
+          <w:lang w:val="es-CO"/>
+        </w:rPr>
+      </w:pPr>
+      <w:r>
+        <w:rPr>
+          <w:lang w:val="es-CO"/>
+        </w:rPr>
+        <w:t xml:space="preserve">Figura 52. Resultados de la ejecución de las pruebas unitarias del patrón Proxy</w:t>
+      </w:r>
+      <w:r>
+        <w:rPr>
+          <w:lang w:val="es-CO"/>
+        </w:rPr>
+        <w:tab/>
+      </w:r>
+      <w:r>
+        <w:fldChar w:fldCharType="begin"/>
+      </w:r>
+      <w:r>
+        <w:rPr>
+          <w:lang w:val="es-CO"/>
+        </w:rPr>
+        <w:instrText>PAGEREF bm_fig52 \h</w:instrText>
+      </w:r>
+      <w:r>
+        <w:fldChar w:fldCharType="separate"/>
+      </w:r>
+      <w:r>
+        <w:rPr>
+          <w:noProof/>
+          <w:lang w:val="es-CO"/>
+        </w:rPr>
+        <w:t xml:space="preserve">1</w:t>
+      </w:r>
+      <w:r>
+        <w:fldChar w:fldCharType="end"/>
+      </w:r>
+    </w:p>
+    <w:p>
+      <w:pPr>
         <w:pageBreakBefore/>
         <w:rPr>
           <w:lang w:val="es-CO"/>
@@ -6719,7 +7663,7 @@
         <w:rPr>
           <w:lang w:val="es-CO"/>
         </w:rPr>
-        <w:t xml:space="preserve">El presente documento contextualiza el proyecto Plataforma de Comercio de Energía, una solución digital orientada a facilitar la compra y venta de excedentes energéticos entre usuarios en contextos de generación distribuida, como paneles solares domésticos y baterías inteligentes. Adicionalmente, se explica la implementación de diez patrones de diseño aplicados en el sistema: el patrón Singleton, que garantiza un punto único y consistente de acceso al estado de la plataforma (PlataformaEnergia) de forma segura ante la concurrencia; el patrón Factory Method, que resuelve la integración de distintos tipos de dispositivos IoT domésticos (paneles solares, baterías inteligentes y medidores); el patrón Abstract Factory, que organiza los canales de notificación (correo, SMS y notificación push) para que cada uno genere la familia completa de avisos con un formato coherente; y el patrón Builder, que construye el reporte energético del usuario paso a paso para obtenerlo en distintas representaciones (diccionario, objeto con secciones o texto); y el patrón Prototype, que permite clonar un dispositivo IoT ya calibrado para dar de alta otros similares sin repetir su configuración; y el patrón Adapter, que integra pasarelas de pago externas (Stripe, PayU) con interfaces incompatibles bajo una interfaz uniforme; el patrón Composite, que organiza la energía de la comunidad como un árbol (comunidad, hogares y dispositivos) para calcular producción, consumo y balance con la misma operación en cualquier nivel; el patrón Decorator, que construye el precio final de cada transacción apilando descuentos, recargos, cargos y comisiones sobre el costo base sin crear una clase por combinación; el patrón Bridge, que separa el protocolo de sincronización de un dispositivo IoT (simulado, HTTP, MQTT) de la forma en que se sincroniza (con o sin reintentos), para que ambas jerarquías varíen de forma independiente; y el patrón Facade, que concentra en un único punto de entrada las tres llamadas necesarias para dar de alta un dispositivo IoT y dejarlo operando (conectar, simular lecturas y generar un reporte inicial). Se describe la problemática que motiva el proyecto, la propuesta de solución, las funcionalidades principales, el objetivo general y el impacto esperado, así como el problema técnico que motiva cada patrón, la solución propuesta a partir de las clases involucradas y los beneficios que aportan a la consistencia, la escalabilidad y la mantenibilidad del sistema.</w:t>
+        <w:t xml:space="preserve">El presente documento contextualiza el proyecto Plataforma de Comercio de Energía, una solución digital orientada a facilitar la compra y venta de excedentes energéticos entre usuarios en contextos de generación distribuida, como paneles solares domésticos y baterías inteligentes. Adicionalmente, se explica la implementación de doce patrones de diseño aplicados en el sistema: el patrón Singleton, que garantiza un punto único y consistente de acceso al estado de la plataforma (PlataformaEnergia) de forma segura ante la concurrencia; el patrón Factory Method, que resuelve la integración de distintos tipos de dispositivos IoT domésticos (paneles solares, baterías inteligentes y medidores); el patrón Abstract Factory, que organiza los canales de notificación (correo, SMS y notificación push) para que cada uno genere la familia completa de avisos con un formato coherente; y el patrón Builder, que construye el reporte energético del usuario paso a paso para obtenerlo en distintas representaciones (diccionario, objeto con secciones o texto); y el patrón Prototype, que permite clonar un dispositivo IoT ya calibrado para dar de alta otros similares sin repetir su configuración; y el patrón Adapter, que integra pasarelas de pago externas (Stripe, PayU) con interfaces incompatibles bajo una interfaz uniforme; el patrón Composite, que organiza la energía de la comunidad como un árbol (comunidad, hogares y dispositivos) para calcular producción, consumo y balance con la misma operación en cualquier nivel; el patrón Decorator, que construye el precio final de cada transacción apilando descuentos, recargos, cargos y comisiones sobre el costo base sin crear una clase por combinación; el patrón Bridge, que separa el protocolo de sincronización de un dispositivo IoT (simulado, HTTP, MQTT) de la forma en que se sincroniza (con o sin reintentos), para que ambas jerarquías varíen de forma independiente; el patrón Facade, que concentra en un único punto de entrada las tres llamadas necesarias para dar de alta un dispositivo IoT y dejarlo operando (conectar, simular lecturas y generar un reporte inicial); el patrón Flyweight, que comparte una sola ficha técnica por tipo de dispositivo IoT en vez de duplicarla en cada dispositivo conectado; y el patrón Proxy, que protege, cachea y audita el acceso al reporte energético del usuario sin modificar su construcción paso a paso. Se describe la problemática que motiva el proyecto, la propuesta de solución, las funcionalidades principales, el objetivo general y el impacto esperado, así como el problema técnico que motiva cada patrón, la solución propuesta a partir de las clases involucradas y los beneficios que aportan a la consistencia, la escalabilidad y la mantenibilidad del sistema.</w:t>
       </w:r>
     </w:p>
     <w:p>
@@ -6741,7 +7685,7 @@
         <w:rPr>
           <w:lang w:val="es-CO"/>
         </w:rPr>
-        <w:t xml:space="preserve">Palabras clave: comercio de energía, Singleton, Factory Method, Abstract Factory, Builder, Prototype, Adapter, Composite, Decorator, Bridge, Facade, patrones de diseño, IoT, arquitectura de software, principio abierto/cerrado.</w:t>
+        <w:t xml:space="preserve">Palabras clave: comercio de energía, Singleton, Factory Method, Abstract Factory, Builder, Prototype, Adapter, Composite, Decorator, Bridge, Facade, Flyweight, Proxy, patrones de diseño, IoT, arquitectura de software, principio abierto/cerrado.</w:t>
       </w:r>
     </w:p>
     <w:p>
@@ -7727,6 +8671,62 @@
           <w:lang w:val="es-CO"/>
         </w:rPr>
         <w:t xml:space="preserve">Aplicar el patrón Facade para concentrar en un único punto de entrada el alta de un dispositivo IoT, coordinando su conexión, la simulación de lecturas iniciales y la generación de un reporte resumen.</w:t>
+      </w:r>
+    </w:p>
+    <w:p>
+      <w:pPr>
+        <w:pStyle w:val="Prrafodelista"/>
+        <w:numPr>
+          <w:ilvl w:val="0"/>
+          <w:numId w:val="2"/>
+        </w:numPr>
+        <w:spacing w:line="480" w:lineRule="auto"/>
+        <w:jc w:val="both"/>
+        <w:rPr>
+          <w:lang w:val="es-CO"/>
+        </w:rPr>
+      </w:pPr>
+      <w:r>
+        <w:rPr>
+          <w:b/>
+          <w:bCs/>
+          <w:lang w:val="es-CO"/>
+        </w:rPr>
+        <w:t xml:space="preserve"/>
+      </w:r>
+      <w:r>
+        <w:rPr>
+          <w:lang w:val="es-CO"/>
+        </w:rPr>
+        <w:t xml:space="preserve">Aplicar el patrón Flyweight para compartir una sola ficha técnica por tipo de dispositivo IoT, en vez de duplicarla en cada dispositivo conectado.</w:t>
+      </w:r>
+    </w:p>
+    <w:p>
+      <w:pPr>
+        <w:pStyle w:val="Prrafodelista"/>
+        <w:numPr>
+          <w:ilvl w:val="0"/>
+          <w:numId w:val="2"/>
+        </w:numPr>
+        <w:spacing w:line="480" w:lineRule="auto"/>
+        <w:jc w:val="both"/>
+        <w:rPr>
+          <w:lang w:val="es-CO"/>
+        </w:rPr>
+      </w:pPr>
+      <w:r>
+        <w:rPr>
+          <w:b/>
+          <w:bCs/>
+          <w:lang w:val="es-CO"/>
+        </w:rPr>
+        <w:t xml:space="preserve"/>
+      </w:r>
+      <w:r>
+        <w:rPr>
+          <w:lang w:val="es-CO"/>
+        </w:rPr>
+        <w:t xml:space="preserve">Aplicar el patrón Proxy para proteger, cachear y auditar el acceso al reporte energético del usuario, sin modificar su construcción paso a paso.</w:t>
       </w:r>
     </w:p>
     <w:p>
@@ -32858,13 +33858,50 @@
     </w:p>
     <w:p>
       <w:pPr>
+        <w:pStyle w:val="Ttulo2"/>
+        <w:spacing w:before="240" w:after="120" w:line="480" w:lineRule="auto"/>
+        <w:rPr>
+          <w:lang w:val="es-CO"/>
+        </w:rPr>
+      </w:pPr>
+      <w:bookmarkStart w:id="127" w:name="bm_flyweight"/>
+      <w:r>
+        <w:rPr>
+          <w:b/>
+          <w:bCs/>
+          <w:color w:val="000000"/>
+          <w:sz w:val="24"/>
+          <w:szCs w:val="24"/>
+          <w:lang w:val="es-CO"/>
+        </w:rPr>
+        <w:t xml:space="preserve">Aplicación del Patrón de Diseño Flyweight en el Catálogo de Dispositivos IoT</w:t>
+      </w:r>
+      <w:bookmarkEnd w:id="127"/>
+    </w:p>
+    <w:p>
+      <w:pPr>
+        <w:ind w:firstLine="720"/>
+        <w:jc w:val="both"/>
+        <w:rPr>
+          <w:lang w:val="es-CO"/>
+        </w:rPr>
+      </w:pPr>
+      <w:r>
+        <w:rPr>
+          <w:lang w:val="es-CO"/>
+        </w:rPr>
+        <w:t xml:space="preserve">El patrón Flyweight incorporado a la plataforma comparte una sola ficha técnica por cada TIPO de dispositivo IoT (panel solar, batería, medidor), en vez de que cada dispositivo conectado guarde su propia copia de esos datos. Este módulo forma parte de la lógica de dominio del backend (plataforma.py, métodos ficha_tecnica y catalogo_dispositivos) y se expone en la API FastAPI (main.py) a través de /iot/catalogo y /iot/dispositivos/{id}/ficha; la implementación educativa completa se encuentra en Documentacion/Semana 10/flyweight.py.</w:t>
+      </w:r>
+    </w:p>
+    <w:p>
+      <w:pPr>
         <w:pStyle w:val="Ttulo3"/>
         <w:spacing w:before="200" w:after="100" w:line="480" w:lineRule="auto"/>
         <w:rPr>
           <w:lang w:val="es-CO"/>
         </w:rPr>
       </w:pPr>
-      <w:bookmarkStart w:id="80" w:name="bm_factory_conclusion"/>
+      <w:bookmarkStart w:id="128" w:name="bm_flyweight_problema"/>
       <w:r>
         <w:rPr>
           <w:b/>
@@ -32874,9 +33911,9 @@
           <w:color w:val="000000"/>
           <w:lang w:val="es-CO"/>
         </w:rPr>
-        <w:t>Conclusión</w:t>
-      </w:r>
-      <w:bookmarkEnd w:id="80"/>
+        <w:t xml:space="preserve">El Problema que Resuelve</w:t>
+      </w:r>
+      <w:bookmarkEnd w:id="128"/>
     </w:p>
     <w:p>
       <w:pPr>
@@ -32886,43 +33923,1000 @@
           <w:lang w:val="es-CO"/>
         </w:rPr>
       </w:pPr>
-      <w:proofErr w:type="spellStart"/>
-      <w:proofErr w:type="spellEnd"/>
-      <w:proofErr w:type="spellStart"/>
-      <w:proofErr w:type="spellEnd"/>
-      <w:proofErr w:type="spellStart"/>
-      <w:proofErr w:type="spellEnd"/>
-      <w:proofErr w:type="spellStart"/>
-      <w:proofErr w:type="spellEnd"/>
-      <w:proofErr w:type="spellStart"/>
-      <w:proofErr w:type="spellEnd"/>
-      <w:r>
-        <w:rPr>
-          <w:lang w:val="es-CO"/>
-        </w:rPr>
-        <w:t xml:space="preserve">En resumen, el patrón Singleton garantiza que toda la plataforma comparta un mismo estado consistente, el Factory Method garantiza que cada tipo de dispositivo IoT se cree y se comporte correctamente sin acoplar ese conocimiento al resto del sistema, el Abstract Factory garantiza que cada canal de notificación genere la familia completa de avisos con un formato coherente, el Builder permite construir el reporte energético paso a paso y obtenerlo en distintas representaciones sin duplicar la lógica de negocio, el Prototype permite clonar un dispositivo IoT ya calibrado para repetir esa configuración en altas posteriores sin volver a escribirla a mano, el Adapter permite integrar pasarelas de pago externas con interfaces incompatibles sin que esa incompatibilidad contamine la lógica de negocio, el Composite permite tratar de manera uniforme a un dispositivo y a la comunidad entera para calcular su energía a cualquier nivel, el Decorator permite construir el precio final de cada transacción apilando ajustes en tiempo de ejecución sin multiplicar clases, el Bridge permite sincronizar cada dispositivo IoT por un protocolo distinto (simulado, HTTP, MQTT) sin acoplar esa elección a si la sincronización reintenta o no ante fallas, y el Facade permite dar de alta un dispositivo IoT con una sola llamada que coordina, en el orden correcto, su conexión, la simulación de lecturas iniciales y la generación de un reporte. Los diez patrones son complementarios: el primero define cuántas instancias de la plataforma existen; el segundo y el tercero definen cómo se crean los objetos —individuales o en familia— que la plataforma administra; el cuarto define cómo se ensambla un objeto complejo a partir de esos datos; el quinto define cómo se reutiliza un objeto ya configurado para crear otros similares sin repetir su configuración; el sexto define cómo se conecta la plataforma con clases externas cuya interfaz no se puede modificar; el séptimo define cómo se agrupan los objetos en jerarquías que se recorren con una sola operación; el octavo define cómo se agregan responsabilidades a un objeto en tiempo de ejecución sin modificar su clase; el noveno define cómo se desacoplan dos jerarquías que varían por separado para que cualquier combinación se arme por composición y no por herencia; y el décimo define cómo se concentra el orden correcto de varias llamadas a subsistemas ya existentes detrás de un único punto de entrada.</w:t>
-      </w:r>
-    </w:p>
-    <w:p>
-      <w:pPr>
-        <w:rPr>
-          <w:lang w:val="es-CO"/>
-        </w:rPr>
-      </w:pPr>
-      <w:r>
-        <w:rPr>
-          <w:lang w:val="es-CO"/>
-        </w:rPr>
-        <w:br w:type="page"/>
-      </w:r>
-    </w:p>
-    <w:p>
-      <w:pPr>
-        <w:pStyle w:val="Ttulo1"/>
-        <w:spacing w:before="240" w:after="240" w:line="480" w:lineRule="auto"/>
-        <w:jc w:val="center"/>
-      </w:pPr>
-      <w:bookmarkStart w:id="81" w:name="bm_referencias"/>
+      <w:r>
+        <w:rPr>
+          <w:lang w:val="es-CO"/>
+        </w:rPr>
+        <w:t xml:space="preserve">Cada dispositivo IoT conectado (Factory Method, Semana 3) ya guarda su id, su dueño y sus propios umbrales calibrados. Pero describirlo en la interfaz también implica un nombre amigable, una categoría, una unidad de medida y una descripción —datos que son idénticos para todos los dispositivos del mismo tipo. Si la plataforma llegara a tener miles de paneles solares conectados, cada uno terminaría cargando una copia exacta del mismo texto descriptivo.</w:t>
+      </w:r>
+    </w:p>
+    <w:p>
+      <w:pPr>
+        <w:ind w:firstLine="720"/>
+        <w:jc w:val="both"/>
+        <w:rPr>
+          <w:lang w:val="es-CO"/>
+        </w:rPr>
+      </w:pPr>
+      <w:r>
+        <w:rPr>
+          <w:lang w:val="es-CO"/>
+        </w:rPr>
+        <w:t xml:space="preserve">Es el mismo problema visto en clase con el horario de miles de estudiantes: mucha información intrínseca (compartida, como el programa o el docente de una materia) y poca extrínseca (única, como el estudiante puntual). Guardar la parte compartida una sola vez y referenciarla evita duplicarla miles de veces.</w:t>
+      </w:r>
+    </w:p>
+    <w:p>
+      <w:pPr>
+        <w:pStyle w:val="Ttulo3"/>
+        <w:spacing w:before="200" w:after="100" w:line="480" w:lineRule="auto"/>
+        <w:rPr>
+          <w:lang w:val="es-CO"/>
+        </w:rPr>
+      </w:pPr>
+      <w:bookmarkStart w:id="129" w:name="bm_flyweight_solucion"/>
+      <w:r>
+        <w:rPr>
+          <w:b/>
+          <w:bCs/>
+          <w:i/>
+          <w:iCs/>
+          <w:color w:val="000000"/>
+          <w:lang w:val="es-CO"/>
+        </w:rPr>
+        <w:t xml:space="preserve">Cómo lo Soluciona el Patrón</w:t>
+      </w:r>
+      <w:bookmarkEnd w:id="129"/>
+    </w:p>
+    <w:p>
+      <w:pPr>
+        <w:pStyle w:val="Prrafodelista"/>
+        <w:numPr>
+          <w:ilvl w:val="0"/>
+          <w:numId w:val="2"/>
+        </w:numPr>
+        <w:spacing w:line="480" w:lineRule="auto"/>
+        <w:jc w:val="both"/>
+        <w:rPr>
+          <w:lang w:val="es-CO"/>
+        </w:rPr>
+      </w:pPr>
+      <w:r>
+        <w:rPr>
+          <w:b/>
+          <w:bCs/>
+          <w:lang w:val="es-CO"/>
+        </w:rPr>
+        <w:t xml:space="preserve">Flyweight FichaTipoDispositivo. </w:t>
+      </w:r>
+      <w:r>
+        <w:rPr>
+          <w:lang w:val="es-CO"/>
+        </w:rPr>
+        <w:t xml:space="preserve">Clase inmutable (frozen=True) con el estado intrínseco compartido: tipo, nombre_amigable, categoria, unidad, umbral_min, umbral_max y descripcion.</w:t>
+      </w:r>
+    </w:p>
+    <w:p>
+      <w:pPr>
+        <w:pStyle w:val="Prrafodelista"/>
+        <w:numPr>
+          <w:ilvl w:val="0"/>
+          <w:numId w:val="2"/>
+        </w:numPr>
+        <w:spacing w:line="480" w:lineRule="auto"/>
+        <w:jc w:val="both"/>
+        <w:rPr>
+          <w:lang w:val="es-CO"/>
+        </w:rPr>
+      </w:pPr>
+      <w:r>
+        <w:rPr>
+          <w:b/>
+          <w:bCs/>
+          <w:lang w:val="es-CO"/>
+        </w:rPr>
+        <w:t xml:space="preserve">Flyweight Factory FabricaFichasDispositivo. </w:t>
+      </w:r>
+      <w:r>
+        <w:rPr>
+          <w:lang w:val="es-CO"/>
+        </w:rPr>
+        <w:t xml:space="preserve">Cachea una ficha por tipo y devuelve siempre la MISMA instancia (verificado con is, no solo con ==), sin importar cuántos dispositivos o cuántas veces se consulte.</w:t>
+      </w:r>
+    </w:p>
+    <w:p>
+      <w:pPr>
+        <w:pStyle w:val="Prrafodelista"/>
+        <w:numPr>
+          <w:ilvl w:val="0"/>
+          <w:numId w:val="2"/>
+        </w:numPr>
+        <w:spacing w:line="480" w:lineRule="auto"/>
+        <w:jc w:val="both"/>
+        <w:rPr>
+          <w:lang w:val="es-CO"/>
+        </w:rPr>
+      </w:pPr>
+      <w:r>
+        <w:rPr>
+          <w:b/>
+          <w:bCs/>
+          <w:lang w:val="es-CO"/>
+        </w:rPr>
+        <w:t xml:space="preserve">Estado extrínseco. </w:t>
+      </w:r>
+      <w:r>
+        <w:rPr>
+          <w:lang w:val="es-CO"/>
+        </w:rPr>
+        <w:t xml:space="preserve">El id, el usuario_id y las lecturas de cada dispositivo siguen viviendo en DispositivoIoT (Factory Method), sin tocarlo; el Flyweight no reemplaza esa clase, solo evita duplicar la parte que ya es igual para todos los dispositivos de un tipo.</w:t>
+      </w:r>
+    </w:p>
+    <w:p>
+      <w:pPr>
+        <w:pStyle w:val="Prrafodelista"/>
+        <w:numPr>
+          <w:ilvl w:val="0"/>
+          <w:numId w:val="2"/>
+        </w:numPr>
+        <w:spacing w:line="480" w:lineRule="auto"/>
+        <w:jc w:val="both"/>
+        <w:rPr>
+          <w:lang w:val="es-CO"/>
+        </w:rPr>
+      </w:pPr>
+      <w:r>
+        <w:rPr>
+          <w:b/>
+          <w:bCs/>
+          <w:lang w:val="es-CO"/>
+        </w:rPr>
+        <w:t xml:space="preserve">Uso real en la plataforma. </w:t>
+      </w:r>
+      <w:r>
+        <w:rPr>
+          <w:lang w:val="es-CO"/>
+        </w:rPr>
+        <w:t xml:space="preserve">PlataformaEnergia.ficha_tecnica(tipo) y catalogo_dispositivos() reutilizan factory_method.UMBRALES_IOT como única fuente de verdad para los umbrales, así el catálogo nunca se desincroniza de las fábricas concretas.</w:t>
+      </w:r>
+    </w:p>
+    <w:p>
+      <w:pPr>
+        <w:spacing w:before="200"/>
+        <w:rPr>
+          <w:lang w:val="es-CO"/>
+        </w:rPr>
+      </w:pPr>
+      <w:bookmarkStart w:id="130" w:name="bm_fig47"/>
+      <w:r>
+        <w:rPr>
+          <w:b/>
+          <w:bCs/>
+          <w:lang w:val="es-CO"/>
+        </w:rPr>
+        <w:t xml:space="preserve">Figura 47</w:t>
+      </w:r>
+      <w:bookmarkEnd w:id="130"/>
+    </w:p>
+    <w:p>
+      <w:pPr>
+        <w:rPr>
+          <w:lang w:val="es-CO"/>
+        </w:rPr>
+      </w:pPr>
+      <w:r>
+        <w:rPr>
+          <w:i/>
+          <w:iCs/>
+          <w:lang w:val="es-CO"/>
+        </w:rPr>
+        <w:t xml:space="preserve">Flyweight FichaTipoDispositivo y su fábrica FabricaFichasDispositivo en catalogo_dispositivos.py</w:t>
+      </w:r>
+    </w:p>
+    <w:p>
+      <w:pPr>
+        <w:ind w:left="720"/>
+        <w:rPr>
+          <w:lang w:val="es-CO"/>
+        </w:rPr>
+      </w:pPr>
+      <w:r>
+        <w:rPr>
+          <w:rFonts w:ascii="Courier New" w:eastAsia="Courier New" w:hAnsi="Courier New" w:cs="Courier New"/>
+          <w:sz w:val="20"/>
+          <w:szCs w:val="20"/>
+          <w:lang w:val="es-CO"/>
+        </w:rPr>
+        <w:t xml:space="preserve">@dataclass(frozen=True)</w:t>
+      </w:r>
+    </w:p>
+    <w:p>
+      <w:pPr>
+        <w:ind w:left="720"/>
+        <w:rPr>
+          <w:lang w:val="es-CO"/>
+        </w:rPr>
+      </w:pPr>
+      <w:r>
+        <w:rPr>
+          <w:rFonts w:ascii="Courier New" w:eastAsia="Courier New" w:hAnsi="Courier New" w:cs="Courier New"/>
+          <w:sz w:val="20"/>
+          <w:szCs w:val="20"/>
+          <w:lang w:val="es-CO"/>
+        </w:rPr>
+        <w:t xml:space="preserve">class FichaTipoDispositivo:</w:t>
+      </w:r>
+    </w:p>
+    <w:p>
+      <w:pPr>
+        <w:ind w:left="720"/>
+        <w:rPr>
+          <w:lang w:val="es-CO"/>
+        </w:rPr>
+      </w:pPr>
+      <w:r>
+        <w:rPr>
+          <w:rFonts w:ascii="Courier New" w:eastAsia="Courier New" w:hAnsi="Courier New" w:cs="Courier New"/>
+          <w:sz w:val="20"/>
+          <w:szCs w:val="20"/>
+          <w:lang w:val="es-CO"/>
+        </w:rPr>
+        <w:t xml:space="preserve">    tipo: str</w:t>
+      </w:r>
+    </w:p>
+    <w:p>
+      <w:pPr>
+        <w:ind w:left="720"/>
+        <w:rPr>
+          <w:lang w:val="es-CO"/>
+        </w:rPr>
+      </w:pPr>
+      <w:r>
+        <w:rPr>
+          <w:rFonts w:ascii="Courier New" w:eastAsia="Courier New" w:hAnsi="Courier New" w:cs="Courier New"/>
+          <w:sz w:val="20"/>
+          <w:szCs w:val="20"/>
+          <w:lang w:val="es-CO"/>
+        </w:rPr>
+        <w:t xml:space="preserve">    nombre_amigable: str</w:t>
+      </w:r>
+    </w:p>
+    <w:p>
+      <w:pPr>
+        <w:ind w:left="720"/>
+        <w:rPr>
+          <w:lang w:val="es-CO"/>
+        </w:rPr>
+      </w:pPr>
+      <w:r>
+        <w:rPr>
+          <w:rFonts w:ascii="Courier New" w:eastAsia="Courier New" w:hAnsi="Courier New" w:cs="Courier New"/>
+          <w:sz w:val="20"/>
+          <w:szCs w:val="20"/>
+          <w:lang w:val="es-CO"/>
+        </w:rPr>
+        <w:t xml:space="preserve">    categoria: str</w:t>
+      </w:r>
+    </w:p>
+    <w:p>
+      <w:pPr>
+        <w:ind w:left="720"/>
+        <w:rPr>
+          <w:lang w:val="es-CO"/>
+        </w:rPr>
+      </w:pPr>
+      <w:r>
+        <w:rPr>
+          <w:rFonts w:ascii="Courier New" w:eastAsia="Courier New" w:hAnsi="Courier New" w:cs="Courier New"/>
+          <w:sz w:val="20"/>
+          <w:szCs w:val="20"/>
+          <w:lang w:val="es-CO"/>
+        </w:rPr>
+        <w:t xml:space="preserve">    unidad: str</w:t>
+      </w:r>
+    </w:p>
+    <w:p>
+      <w:pPr>
+        <w:ind w:left="720"/>
+        <w:rPr>
+          <w:lang w:val="es-CO"/>
+        </w:rPr>
+      </w:pPr>
+      <w:r>
+        <w:rPr>
+          <w:rFonts w:ascii="Courier New" w:eastAsia="Courier New" w:hAnsi="Courier New" w:cs="Courier New"/>
+          <w:sz w:val="20"/>
+          <w:szCs w:val="20"/>
+          <w:lang w:val="es-CO"/>
+        </w:rPr>
+        <w:t xml:space="preserve">    umbral_min: float</w:t>
+      </w:r>
+    </w:p>
+    <w:p>
+      <w:pPr>
+        <w:ind w:left="720"/>
+        <w:rPr>
+          <w:lang w:val="es-CO"/>
+        </w:rPr>
+      </w:pPr>
+      <w:r>
+        <w:rPr>
+          <w:rFonts w:ascii="Courier New" w:eastAsia="Courier New" w:hAnsi="Courier New" w:cs="Courier New"/>
+          <w:sz w:val="20"/>
+          <w:szCs w:val="20"/>
+          <w:lang w:val="es-CO"/>
+        </w:rPr>
+        <w:t xml:space="preserve">    umbral_max: float</w:t>
+      </w:r>
+    </w:p>
+    <w:p>
+      <w:pPr>
+        <w:ind w:left="720"/>
+        <w:rPr>
+          <w:lang w:val="es-CO"/>
+        </w:rPr>
+      </w:pPr>
+      <w:r>
+        <w:rPr>
+          <w:rFonts w:ascii="Courier New" w:eastAsia="Courier New" w:hAnsi="Courier New" w:cs="Courier New"/>
+          <w:sz w:val="20"/>
+          <w:szCs w:val="20"/>
+          <w:lang w:val="es-CO"/>
+        </w:rPr>
+        <w:t xml:space="preserve">    descripcion: str</w:t>
+      </w:r>
+    </w:p>
+    <w:p>
+      <w:pPr>
+        <w:spacing w:before="120"/>
+        <w:ind w:left="720"/>
+        <w:rPr>
+          <w:lang w:val="es-CO"/>
+        </w:rPr>
+      </w:pPr>
+    </w:p>
+    <w:p>
+      <w:pPr>
+        <w:spacing w:before="120"/>
+        <w:ind w:left="720"/>
+        <w:rPr>
+          <w:lang w:val="es-CO"/>
+        </w:rPr>
+      </w:pPr>
+    </w:p>
+    <w:p>
+      <w:pPr>
+        <w:ind w:left="720"/>
+        <w:rPr>
+          <w:lang w:val="es-CO"/>
+        </w:rPr>
+      </w:pPr>
+      <w:r>
+        <w:rPr>
+          <w:rFonts w:ascii="Courier New" w:eastAsia="Courier New" w:hAnsi="Courier New" w:cs="Courier New"/>
+          <w:sz w:val="20"/>
+          <w:szCs w:val="20"/>
+          <w:lang w:val="es-CO"/>
+        </w:rPr>
+        <w:t xml:space="preserve">class FabricaFichasDispositivo:</w:t>
+      </w:r>
+    </w:p>
+    <w:p>
+      <w:pPr>
+        <w:ind w:left="720"/>
+        <w:rPr>
+          <w:lang w:val="es-CO"/>
+        </w:rPr>
+      </w:pPr>
+      <w:r>
+        <w:rPr>
+          <w:rFonts w:ascii="Courier New" w:eastAsia="Courier New" w:hAnsi="Courier New" w:cs="Courier New"/>
+          <w:sz w:val="20"/>
+          <w:szCs w:val="20"/>
+          <w:lang w:val="es-CO"/>
+        </w:rPr>
+        <w:t xml:space="preserve">    def __init__(self) -&gt; None:</w:t>
+      </w:r>
+    </w:p>
+    <w:p>
+      <w:pPr>
+        <w:ind w:left="720"/>
+        <w:rPr>
+          <w:lang w:val="es-CO"/>
+        </w:rPr>
+      </w:pPr>
+      <w:r>
+        <w:rPr>
+          <w:rFonts w:ascii="Courier New" w:eastAsia="Courier New" w:hAnsi="Courier New" w:cs="Courier New"/>
+          <w:sz w:val="20"/>
+          <w:szCs w:val="20"/>
+          <w:lang w:val="es-CO"/>
+        </w:rPr>
+        <w:t xml:space="preserve">        self._cache: dict[str, FichaTipoDispositivo] = {}</w:t>
+      </w:r>
+    </w:p>
+    <w:p>
+      <w:pPr>
+        <w:spacing w:before="120"/>
+        <w:ind w:left="720"/>
+        <w:rPr>
+          <w:lang w:val="es-CO"/>
+        </w:rPr>
+      </w:pPr>
+    </w:p>
+    <w:p>
+      <w:pPr>
+        <w:ind w:left="720"/>
+        <w:rPr>
+          <w:lang w:val="es-CO"/>
+        </w:rPr>
+      </w:pPr>
+      <w:r>
+        <w:rPr>
+          <w:rFonts w:ascii="Courier New" w:eastAsia="Courier New" w:hAnsi="Courier New" w:cs="Courier New"/>
+          <w:sz w:val="20"/>
+          <w:szCs w:val="20"/>
+          <w:lang w:val="es-CO"/>
+        </w:rPr>
+        <w:t xml:space="preserve">    def obtener_ficha(self, tipo: str) -&gt; FichaTipoDispositivo:</w:t>
+      </w:r>
+    </w:p>
+    <w:p>
+      <w:pPr>
+        <w:ind w:left="720"/>
+        <w:rPr>
+          <w:lang w:val="es-CO"/>
+        </w:rPr>
+      </w:pPr>
+      <w:r>
+        <w:rPr>
+          <w:rFonts w:ascii="Courier New" w:eastAsia="Courier New" w:hAnsi="Courier New" w:cs="Courier New"/>
+          <w:sz w:val="20"/>
+          <w:szCs w:val="20"/>
+          <w:lang w:val="es-CO"/>
+        </w:rPr>
+        <w:t xml:space="preserve">        if tipo not in self._cache:</w:t>
+      </w:r>
+    </w:p>
+    <w:p>
+      <w:pPr>
+        <w:ind w:left="720"/>
+        <w:rPr>
+          <w:lang w:val="es-CO"/>
+        </w:rPr>
+      </w:pPr>
+      <w:r>
+        <w:rPr>
+          <w:rFonts w:ascii="Courier New" w:eastAsia="Courier New" w:hAnsi="Courier New" w:cs="Courier New"/>
+          <w:sz w:val="20"/>
+          <w:szCs w:val="20"/>
+          <w:lang w:val="es-CO"/>
+        </w:rPr>
+        <w:t xml:space="preserve">            datos = _ESPECIFICACIONES[tipo]</w:t>
+      </w:r>
+    </w:p>
+    <w:p>
+      <w:pPr>
+        <w:ind w:left="720"/>
+        <w:rPr>
+          <w:lang w:val="es-CO"/>
+        </w:rPr>
+      </w:pPr>
+      <w:r>
+        <w:rPr>
+          <w:rFonts w:ascii="Courier New" w:eastAsia="Courier New" w:hAnsi="Courier New" w:cs="Courier New"/>
+          <w:sz w:val="20"/>
+          <w:szCs w:val="20"/>
+          <w:lang w:val="es-CO"/>
+        </w:rPr>
+        <w:t xml:space="preserve">            self._cache[tipo] = FichaTipoDispositivo(tipo=tipo, **datos)</w:t>
+      </w:r>
+    </w:p>
+    <w:p>
+      <w:pPr>
+        <w:ind w:left="720"/>
+        <w:rPr>
+          <w:lang w:val="es-CO"/>
+        </w:rPr>
+      </w:pPr>
+      <w:r>
+        <w:rPr>
+          <w:rFonts w:ascii="Courier New" w:eastAsia="Courier New" w:hAnsi="Courier New" w:cs="Courier New"/>
+          <w:sz w:val="20"/>
+          <w:szCs w:val="20"/>
+          <w:lang w:val="es-CO"/>
+        </w:rPr>
+        <w:t xml:space="preserve">        return self._cache[tipo]</w:t>
+      </w:r>
+    </w:p>
+    <w:p>
+      <w:pPr>
+        <w:spacing w:before="120"/>
+        <w:rPr>
+          <w:lang w:val="es-CO"/>
+        </w:rPr>
+      </w:pPr>
+      <w:r>
+        <w:rPr>
+          <w:i/>
+          <w:iCs/>
+          <w:lang w:val="es-CO"/>
+        </w:rPr>
+        <w:t xml:space="preserve">Nota. </w:t>
+      </w:r>
+      <w:r>
+        <w:rPr>
+          <w:lang w:val="es-CO"/>
+        </w:rPr>
+        <w:t xml:space="preserve">Extracto de plataforma-energia-app/backend/catalogo_dispositivos.py. obtener_ficha devuelve la misma instancia cacheada para un tipo ya consultado; solo se crea una FichaTipoDispositivo nueva la primera vez que se pide ese tipo.</w:t>
+      </w:r>
+    </w:p>
+    <w:p>
+      <w:pPr>
+        <w:pStyle w:val="Ttulo3"/>
+        <w:spacing w:before="200" w:after="100" w:line="480" w:lineRule="auto"/>
+        <w:rPr>
+          <w:lang w:val="es-CO"/>
+        </w:rPr>
+      </w:pPr>
+      <w:bookmarkStart w:id="131" w:name="bm_flyweight_gana"/>
+      <w:r>
+        <w:rPr>
+          <w:b/>
+          <w:bCs/>
+          <w:i/>
+          <w:iCs/>
+          <w:color w:val="000000"/>
+          <w:lang w:val="es-CO"/>
+        </w:rPr>
+        <w:t xml:space="preserve">Qué Gana la Plataforma con Esto</w:t>
+      </w:r>
+      <w:bookmarkEnd w:id="131"/>
+    </w:p>
+    <w:p>
+      <w:pPr>
+        <w:pStyle w:val="Prrafodelista"/>
+        <w:numPr>
+          <w:ilvl w:val="0"/>
+          <w:numId w:val="2"/>
+        </w:numPr>
+        <w:spacing w:line="480" w:lineRule="auto"/>
+        <w:jc w:val="both"/>
+        <w:rPr>
+          <w:lang w:val="es-CO"/>
+        </w:rPr>
+      </w:pPr>
+      <w:r>
+        <w:rPr>
+          <w:b/>
+          <w:bCs/>
+          <w:lang w:val="es-CO"/>
+        </w:rPr>
+        <w:t xml:space="preserve">Menos memoria duplicada. </w:t>
+      </w:r>
+      <w:r>
+        <w:rPr>
+          <w:lang w:val="es-CO"/>
+        </w:rPr>
+        <w:t xml:space="preserve">El catálogo crece con el número de tipos (3 hoy), no con el número de dispositivos conectados.</w:t>
+      </w:r>
+    </w:p>
+    <w:p>
+      <w:pPr>
+        <w:pStyle w:val="Prrafodelista"/>
+        <w:numPr>
+          <w:ilvl w:val="0"/>
+          <w:numId w:val="2"/>
+        </w:numPr>
+        <w:spacing w:line="480" w:lineRule="auto"/>
+        <w:jc w:val="both"/>
+        <w:rPr>
+          <w:lang w:val="es-CO"/>
+        </w:rPr>
+      </w:pPr>
+      <w:r>
+        <w:rPr>
+          <w:b/>
+          <w:bCs/>
+          <w:lang w:val="es-CO"/>
+        </w:rPr>
+        <w:t xml:space="preserve">Una sola fuente de verdad por tipo. </w:t>
+      </w:r>
+      <w:r>
+        <w:rPr>
+          <w:lang w:val="es-CO"/>
+        </w:rPr>
+        <w:t xml:space="preserve">Si cambia la descripción o la categoría de panel_solar, cambia para todos los dispositivos de ese tipo a la vez, porque todos apuntan a la misma ficha.</w:t>
+      </w:r>
+    </w:p>
+    <w:p>
+      <w:pPr>
+        <w:pStyle w:val="Prrafodelista"/>
+        <w:numPr>
+          <w:ilvl w:val="0"/>
+          <w:numId w:val="2"/>
+        </w:numPr>
+        <w:spacing w:line="480" w:lineRule="auto"/>
+        <w:jc w:val="both"/>
+        <w:rPr>
+          <w:lang w:val="es-CO"/>
+        </w:rPr>
+      </w:pPr>
+      <w:r>
+        <w:rPr>
+          <w:b/>
+          <w:bCs/>
+          <w:lang w:val="es-CO"/>
+        </w:rPr>
+        <w:t xml:space="preserve">No compite con Factory Method (Semana 3). </w:t>
+      </w:r>
+      <w:r>
+        <w:rPr>
+          <w:lang w:val="es-CO"/>
+        </w:rPr>
+        <w:t xml:space="preserve">Factory Method decide qué clase de dispositivo crear y construye el objeto completo con su estado extrínseco; Flyweight solo evita duplicar la parte de ese objeto que es igual para todos los de su tipo.</w:t>
+      </w:r>
+    </w:p>
+    <w:p>
+      <w:pPr>
+        <w:pStyle w:val="Prrafodelista"/>
+        <w:numPr>
+          <w:ilvl w:val="0"/>
+          <w:numId w:val="2"/>
+        </w:numPr>
+        <w:spacing w:line="480" w:lineRule="auto"/>
+        <w:jc w:val="both"/>
+        <w:rPr>
+          <w:lang w:val="es-CO"/>
+        </w:rPr>
+      </w:pPr>
+      <w:r>
+        <w:rPr>
+          <w:b/>
+          <w:bCs/>
+          <w:lang w:val="es-CO"/>
+        </w:rPr>
+        <w:t xml:space="preserve">Prueba de fuego. </w:t>
+      </w:r>
+      <w:r>
+        <w:rPr>
+          <w:lang w:val="es-CO"/>
+        </w:rPr>
+        <w:t xml:space="preserve">test_muchos_dispositivos_del_mismo_tipo_comparten_una_sola_ficha crea 50 ids distintos del mismo tipo y verifica que la fábrica solo creó una ficha (fichas_creadas == 1).</w:t>
+      </w:r>
+    </w:p>
+    <w:p>
+      <w:pPr>
+        <w:spacing w:before="200"/>
+        <w:rPr>
+          <w:lang w:val="es-CO"/>
+        </w:rPr>
+      </w:pPr>
+      <w:bookmarkStart w:id="132" w:name="bm_fig48"/>
+      <w:r>
+        <w:rPr>
+          <w:b/>
+          <w:bCs/>
+          <w:lang w:val="es-CO"/>
+        </w:rPr>
+        <w:t xml:space="preserve">Figura 48</w:t>
+      </w:r>
+      <w:bookmarkEnd w:id="132"/>
+    </w:p>
+    <w:p>
+      <w:pPr>
+        <w:rPr>
+          <w:lang w:val="es-CO"/>
+        </w:rPr>
+      </w:pPr>
+      <w:r>
+        <w:rPr>
+          <w:i/>
+          <w:iCs/>
+          <w:lang w:val="es-CO"/>
+        </w:rPr>
+        <w:t xml:space="preserve">Diagrama UML de clases del patrón Flyweight aplicado al catálogo de dispositivos IoT</w:t>
+      </w:r>
+    </w:p>
+    <w:p>
+      <w:pPr>
+        <w:ind w:firstLine="720"/>
+        <w:jc w:val="both"/>
+      </w:pPr>
+      <w:r>
+        <w:drawing>
+          <wp:inline xmlns:a="http://schemas.openxmlformats.org/drawingml/2006/main" xmlns:pic="http://schemas.openxmlformats.org/drawingml/2006/picture">
+            <wp:extent cx="5943600" cy="3373244"/>
+            <wp:docPr id="2105890770" name="Picture 2105890770"/>
+            <wp:cNvGraphicFramePr>
+              <a:graphicFrameLocks noChangeAspect="1"/>
+            </wp:cNvGraphicFramePr>
+            <a:graphic>
+              <a:graphicData uri="http://schemas.openxmlformats.org/drawingml/2006/picture">
+                <pic:pic>
+                  <pic:nvPicPr>
+                    <pic:cNvPr id="0" name="UML_Flyweight.png"/>
+                    <pic:cNvPicPr/>
+                  </pic:nvPicPr>
+                  <pic:blipFill>
+                    <a:blip r:embed="rId48"/>
+                    <a:stretch>
+                      <a:fillRect/>
+                    </a:stretch>
+                  </pic:blipFill>
+                  <pic:spPr>
+                    <a:xfrm>
+                      <a:off x="0" y="0"/>
+                      <a:ext cx="5943600" cy="3373244"/>
+                    </a:xfrm>
+                    <a:prstGeom prst="rect"/>
+                  </pic:spPr>
+                </pic:pic>
+              </a:graphicData>
+            </a:graphic>
+          </wp:inline>
+        </w:drawing>
+      </w:r>
+    </w:p>
+    <w:p>
+      <w:pPr>
+        <w:spacing w:before="120"/>
+        <w:rPr>
+          <w:lang w:val="es-CO"/>
+        </w:rPr>
+      </w:pPr>
+      <w:r>
+        <w:rPr>
+          <w:i/>
+          <w:iCs/>
+          <w:lang w:val="es-CO"/>
+        </w:rPr>
+        <w:t xml:space="preserve">Nota. </w:t>
+      </w:r>
+      <w:r>
+        <w:rPr>
+          <w:lang w:val="es-CO"/>
+        </w:rPr>
+        <w:t xml:space="preserve">Diagrama generado a partir de Documentacion/Semana 10/flyweight.py, mostrando cómo tres dispositivos del mismo tipo (estado extrínseco) referencian la misma instancia de FichaTipoDispositivo (estado intrínseco) a través de la fábrica.</w:t>
+      </w:r>
+    </w:p>
+    <w:p>
+      <w:pPr>
+        <w:pStyle w:val="Ttulo3"/>
+        <w:spacing w:before="200" w:after="100" w:line="480" w:lineRule="auto"/>
+        <w:rPr>
+          <w:lang w:val="es-CO"/>
+        </w:rPr>
+      </w:pPr>
+      <w:bookmarkStart w:id="133" w:name="bm_flyweight_justificacion"/>
+      <w:r>
+        <w:rPr>
+          <w:b/>
+          <w:bCs/>
+          <w:i/>
+          <w:iCs/>
+          <w:color w:val="000000"/>
+          <w:lang w:val="es-CO"/>
+        </w:rPr>
+        <w:t xml:space="preserve">Justificación de su Uso en el Proyecto</w:t>
+      </w:r>
+      <w:bookmarkEnd w:id="133"/>
+    </w:p>
+    <w:p>
+      <w:pPr>
+        <w:ind w:firstLine="720"/>
+        <w:jc w:val="both"/>
+        <w:rPr>
+          <w:lang w:val="es-CO"/>
+        </w:rPr>
+      </w:pPr>
+      <w:r>
+        <w:rPr>
+          <w:lang w:val="es-CO"/>
+        </w:rPr>
+        <w:t xml:space="preserve">El patrón Flyweight resulta pertinente para este proyecto porque la Contextualización del Proyecto plantea una plataforma que puede crecer hacia redes eléctricas inteligentes con muchos hogares y dispositivos, y cada dispositivo de un mismo tipo comparte exactamente la misma información descriptiva. Separar esa parte compartida evita que el costo de memoria del catálogo crezca con cada dispositivo nuevo.</w:t>
+      </w:r>
+    </w:p>
+    <w:p>
+      <w:pPr>
+        <w:pStyle w:val="Ttulo3"/>
+        <w:spacing w:before="200" w:after="100" w:line="480" w:lineRule="auto"/>
+        <w:rPr>
+          <w:lang w:val="es-CO"/>
+        </w:rPr>
+      </w:pPr>
+      <w:bookmarkStart w:id="134" w:name="bm_flyweight_evaluacion"/>
+      <w:r>
+        <w:rPr>
+          <w:b/>
+          <w:bCs/>
+          <w:i/>
+          <w:iCs/>
+          <w:color w:val="000000"/>
+          <w:lang w:val="es-CO"/>
+        </w:rPr>
+        <w:t xml:space="preserve">Evaluación: ¿Sirve este patrón para el proyecto?</w:t>
+      </w:r>
+      <w:bookmarkEnd w:id="134"/>
+    </w:p>
+    <w:p>
+      <w:pPr>
+        <w:ind w:firstLine="720"/>
+        <w:jc w:val="both"/>
+        <w:rPr>
+          <w:lang w:val="es-CO"/>
+        </w:rPr>
+      </w:pPr>
+      <w:r>
+        <w:rPr>
+          <w:b/>
+          <w:bCs/>
+          <w:lang w:val="es-CO"/>
+        </w:rPr>
+        <w:t xml:space="preserve">Veredicto: sí sirve. </w:t>
+      </w:r>
+      <w:r>
+        <w:rPr>
+          <w:lang w:val="es-CO"/>
+        </w:rPr>
+        <w:t xml:space="preserve">El patrón Flyweight sí sirve para el proyecto porque el dominio tiene pocos tipos de dispositivo con mucha información compartida por tipo, exactamente el escenario que el patrón resuelve. Se integró sin modificar la lógica existente: DispositivoIoT y las fábricas concretas de Factory Method siguen igual, y los casos de los patrones anteriores siguen pasando sin cambios.</w:t>
+      </w:r>
+    </w:p>
+    <w:p>
+      <w:pPr>
+        <w:ind w:firstLine="720"/>
+        <w:jc w:val="both"/>
+        <w:rPr>
+          <w:lang w:val="es-CO"/>
+        </w:rPr>
+      </w:pPr>
+      <w:r>
+        <w:rPr>
+          <w:lang w:val="es-CO"/>
+        </w:rPr>
+        <w:t xml:space="preserve">Matiz a tener en cuenta: hoy la plataforma solo tiene 3 tipos de dispositivo, así que el ahorro de memoria real es modesto. Como se advirtió en clase, el patrón se justifica más cuando el número de objetos crece mucho (miles de dispositivos); con pocos tipos y pocos objetos, su valor es sobre todo evitar una fuente de verdad duplicada, no el ahorro de memoria en sí.</w:t>
+      </w:r>
+    </w:p>
+    <w:p>
+      <w:pPr>
+        <w:pStyle w:val="Ttulo3"/>
+        <w:spacing w:before="200" w:after="100" w:line="480" w:lineRule="auto"/>
+        <w:rPr>
+          <w:lang w:val="es-CO"/>
+        </w:rPr>
+      </w:pPr>
+      <w:bookmarkStart w:id="135" w:name="bm_flyweight_validacion"/>
+      <w:r>
+        <w:rPr>
+          <w:b/>
+          <w:bCs/>
+          <w:i/>
+          <w:iCs/>
+          <w:color w:val="000000"/>
+          <w:lang w:val="es-CO"/>
+        </w:rPr>
+        <w:t xml:space="preserve">Validación del Patrón</w:t>
+      </w:r>
+      <w:bookmarkEnd w:id="135"/>
+    </w:p>
+    <w:p>
+      <w:pPr>
+        <w:ind w:firstLine="720"/>
+        <w:jc w:val="both"/>
+        <w:rPr>
+          <w:lang w:val="es-CO"/>
+        </w:rPr>
+      </w:pPr>
+      <w:r>
+        <w:rPr>
+          <w:lang w:val="es-CO"/>
+        </w:rPr>
+        <w:t xml:space="preserve">La validación del patrón Flyweight se realizó mediante pruebas unitarias automatizadas con pytest, que verifican que dos consultas del mismo tipo devuelven la misma instancia, que tipos distintos devuelven instancias distintas, que la ficha trae los umbrales correctos y es inmutable, que un tipo no soportado lanza ValueError con los disponibles, y que cada fábrica mantiene su propia caché. Como se observa en la Figura 49, la suite Documentacion/Semana 10/test_flyweight.py ejecutó 9 casos, todos superados, y el conjunto completo de pruebas del proyecto —los doce patrones— pasa sin errores (228 casos en total).</w:t>
+      </w:r>
+    </w:p>
+    <w:p>
+      <w:pPr>
+        <w:spacing w:before="200"/>
+        <w:rPr>
+          <w:lang w:val="es-CO"/>
+        </w:rPr>
+      </w:pPr>
+      <w:bookmarkStart w:id="136" w:name="bm_fig49"/>
+      <w:r>
+        <w:rPr>
+          <w:b/>
+          <w:bCs/>
+          <w:lang w:val="es-CO"/>
+        </w:rPr>
+        <w:t xml:space="preserve">Figura 49</w:t>
+      </w:r>
+      <w:bookmarkEnd w:id="136"/>
+    </w:p>
+    <w:p>
+      <w:pPr>
+        <w:rPr>
+          <w:lang w:val="es-CO"/>
+        </w:rPr>
+      </w:pPr>
+      <w:r>
+        <w:rPr>
+          <w:i/>
+          <w:iCs/>
+          <w:lang w:val="es-CO"/>
+        </w:rPr>
+        <w:t xml:space="preserve">Resultados de la ejecución de las pruebas unitarias del patrón Flyweight</w:t>
+      </w:r>
+    </w:p>
+    <w:p>
+      <w:pPr>
+        <w:ind w:firstLine="720"/>
+        <w:jc w:val="both"/>
+      </w:pPr>
+      <w:r>
+        <w:drawing>
+          <wp:inline xmlns:a="http://schemas.openxmlformats.org/drawingml/2006/main" xmlns:pic="http://schemas.openxmlformats.org/drawingml/2006/picture">
+            <wp:extent cx="5943600" cy="2022773"/>
+            <wp:docPr id="2105890770" name="Picture 2105890770"/>
+            <wp:cNvGraphicFramePr>
+              <a:graphicFrameLocks noChangeAspect="1"/>
+            </wp:cNvGraphicFramePr>
+            <a:graphic>
+              <a:graphicData uri="http://schemas.openxmlformats.org/drawingml/2006/picture">
+                <pic:pic>
+                  <pic:nvPicPr>
+                    <pic:cNvPr id="0" name="pytest_flyweight.png"/>
+                    <pic:cNvPicPr/>
+                  </pic:nvPicPr>
+                  <pic:blipFill>
+                    <a:blip r:embed="rId49"/>
+                    <a:stretch>
+                      <a:fillRect/>
+                    </a:stretch>
+                  </pic:blipFill>
+                  <pic:spPr>
+                    <a:xfrm>
+                      <a:off x="0" y="0"/>
+                      <a:ext cx="5943600" cy="2022773"/>
+                    </a:xfrm>
+                    <a:prstGeom prst="rect"/>
+                  </pic:spPr>
+                </pic:pic>
+              </a:graphicData>
+            </a:graphic>
+          </wp:inline>
+        </w:drawing>
+      </w:r>
+    </w:p>
+    <w:p>
+      <w:pPr>
+        <w:spacing w:before="120"/>
+        <w:rPr>
+          <w:lang w:val="es-CO"/>
+        </w:rPr>
+      </w:pPr>
+      <w:r>
+        <w:rPr>
+          <w:i/>
+          <w:iCs/>
+          <w:lang w:val="es-CO"/>
+        </w:rPr>
+        <w:t xml:space="preserve">Nota. </w:t>
+      </w:r>
+      <w:r>
+        <w:rPr>
+          <w:lang w:val="es-CO"/>
+        </w:rPr>
+        <w:t xml:space="preserve">Salida de consola de la ejecución de pytest sobre Documentacion/Semana 10/test_flyweight.py, mostrando la aprobación de los 9 casos (9 passed), agrupados por comportamiento: identidad compartida, contenido de la ficha y registro de tipos.</w:t>
+      </w:r>
+    </w:p>
+    <w:p>
+      <w:pPr>
+        <w:pStyle w:val="Ttulo2"/>
+        <w:spacing w:before="240" w:after="120" w:line="480" w:lineRule="auto"/>
+        <w:rPr>
+          <w:lang w:val="es-CO"/>
+        </w:rPr>
+      </w:pPr>
+      <w:bookmarkStart w:id="137" w:name="bm_proxy"/>
       <w:r>
         <w:rPr>
           <w:b/>
@@ -32930,6 +34924,1133 @@
           <w:color w:val="000000"/>
           <w:sz w:val="24"/>
           <w:szCs w:val="24"/>
+          <w:lang w:val="es-CO"/>
+        </w:rPr>
+        <w:t xml:space="preserve">Aplicación del Patrón de Diseño Proxy en el Acceso al Reporte Energético</w:t>
+      </w:r>
+      <w:bookmarkEnd w:id="137"/>
+    </w:p>
+    <w:p>
+      <w:pPr>
+        <w:ind w:firstLine="720"/>
+        <w:jc w:val="both"/>
+        <w:rPr>
+          <w:lang w:val="es-CO"/>
+        </w:rPr>
+      </w:pPr>
+      <w:r>
+        <w:rPr>
+          <w:lang w:val="es-CO"/>
+        </w:rPr>
+        <w:t xml:space="preserve">El patrón Proxy incorporado a la plataforma protege, cachea y audita el acceso al reporte energético del usuario, sin modificar el DirectorReportes (Builder, Semana 5) que arma el reporte paso a paso. Este módulo forma parte de la lógica de dominio del backend (reportes_proxy.py, clase ReporteProxy) y se expone en la API FastAPI (main.py) a través de GET /reportes/seguro/{usuario_id} y GET /reportes/auditoria; la implementación educativa completa se encuentra en Documentacion/Semana 10/proxy.py.</w:t>
+      </w:r>
+    </w:p>
+    <w:p>
+      <w:pPr>
+        <w:pStyle w:val="Ttulo3"/>
+        <w:spacing w:before="200" w:after="100" w:line="480" w:lineRule="auto"/>
+        <w:rPr>
+          <w:lang w:val="es-CO"/>
+        </w:rPr>
+      </w:pPr>
+      <w:bookmarkStart w:id="138" w:name="bm_proxy_problema"/>
+      <w:r>
+        <w:rPr>
+          <w:b/>
+          <w:bCs/>
+          <w:i/>
+          <w:iCs/>
+          <w:color w:val="000000"/>
+          <w:lang w:val="es-CO"/>
+        </w:rPr>
+        <w:t xml:space="preserve">El Problema que Resuelve</w:t>
+      </w:r>
+      <w:bookmarkEnd w:id="138"/>
+    </w:p>
+    <w:p>
+      <w:pPr>
+        <w:ind w:firstLine="720"/>
+        <w:jc w:val="both"/>
+        <w:rPr>
+          <w:lang w:val="es-CO"/>
+        </w:rPr>
+      </w:pPr>
+      <w:r>
+        <w:rPr>
+          <w:lang w:val="es-CO"/>
+        </w:rPr>
+        <w:t xml:space="preserve">PlataformaEnergia.generar_reporte (Builder, Semana 5 + Abstract Factory, Semana 4) recolecta lecturas, calcula balances y arma varias secciones; no es gratis repetirlo en cada clic. Además, nada en ese método evita que un cliente de la API pida el reporte de OTRO usuario, ni deja rastro de quién pidió qué.</w:t>
+      </w:r>
+    </w:p>
+    <w:p>
+      <w:pPr>
+        <w:ind w:firstLine="720"/>
+        <w:jc w:val="both"/>
+        <w:rPr>
+          <w:lang w:val="es-CO"/>
+        </w:rPr>
+      </w:pPr>
+      <w:r>
+        <w:rPr>
+          <w:lang w:val="es-CO"/>
+        </w:rPr>
+        <w:t xml:space="preserve">Resolver eso dentro del propio Builder mezclaría responsabilidades que no le corresponden: construir el reporte es una cosa, decidir quién puede pedirlo, cuándo conviene reutilizar uno reciente y qué queda auditado es otra, muy distinta.</w:t>
+      </w:r>
+    </w:p>
+    <w:p>
+      <w:pPr>
+        <w:pStyle w:val="Ttulo3"/>
+        <w:spacing w:before="200" w:after="100" w:line="480" w:lineRule="auto"/>
+        <w:rPr>
+          <w:lang w:val="es-CO"/>
+        </w:rPr>
+      </w:pPr>
+      <w:bookmarkStart w:id="139" w:name="bm_proxy_solucion"/>
+      <w:r>
+        <w:rPr>
+          <w:b/>
+          <w:bCs/>
+          <w:i/>
+          <w:iCs/>
+          <w:color w:val="000000"/>
+          <w:lang w:val="es-CO"/>
+        </w:rPr>
+        <w:t xml:space="preserve">Cómo lo Soluciona el Patrón</w:t>
+      </w:r>
+      <w:bookmarkEnd w:id="139"/>
+    </w:p>
+    <w:p>
+      <w:pPr>
+        <w:pStyle w:val="Prrafodelista"/>
+        <w:numPr>
+          <w:ilvl w:val="0"/>
+          <w:numId w:val="2"/>
+        </w:numPr>
+        <w:spacing w:line="480" w:lineRule="auto"/>
+        <w:jc w:val="both"/>
+        <w:rPr>
+          <w:lang w:val="es-CO"/>
+        </w:rPr>
+      </w:pPr>
+      <w:r>
+        <w:rPr>
+          <w:b/>
+          <w:bCs/>
+          <w:lang w:val="es-CO"/>
+        </w:rPr>
+        <w:t xml:space="preserve">Subject GeneradorReportes. </w:t>
+      </w:r>
+      <w:r>
+        <w:rPr>
+          <w:lang w:val="es-CO"/>
+        </w:rPr>
+        <w:t xml:space="preserve">Interfaz común (generar(solicitante_id, usuario_id, formato)) que implementan tanto el objeto real como el proxy, para que el cliente no distinga uno de otro.</w:t>
+      </w:r>
+    </w:p>
+    <w:p>
+      <w:pPr>
+        <w:pStyle w:val="Prrafodelista"/>
+        <w:numPr>
+          <w:ilvl w:val="0"/>
+          <w:numId w:val="2"/>
+        </w:numPr>
+        <w:spacing w:line="480" w:lineRule="auto"/>
+        <w:jc w:val="both"/>
+        <w:rPr>
+          <w:lang w:val="es-CO"/>
+        </w:rPr>
+      </w:pPr>
+      <w:r>
+        <w:rPr>
+          <w:b/>
+          <w:bCs/>
+          <w:lang w:val="es-CO"/>
+        </w:rPr>
+        <w:t xml:space="preserve">RealSubject GeneradorReportesReal. </w:t>
+      </w:r>
+      <w:r>
+        <w:rPr>
+          <w:lang w:val="es-CO"/>
+        </w:rPr>
+        <w:t xml:space="preserve">Envuelve PlataformaEnergia.generar_reporte sin modificarlo.</w:t>
+      </w:r>
+    </w:p>
+    <w:p>
+      <w:pPr>
+        <w:pStyle w:val="Prrafodelista"/>
+        <w:numPr>
+          <w:ilvl w:val="0"/>
+          <w:numId w:val="2"/>
+        </w:numPr>
+        <w:spacing w:line="480" w:lineRule="auto"/>
+        <w:jc w:val="both"/>
+        <w:rPr>
+          <w:lang w:val="es-CO"/>
+        </w:rPr>
+      </w:pPr>
+      <w:r>
+        <w:rPr>
+          <w:b/>
+          <w:bCs/>
+          <w:lang w:val="es-CO"/>
+        </w:rPr>
+        <w:t xml:space="preserve">Proxy ReporteProxy. </w:t>
+      </w:r>
+      <w:r>
+        <w:rPr>
+          <w:lang w:val="es-CO"/>
+        </w:rPr>
+        <w:t xml:space="preserve">Antes de delegar al objeto real resuelve tres responsabilidades que no son del Builder: Protection (rechaza si solicitante_id distinto de usuario_id), Caching (reutiliza un reporte reciente del mismo formato) y Logging (registra cada intento en auditoria: generado, cache o denegado).</w:t>
+      </w:r>
+    </w:p>
+    <w:p>
+      <w:pPr>
+        <w:pStyle w:val="Prrafodelista"/>
+        <w:numPr>
+          <w:ilvl w:val="0"/>
+          <w:numId w:val="2"/>
+        </w:numPr>
+        <w:spacing w:line="480" w:lineRule="auto"/>
+        <w:jc w:val="both"/>
+        <w:rPr>
+          <w:lang w:val="es-CO"/>
+        </w:rPr>
+      </w:pPr>
+      <w:r>
+        <w:rPr>
+          <w:b/>
+          <w:bCs/>
+          <w:lang w:val="es-CO"/>
+        </w:rPr>
+        <w:t xml:space="preserve">Uso real. </w:t>
+      </w:r>
+      <w:r>
+        <w:rPr>
+          <w:lang w:val="es-CO"/>
+        </w:rPr>
+        <w:t xml:space="preserve">main.py instancia ReporteProxy(GeneradorReportesReal(plataforma)) una sola vez y lo expone en GET /reportes/seguro/{usuario_id} (403 si el solicitante no es el dueño) y GET /reportes/auditoria; el endpoint original POST /reportes/generar sigue existiendo sin cambios.</w:t>
+      </w:r>
+    </w:p>
+    <w:p>
+      <w:pPr>
+        <w:spacing w:before="200"/>
+        <w:rPr>
+          <w:lang w:val="es-CO"/>
+        </w:rPr>
+      </w:pPr>
+      <w:bookmarkStart w:id="140" w:name="bm_fig50"/>
+      <w:r>
+        <w:rPr>
+          <w:b/>
+          <w:bCs/>
+          <w:lang w:val="es-CO"/>
+        </w:rPr>
+        <w:t xml:space="preserve">Figura 50</w:t>
+      </w:r>
+      <w:bookmarkEnd w:id="140"/>
+    </w:p>
+    <w:p>
+      <w:pPr>
+        <w:rPr>
+          <w:lang w:val="es-CO"/>
+        </w:rPr>
+      </w:pPr>
+      <w:r>
+        <w:rPr>
+          <w:i/>
+          <w:iCs/>
+          <w:lang w:val="es-CO"/>
+        </w:rPr>
+        <w:t xml:space="preserve">Proxy ReporteProxy protegiendo, cacheando y auditando GeneradorReportesReal en reportes_proxy.py</w:t>
+      </w:r>
+    </w:p>
+    <w:p>
+      <w:pPr>
+        <w:ind w:left="720"/>
+        <w:rPr>
+          <w:lang w:val="es-CO"/>
+        </w:rPr>
+      </w:pPr>
+      <w:r>
+        <w:rPr>
+          <w:rFonts w:ascii="Courier New" w:eastAsia="Courier New" w:hAnsi="Courier New" w:cs="Courier New"/>
+          <w:sz w:val="20"/>
+          <w:szCs w:val="20"/>
+          <w:lang w:val="es-CO"/>
+        </w:rPr>
+        <w:t xml:space="preserve">class ReporteProxy(GeneradorReportes):</w:t>
+      </w:r>
+    </w:p>
+    <w:p>
+      <w:pPr>
+        <w:ind w:left="720"/>
+        <w:rPr>
+          <w:lang w:val="es-CO"/>
+        </w:rPr>
+      </w:pPr>
+      <w:r>
+        <w:rPr>
+          <w:rFonts w:ascii="Courier New" w:eastAsia="Courier New" w:hAnsi="Courier New" w:cs="Courier New"/>
+          <w:sz w:val="20"/>
+          <w:szCs w:val="20"/>
+          <w:lang w:val="es-CO"/>
+        </w:rPr>
+        <w:t xml:space="preserve">    def generar(self, solicitante_id, usuario_id, formato="resumen") -&gt; dict:</w:t>
+      </w:r>
+    </w:p>
+    <w:p>
+      <w:pPr>
+        <w:ind w:left="720"/>
+        <w:rPr>
+          <w:lang w:val="es-CO"/>
+        </w:rPr>
+      </w:pPr>
+      <w:r>
+        <w:rPr>
+          <w:rFonts w:ascii="Courier New" w:eastAsia="Courier New" w:hAnsi="Courier New" w:cs="Courier New"/>
+          <w:sz w:val="20"/>
+          <w:szCs w:val="20"/>
+          <w:lang w:val="es-CO"/>
+        </w:rPr>
+        <w:t xml:space="preserve">        ahora = time.time()</w:t>
+      </w:r>
+    </w:p>
+    <w:p>
+      <w:pPr>
+        <w:spacing w:before="120"/>
+        <w:ind w:left="720"/>
+        <w:rPr>
+          <w:lang w:val="es-CO"/>
+        </w:rPr>
+      </w:pPr>
+    </w:p>
+    <w:p>
+      <w:pPr>
+        <w:ind w:left="720"/>
+        <w:rPr>
+          <w:lang w:val="es-CO"/>
+        </w:rPr>
+      </w:pPr>
+      <w:r>
+        <w:rPr>
+          <w:rFonts w:ascii="Courier New" w:eastAsia="Courier New" w:hAnsi="Courier New" w:cs="Courier New"/>
+          <w:sz w:val="20"/>
+          <w:szCs w:val="20"/>
+          <w:lang w:val="es-CO"/>
+        </w:rPr>
+        <w:t xml:space="preserve">        if solicitante_id != usuario_id:</w:t>
+      </w:r>
+    </w:p>
+    <w:p>
+      <w:pPr>
+        <w:ind w:left="720"/>
+        <w:rPr>
+          <w:lang w:val="es-CO"/>
+        </w:rPr>
+      </w:pPr>
+      <w:r>
+        <w:rPr>
+          <w:rFonts w:ascii="Courier New" w:eastAsia="Courier New" w:hAnsi="Courier New" w:cs="Courier New"/>
+          <w:sz w:val="20"/>
+          <w:szCs w:val="20"/>
+          <w:lang w:val="es-CO"/>
+        </w:rPr>
+        <w:t xml:space="preserve">            self._registrar(solicitante_id, usuario_id, formato, "denegado")</w:t>
+      </w:r>
+    </w:p>
+    <w:p>
+      <w:pPr>
+        <w:ind w:left="720"/>
+        <w:rPr>
+          <w:lang w:val="es-CO"/>
+        </w:rPr>
+      </w:pPr>
+      <w:r>
+        <w:rPr>
+          <w:rFonts w:ascii="Courier New" w:eastAsia="Courier New" w:hAnsi="Courier New" w:cs="Courier New"/>
+          <w:sz w:val="20"/>
+          <w:szCs w:val="20"/>
+          <w:lang w:val="es-CO"/>
+        </w:rPr>
+        <w:t xml:space="preserve">            raise PermissionError(</w:t>
+      </w:r>
+    </w:p>
+    <w:p>
+      <w:pPr>
+        <w:ind w:left="720"/>
+        <w:rPr>
+          <w:lang w:val="es-CO"/>
+        </w:rPr>
+      </w:pPr>
+      <w:r>
+        <w:rPr>
+          <w:rFonts w:ascii="Courier New" w:eastAsia="Courier New" w:hAnsi="Courier New" w:cs="Courier New"/>
+          <w:sz w:val="20"/>
+          <w:szCs w:val="20"/>
+          <w:lang w:val="es-CO"/>
+        </w:rPr>
+        <w:t xml:space="preserve">                f"'{solicitante_id}' no puede solicitar el reporte de '{usuario_id}'"</w:t>
+      </w:r>
+    </w:p>
+    <w:p>
+      <w:pPr>
+        <w:ind w:left="720"/>
+        <w:rPr>
+          <w:lang w:val="es-CO"/>
+        </w:rPr>
+      </w:pPr>
+      <w:r>
+        <w:rPr>
+          <w:rFonts w:ascii="Courier New" w:eastAsia="Courier New" w:hAnsi="Courier New" w:cs="Courier New"/>
+          <w:sz w:val="20"/>
+          <w:szCs w:val="20"/>
+          <w:lang w:val="es-CO"/>
+        </w:rPr>
+        <w:t xml:space="preserve">            )</w:t>
+      </w:r>
+    </w:p>
+    <w:p>
+      <w:pPr>
+        <w:spacing w:before="120"/>
+        <w:ind w:left="720"/>
+        <w:rPr>
+          <w:lang w:val="es-CO"/>
+        </w:rPr>
+      </w:pPr>
+    </w:p>
+    <w:p>
+      <w:pPr>
+        <w:ind w:left="720"/>
+        <w:rPr>
+          <w:lang w:val="es-CO"/>
+        </w:rPr>
+      </w:pPr>
+      <w:r>
+        <w:rPr>
+          <w:rFonts w:ascii="Courier New" w:eastAsia="Courier New" w:hAnsi="Courier New" w:cs="Courier New"/>
+          <w:sz w:val="20"/>
+          <w:szCs w:val="20"/>
+          <w:lang w:val="es-CO"/>
+        </w:rPr>
+        <w:t xml:space="preserve">        clave = (usuario_id, formato)</w:t>
+      </w:r>
+    </w:p>
+    <w:p>
+      <w:pPr>
+        <w:ind w:left="720"/>
+        <w:rPr>
+          <w:lang w:val="es-CO"/>
+        </w:rPr>
+      </w:pPr>
+      <w:r>
+        <w:rPr>
+          <w:rFonts w:ascii="Courier New" w:eastAsia="Courier New" w:hAnsi="Courier New" w:cs="Courier New"/>
+          <w:sz w:val="20"/>
+          <w:szCs w:val="20"/>
+          <w:lang w:val="es-CO"/>
+        </w:rPr>
+        <w:t xml:space="preserve">        if clave in self._cache:</w:t>
+      </w:r>
+    </w:p>
+    <w:p>
+      <w:pPr>
+        <w:ind w:left="720"/>
+        <w:rPr>
+          <w:lang w:val="es-CO"/>
+        </w:rPr>
+      </w:pPr>
+      <w:r>
+        <w:rPr>
+          <w:rFonts w:ascii="Courier New" w:eastAsia="Courier New" w:hAnsi="Courier New" w:cs="Courier New"/>
+          <w:sz w:val="20"/>
+          <w:szCs w:val="20"/>
+          <w:lang w:val="es-CO"/>
+        </w:rPr>
+        <w:t xml:space="preserve">            generado_en, reporte = self._cache[clave]</w:t>
+      </w:r>
+    </w:p>
+    <w:p>
+      <w:pPr>
+        <w:ind w:left="720"/>
+        <w:rPr>
+          <w:lang w:val="es-CO"/>
+        </w:rPr>
+      </w:pPr>
+      <w:r>
+        <w:rPr>
+          <w:rFonts w:ascii="Courier New" w:eastAsia="Courier New" w:hAnsi="Courier New" w:cs="Courier New"/>
+          <w:sz w:val="20"/>
+          <w:szCs w:val="20"/>
+          <w:lang w:val="es-CO"/>
+        </w:rPr>
+        <w:t xml:space="preserve">            if ahora - generado_en &lt;= self.ttl_segundos:</w:t>
+      </w:r>
+    </w:p>
+    <w:p>
+      <w:pPr>
+        <w:ind w:left="720"/>
+        <w:rPr>
+          <w:lang w:val="es-CO"/>
+        </w:rPr>
+      </w:pPr>
+      <w:r>
+        <w:rPr>
+          <w:rFonts w:ascii="Courier New" w:eastAsia="Courier New" w:hAnsi="Courier New" w:cs="Courier New"/>
+          <w:sz w:val="20"/>
+          <w:szCs w:val="20"/>
+          <w:lang w:val="es-CO"/>
+        </w:rPr>
+        <w:t xml:space="preserve">                self._registrar(solicitante_id, usuario_id, formato, "cache")</w:t>
+      </w:r>
+    </w:p>
+    <w:p>
+      <w:pPr>
+        <w:ind w:left="720"/>
+        <w:rPr>
+          <w:lang w:val="es-CO"/>
+        </w:rPr>
+      </w:pPr>
+      <w:r>
+        <w:rPr>
+          <w:rFonts w:ascii="Courier New" w:eastAsia="Courier New" w:hAnsi="Courier New" w:cs="Courier New"/>
+          <w:sz w:val="20"/>
+          <w:szCs w:val="20"/>
+          <w:lang w:val="es-CO"/>
+        </w:rPr>
+        <w:t xml:space="preserve">                return reporte</w:t>
+      </w:r>
+    </w:p>
+    <w:p>
+      <w:pPr>
+        <w:spacing w:before="120"/>
+        <w:ind w:left="720"/>
+        <w:rPr>
+          <w:lang w:val="es-CO"/>
+        </w:rPr>
+      </w:pPr>
+    </w:p>
+    <w:p>
+      <w:pPr>
+        <w:ind w:left="720"/>
+        <w:rPr>
+          <w:lang w:val="es-CO"/>
+        </w:rPr>
+      </w:pPr>
+      <w:r>
+        <w:rPr>
+          <w:rFonts w:ascii="Courier New" w:eastAsia="Courier New" w:hAnsi="Courier New" w:cs="Courier New"/>
+          <w:sz w:val="20"/>
+          <w:szCs w:val="20"/>
+          <w:lang w:val="es-CO"/>
+        </w:rPr>
+        <w:t xml:space="preserve">        reporte = self.real.generar(solicitante_id, usuario_id, formato)</w:t>
+      </w:r>
+    </w:p>
+    <w:p>
+      <w:pPr>
+        <w:ind w:left="720"/>
+        <w:rPr>
+          <w:lang w:val="es-CO"/>
+        </w:rPr>
+      </w:pPr>
+      <w:r>
+        <w:rPr>
+          <w:rFonts w:ascii="Courier New" w:eastAsia="Courier New" w:hAnsi="Courier New" w:cs="Courier New"/>
+          <w:sz w:val="20"/>
+          <w:szCs w:val="20"/>
+          <w:lang w:val="es-CO"/>
+        </w:rPr>
+        <w:t xml:space="preserve">        self._cache[clave] = (ahora, reporte)</w:t>
+      </w:r>
+    </w:p>
+    <w:p>
+      <w:pPr>
+        <w:ind w:left="720"/>
+        <w:rPr>
+          <w:lang w:val="es-CO"/>
+        </w:rPr>
+      </w:pPr>
+      <w:r>
+        <w:rPr>
+          <w:rFonts w:ascii="Courier New" w:eastAsia="Courier New" w:hAnsi="Courier New" w:cs="Courier New"/>
+          <w:sz w:val="20"/>
+          <w:szCs w:val="20"/>
+          <w:lang w:val="es-CO"/>
+        </w:rPr>
+        <w:t xml:space="preserve">        self._registrar(solicitante_id, usuario_id, formato, "generado")</w:t>
+      </w:r>
+    </w:p>
+    <w:p>
+      <w:pPr>
+        <w:ind w:left="720"/>
+        <w:rPr>
+          <w:lang w:val="es-CO"/>
+        </w:rPr>
+      </w:pPr>
+      <w:r>
+        <w:rPr>
+          <w:rFonts w:ascii="Courier New" w:eastAsia="Courier New" w:hAnsi="Courier New" w:cs="Courier New"/>
+          <w:sz w:val="20"/>
+          <w:szCs w:val="20"/>
+          <w:lang w:val="es-CO"/>
+        </w:rPr>
+        <w:t xml:space="preserve">        return reporte</w:t>
+      </w:r>
+    </w:p>
+    <w:p>
+      <w:pPr>
+        <w:spacing w:before="120"/>
+        <w:rPr>
+          <w:lang w:val="es-CO"/>
+        </w:rPr>
+      </w:pPr>
+      <w:r>
+        <w:rPr>
+          <w:i/>
+          <w:iCs/>
+          <w:lang w:val="es-CO"/>
+        </w:rPr>
+        <w:t xml:space="preserve">Nota. </w:t>
+      </w:r>
+      <w:r>
+        <w:rPr>
+          <w:lang w:val="es-CO"/>
+        </w:rPr>
+        <w:t xml:space="preserve">Extracto de plataforma-energia-app/backend/reportes_proxy.py. ReporteProxy implementa el mismo Subject que GeneradorReportesReal y solo delega en él cuando la protección y la caché lo permiten.</w:t>
+      </w:r>
+    </w:p>
+    <w:p>
+      <w:pPr>
+        <w:pStyle w:val="Ttulo3"/>
+        <w:spacing w:before="200" w:after="100" w:line="480" w:lineRule="auto"/>
+        <w:rPr>
+          <w:lang w:val="es-CO"/>
+        </w:rPr>
+      </w:pPr>
+      <w:bookmarkStart w:id="141" w:name="bm_proxy_gana"/>
+      <w:r>
+        <w:rPr>
+          <w:b/>
+          <w:bCs/>
+          <w:i/>
+          <w:iCs/>
+          <w:color w:val="000000"/>
+          <w:lang w:val="es-CO"/>
+        </w:rPr>
+        <w:t xml:space="preserve">Qué Gana la Plataforma con Esto</w:t>
+      </w:r>
+      <w:bookmarkEnd w:id="141"/>
+    </w:p>
+    <w:p>
+      <w:pPr>
+        <w:pStyle w:val="Prrafodelista"/>
+        <w:numPr>
+          <w:ilvl w:val="0"/>
+          <w:numId w:val="2"/>
+        </w:numPr>
+        <w:spacing w:line="480" w:lineRule="auto"/>
+        <w:jc w:val="both"/>
+        <w:rPr>
+          <w:lang w:val="es-CO"/>
+        </w:rPr>
+      </w:pPr>
+      <w:r>
+        <w:rPr>
+          <w:b/>
+          <w:bCs/>
+          <w:lang w:val="es-CO"/>
+        </w:rPr>
+        <w:t xml:space="preserve">Separación de responsabilidades. </w:t>
+      </w:r>
+      <w:r>
+        <w:rPr>
+          <w:lang w:val="es-CO"/>
+        </w:rPr>
+        <w:t xml:space="preserve">DirectorReportes solo sabe construir el reporte; decidir quién puede pedirlo, cuándo reutilizar uno reciente y qué queda auditado vive en el proxy, no mezclado con el Builder.</w:t>
+      </w:r>
+    </w:p>
+    <w:p>
+      <w:pPr>
+        <w:pStyle w:val="Prrafodelista"/>
+        <w:numPr>
+          <w:ilvl w:val="0"/>
+          <w:numId w:val="2"/>
+        </w:numPr>
+        <w:spacing w:line="480" w:lineRule="auto"/>
+        <w:jc w:val="both"/>
+        <w:rPr>
+          <w:lang w:val="es-CO"/>
+        </w:rPr>
+      </w:pPr>
+      <w:r>
+        <w:rPr>
+          <w:b/>
+          <w:bCs/>
+          <w:lang w:val="es-CO"/>
+        </w:rPr>
+        <w:t xml:space="preserve">Transparente para el cliente. </w:t>
+      </w:r>
+      <w:r>
+        <w:rPr>
+          <w:lang w:val="es-CO"/>
+        </w:rPr>
+        <w:t xml:space="preserve">El proxy implementa el mismo Subject que el objeto real — un cliente que programe contra GeneradorReportes no necesita saber cuál de los dos tiene enfrente.</w:t>
+      </w:r>
+    </w:p>
+    <w:p>
+      <w:pPr>
+        <w:pStyle w:val="Prrafodelista"/>
+        <w:numPr>
+          <w:ilvl w:val="0"/>
+          <w:numId w:val="2"/>
+        </w:numPr>
+        <w:spacing w:line="480" w:lineRule="auto"/>
+        <w:jc w:val="both"/>
+        <w:rPr>
+          <w:lang w:val="es-CO"/>
+        </w:rPr>
+      </w:pPr>
+      <w:r>
+        <w:rPr>
+          <w:b/>
+          <w:bCs/>
+          <w:lang w:val="es-CO"/>
+        </w:rPr>
+        <w:t xml:space="preserve">Combina tres variantes de Proxy en un solo caso de uso. </w:t>
+      </w:r>
+      <w:r>
+        <w:rPr>
+          <w:lang w:val="es-CO"/>
+        </w:rPr>
+        <w:t xml:space="preserve">Protection (quién puede), Caching (evitar reconstruir) y Logging (quién pidió qué), igual que se vio en clase con ejemplos como Spring @Cacheable o un proxy de auditoría.</w:t>
+      </w:r>
+    </w:p>
+    <w:p>
+      <w:pPr>
+        <w:pStyle w:val="Prrafodelista"/>
+        <w:numPr>
+          <w:ilvl w:val="0"/>
+          <w:numId w:val="2"/>
+        </w:numPr>
+        <w:spacing w:line="480" w:lineRule="auto"/>
+        <w:jc w:val="both"/>
+        <w:rPr>
+          <w:lang w:val="es-CO"/>
+        </w:rPr>
+      </w:pPr>
+      <w:r>
+        <w:rPr>
+          <w:b/>
+          <w:bCs/>
+          <w:lang w:val="es-CO"/>
+        </w:rPr>
+        <w:t xml:space="preserve">Diferencia con Facade (Semana 9). </w:t>
+      </w:r>
+      <w:r>
+        <w:rPr>
+          <w:lang w:val="es-CO"/>
+        </w:rPr>
+        <w:t xml:space="preserve">Facade simplifica llamar a varios subsistemas en el orden correcto; Proxy controla el acceso a uno solo, sin cambiar su interfaz ni su orden de llamada.</w:t>
+      </w:r>
+    </w:p>
+    <w:p>
+      <w:pPr>
+        <w:spacing w:before="200"/>
+        <w:rPr>
+          <w:lang w:val="es-CO"/>
+        </w:rPr>
+      </w:pPr>
+      <w:bookmarkStart w:id="142" w:name="bm_fig51"/>
+      <w:r>
+        <w:rPr>
+          <w:b/>
+          <w:bCs/>
+          <w:lang w:val="es-CO"/>
+        </w:rPr>
+        <w:t xml:space="preserve">Figura 51</w:t>
+      </w:r>
+      <w:bookmarkEnd w:id="142"/>
+    </w:p>
+    <w:p>
+      <w:pPr>
+        <w:rPr>
+          <w:lang w:val="es-CO"/>
+        </w:rPr>
+      </w:pPr>
+      <w:r>
+        <w:rPr>
+          <w:i/>
+          <w:iCs/>
+          <w:lang w:val="es-CO"/>
+        </w:rPr>
+        <w:t xml:space="preserve">Diagrama UML de clases del patrón Proxy aplicado al reporte energético</w:t>
+      </w:r>
+    </w:p>
+    <w:p>
+      <w:pPr>
+        <w:ind w:firstLine="720"/>
+        <w:jc w:val="both"/>
+      </w:pPr>
+      <w:r>
+        <w:drawing>
+          <wp:inline xmlns:a="http://schemas.openxmlformats.org/drawingml/2006/main" xmlns:pic="http://schemas.openxmlformats.org/drawingml/2006/picture">
+            <wp:extent cx="5943600" cy="4211135"/>
+            <wp:docPr id="2105890770" name="Picture 2105890770"/>
+            <wp:cNvGraphicFramePr>
+              <a:graphicFrameLocks noChangeAspect="1"/>
+            </wp:cNvGraphicFramePr>
+            <a:graphic>
+              <a:graphicData uri="http://schemas.openxmlformats.org/drawingml/2006/picture">
+                <pic:pic>
+                  <pic:nvPicPr>
+                    <pic:cNvPr id="0" name="UML_Proxy.png"/>
+                    <pic:cNvPicPr/>
+                  </pic:nvPicPr>
+                  <pic:blipFill>
+                    <a:blip r:embed="rId50"/>
+                    <a:stretch>
+                      <a:fillRect/>
+                    </a:stretch>
+                  </pic:blipFill>
+                  <pic:spPr>
+                    <a:xfrm>
+                      <a:off x="0" y="0"/>
+                      <a:ext cx="5943600" cy="4211135"/>
+                    </a:xfrm>
+                    <a:prstGeom prst="rect"/>
+                  </pic:spPr>
+                </pic:pic>
+              </a:graphicData>
+            </a:graphic>
+          </wp:inline>
+        </w:drawing>
+      </w:r>
+    </w:p>
+    <w:p>
+      <w:pPr>
+        <w:spacing w:before="120"/>
+        <w:rPr>
+          <w:lang w:val="es-CO"/>
+        </w:rPr>
+      </w:pPr>
+      <w:r>
+        <w:rPr>
+          <w:i/>
+          <w:iCs/>
+          <w:lang w:val="es-CO"/>
+        </w:rPr>
+        <w:t xml:space="preserve">Nota. </w:t>
+      </w:r>
+      <w:r>
+        <w:rPr>
+          <w:lang w:val="es-CO"/>
+        </w:rPr>
+        <w:t xml:space="preserve">Diagrama generado a partir de Documentacion/Semana 10/proxy.py y de la integración real en reportes_proxy.py, mostrando a ReporteProxy y GeneradorReportesReal implementando el mismo Subject GeneradorReportes.</w:t>
+      </w:r>
+    </w:p>
+    <w:p>
+      <w:pPr>
+        <w:pStyle w:val="Ttulo3"/>
+        <w:spacing w:before="200" w:after="100" w:line="480" w:lineRule="auto"/>
+        <w:rPr>
+          <w:lang w:val="es-CO"/>
+        </w:rPr>
+      </w:pPr>
+      <w:bookmarkStart w:id="143" w:name="bm_proxy_justificacion"/>
+      <w:r>
+        <w:rPr>
+          <w:b/>
+          <w:bCs/>
+          <w:i/>
+          <w:iCs/>
+          <w:color w:val="000000"/>
+          <w:lang w:val="es-CO"/>
+        </w:rPr>
+        <w:t xml:space="preserve">Justificación de su Uso en el Proyecto</w:t>
+      </w:r>
+      <w:bookmarkEnd w:id="143"/>
+    </w:p>
+    <w:p>
+      <w:pPr>
+        <w:ind w:firstLine="720"/>
+        <w:jc w:val="both"/>
+        <w:rPr>
+          <w:lang w:val="es-CO"/>
+        </w:rPr>
+      </w:pPr>
+      <w:r>
+        <w:rPr>
+          <w:lang w:val="es-CO"/>
+        </w:rPr>
+        <w:t xml:space="preserve">El patrón Proxy resulta pertinente para este proyecto porque la Contextualización del Proyecto trata la información energética de cada usuario como un dato propio que no debería quedar expuesto a cualquier otro usuario autenticado, y porque el reporte ya es, en la práctica, el resultado más costoso de construir de toda la plataforma.</w:t>
+      </w:r>
+    </w:p>
+    <w:p>
+      <w:pPr>
+        <w:pStyle w:val="Ttulo3"/>
+        <w:spacing w:before="200" w:after="100" w:line="480" w:lineRule="auto"/>
+        <w:rPr>
+          <w:lang w:val="es-CO"/>
+        </w:rPr>
+      </w:pPr>
+      <w:bookmarkStart w:id="144" w:name="bm_proxy_evaluacion"/>
+      <w:r>
+        <w:rPr>
+          <w:b/>
+          <w:bCs/>
+          <w:i/>
+          <w:iCs/>
+          <w:color w:val="000000"/>
+          <w:lang w:val="es-CO"/>
+        </w:rPr>
+        <w:t xml:space="preserve">Evaluación: ¿Sirve este patrón para el proyecto?</w:t>
+      </w:r>
+      <w:bookmarkEnd w:id="144"/>
+    </w:p>
+    <w:p>
+      <w:pPr>
+        <w:ind w:firstLine="720"/>
+        <w:jc w:val="both"/>
+        <w:rPr>
+          <w:lang w:val="es-CO"/>
+        </w:rPr>
+      </w:pPr>
+      <w:r>
+        <w:rPr>
+          <w:b/>
+          <w:bCs/>
+          <w:lang w:val="es-CO"/>
+        </w:rPr>
+        <w:t xml:space="preserve">Veredicto: sí sirve. </w:t>
+      </w:r>
+      <w:r>
+        <w:rPr>
+          <w:lang w:val="es-CO"/>
+        </w:rPr>
+        <w:t xml:space="preserve">El patrón Proxy sí sirve para el proyecto porque resuelve, en un solo lugar, tres necesidades reales (protección, caché y auditoría) que de otro modo habría que repetir en cada endpoint que toque el reporte. Se integró sin modificar la lógica existente: GeneradorReportesReal solo llama a generar_reporte(), y los casos de los patrones anteriores —incluidos los de Builder— siguen pasando sin cambios.</w:t>
+      </w:r>
+    </w:p>
+    <w:p>
+      <w:pPr>
+        <w:ind w:firstLine="720"/>
+        <w:jc w:val="both"/>
+        <w:rPr>
+          <w:lang w:val="es-CO"/>
+        </w:rPr>
+      </w:pPr>
+      <w:r>
+        <w:rPr>
+          <w:lang w:val="es-CO"/>
+        </w:rPr>
+        <w:t xml:space="preserve">Matiz a tener en cuenta: el endpoint original POST /reportes/generar sigue sin pasar por el proxy, así que la protección y la auditoría hoy son opcionales, no obligatorias. Si en el futuro todo acceso al reporte debiera pasar por el proxy, convendría retirar ese endpoint directo o hacer que él mismo pase por ReporteProxy.</w:t>
+      </w:r>
+    </w:p>
+    <w:p>
+      <w:pPr>
+        <w:pStyle w:val="Ttulo3"/>
+        <w:spacing w:before="200" w:after="100" w:line="480" w:lineRule="auto"/>
+        <w:rPr>
+          <w:lang w:val="es-CO"/>
+        </w:rPr>
+      </w:pPr>
+      <w:bookmarkStart w:id="145" w:name="bm_proxy_validacion"/>
+      <w:r>
+        <w:rPr>
+          <w:b/>
+          <w:bCs/>
+          <w:i/>
+          <w:iCs/>
+          <w:color w:val="000000"/>
+          <w:lang w:val="es-CO"/>
+        </w:rPr>
+        <w:t xml:space="preserve">Validación del Patrón</w:t>
+      </w:r>
+      <w:bookmarkEnd w:id="145"/>
+    </w:p>
+    <w:p>
+      <w:pPr>
+        <w:ind w:firstLine="720"/>
+        <w:jc w:val="both"/>
+        <w:rPr>
+          <w:lang w:val="es-CO"/>
+        </w:rPr>
+      </w:pPr>
+      <w:r>
+        <w:rPr>
+          <w:lang w:val="es-CO"/>
+        </w:rPr>
+        <w:t xml:space="preserve">La validación del patrón Proxy se realizó mediante pruebas unitarias automatizadas con pytest, que verifican que el dueño puede pedir su propio reporte y que otro usuario no, que un intento denegado no llega al objeto real, que una segunda solicitud idéntica se sirve desde caché mientras que formatos o usuarios distintos no comparten esa caché, que una caché vencida sí reconstruye el reporte, y que cada intento —generado, cacheado o denegado— queda en la auditoría. Como se observa en la Figura 52, la suite Documentacion/Semana 10/test_proxy.py ejecutó 12 casos, todos superados, y el conjunto completo de pruebas del proyecto —los doce patrones— pasa sin errores (228 casos en total).</w:t>
+      </w:r>
+    </w:p>
+    <w:p>
+      <w:pPr>
+        <w:spacing w:before="200"/>
+        <w:rPr>
+          <w:lang w:val="es-CO"/>
+        </w:rPr>
+      </w:pPr>
+      <w:bookmarkStart w:id="146" w:name="bm_fig52"/>
+      <w:r>
+        <w:rPr>
+          <w:b/>
+          <w:bCs/>
+          <w:lang w:val="es-CO"/>
+        </w:rPr>
+        <w:t xml:space="preserve">Figura 52</w:t>
+      </w:r>
+      <w:bookmarkEnd w:id="146"/>
+    </w:p>
+    <w:p>
+      <w:pPr>
+        <w:rPr>
+          <w:lang w:val="es-CO"/>
+        </w:rPr>
+      </w:pPr>
+      <w:r>
+        <w:rPr>
+          <w:i/>
+          <w:iCs/>
+          <w:lang w:val="es-CO"/>
+        </w:rPr>
+        <w:t xml:space="preserve">Resultados de la ejecución de las pruebas unitarias del patrón Proxy</w:t>
+      </w:r>
+    </w:p>
+    <w:p>
+      <w:pPr>
+        <w:ind w:firstLine="720"/>
+        <w:jc w:val="both"/>
+      </w:pPr>
+      <w:r>
+        <w:drawing>
+          <wp:inline xmlns:a="http://schemas.openxmlformats.org/drawingml/2006/main" xmlns:pic="http://schemas.openxmlformats.org/drawingml/2006/picture">
+            <wp:extent cx="5943600" cy="2405256"/>
+            <wp:docPr id="2105890770" name="Picture 2105890770"/>
+            <wp:cNvGraphicFramePr>
+              <a:graphicFrameLocks noChangeAspect="1"/>
+            </wp:cNvGraphicFramePr>
+            <a:graphic>
+              <a:graphicData uri="http://schemas.openxmlformats.org/drawingml/2006/picture">
+                <pic:pic>
+                  <pic:nvPicPr>
+                    <pic:cNvPr id="0" name="pytest_proxy.png"/>
+                    <pic:cNvPicPr/>
+                  </pic:nvPicPr>
+                  <pic:blipFill>
+                    <a:blip r:embed="rId51"/>
+                    <a:stretch>
+                      <a:fillRect/>
+                    </a:stretch>
+                  </pic:blipFill>
+                  <pic:spPr>
+                    <a:xfrm>
+                      <a:off x="0" y="0"/>
+                      <a:ext cx="5943600" cy="2405256"/>
+                    </a:xfrm>
+                    <a:prstGeom prst="rect"/>
+                  </pic:spPr>
+                </pic:pic>
+              </a:graphicData>
+            </a:graphic>
+          </wp:inline>
+        </w:drawing>
+      </w:r>
+    </w:p>
+    <w:p>
+      <w:pPr>
+        <w:spacing w:before="120"/>
+        <w:rPr>
+          <w:lang w:val="es-CO"/>
+        </w:rPr>
+      </w:pPr>
+      <w:r>
+        <w:rPr>
+          <w:i/>
+          <w:iCs/>
+          <w:lang w:val="es-CO"/>
+        </w:rPr>
+        <w:t xml:space="preserve">Nota. </w:t>
+      </w:r>
+      <w:r>
+        <w:rPr>
+          <w:lang w:val="es-CO"/>
+        </w:rPr>
+        <w:t xml:space="preserve">Salida de consola de la ejecución de pytest sobre Documentacion/Semana 10/test_proxy.py, mostrando la aprobación de los 12 casos (12 passed), agrupados por comportamiento: protección de acceso, caché de reportes, auditoría e interfaz común.</w:t>
+      </w:r>
+    </w:p>
+    <w:p>
+      <w:pPr>
+        <w:pStyle w:val="Ttulo3"/>
+        <w:spacing w:before="200" w:after="100" w:line="480" w:lineRule="auto"/>
+        <w:rPr>
+          <w:lang w:val="es-CO"/>
+        </w:rPr>
+      </w:pPr>
+      <w:bookmarkStart w:id="80" w:name="bm_factory_conclusion"/>
+      <w:r>
+        <w:rPr>
+          <w:b/>
+          <w:bCs/>
+          <w:i/>
+          <w:iCs/>
+          <w:color w:val="000000"/>
+          <w:lang w:val="es-CO"/>
+        </w:rPr>
+        <w:t>Conclusión</w:t>
+      </w:r>
+      <w:bookmarkEnd w:id="80"/>
+    </w:p>
+    <w:p>
+      <w:pPr>
+        <w:ind w:firstLine="720"/>
+        <w:jc w:val="both"/>
+        <w:rPr>
+          <w:lang w:val="es-CO"/>
+        </w:rPr>
+      </w:pPr>
+      <w:proofErr w:type="spellStart"/>
+      <w:proofErr w:type="spellEnd"/>
+      <w:proofErr w:type="spellStart"/>
+      <w:proofErr w:type="spellEnd"/>
+      <w:proofErr w:type="spellStart"/>
+      <w:proofErr w:type="spellEnd"/>
+      <w:proofErr w:type="spellStart"/>
+      <w:proofErr w:type="spellEnd"/>
+      <w:proofErr w:type="spellStart"/>
+      <w:proofErr w:type="spellEnd"/>
+      <w:r>
+        <w:rPr>
+          <w:lang w:val="es-CO"/>
+        </w:rPr>
+        <w:t xml:space="preserve">En resumen, el patrón Singleton garantiza que toda la plataforma comparta un mismo estado consistente, el Factory Method garantiza que cada tipo de dispositivo IoT se cree y se comporte correctamente sin acoplar ese conocimiento al resto del sistema, el Abstract Factory garantiza que cada canal de notificación genere la familia completa de avisos con un formato coherente, el Builder permite construir el reporte energético paso a paso y obtenerlo en distintas representaciones sin duplicar la lógica de negocio, el Prototype permite clonar un dispositivo IoT ya calibrado para repetir esa configuración en altas posteriores sin volver a escribirla a mano, el Adapter permite integrar pasarelas de pago externas con interfaces incompatibles sin que esa incompatibilidad contamine la lógica de negocio, el Composite permite tratar de manera uniforme a un dispositivo y a la comunidad entera para calcular su energía a cualquier nivel, el Decorator permite construir el precio final de cada transacción apilando ajustes en tiempo de ejecución sin multiplicar clases, el Bridge permite sincronizar cada dispositivo IoT por un protocolo distinto (simulado, HTTP, MQTT) sin acoplar esa elección a si la sincronización reintenta o no ante fallas, el Facade permite dar de alta un dispositivo IoT con una sola llamada que coordina, en el orden correcto, su conexión, la simulación de lecturas iniciales y la generación de un reporte, el Flyweight permite compartir una sola ficha técnica entre todos los dispositivos de un mismo tipo en vez de duplicarla, y el Proxy permite proteger, cachear y auditar el acceso al reporte energético sin modificar cómo se construye. Los doce patrones son complementarios: el primero define cuántas instancias de la plataforma existen; el segundo y el tercero definen cómo se crean los objetos —individuales o en familia— que la plataforma administra; el cuarto define cómo se ensambla un objeto complejo a partir de esos datos; el quinto define cómo se reutiliza un objeto ya configurado para crear otros similares sin repetir su configuración; el sexto define cómo se conecta la plataforma con clases externas cuya interfaz no se puede modificar; el séptimo define cómo se agrupan los objetos en jerarquías que se recorren con una sola operación; el octavo define cómo se agregan responsabilidades a un objeto en tiempo de ejecución sin modificar su clase; el noveno define cómo se desacoplan dos jerarquías que varían por separado para que cualquier combinación se arme por composición y no por herencia; el décimo define cómo se concentra el orden correcto de varias llamadas a subsistemas ya existentes detrás de un único punto de entrada; el undécimo define cómo se comparte el estado idéntico entre muchos objetos para no duplicarlo; y el duodécimo define cómo se controla el acceso a un objeto costoso sin cambiar su interfaz.</w:t>
+      </w:r>
+    </w:p>
+    <w:p>
+      <w:pPr>
+        <w:rPr>
+          <w:lang w:val="es-CO"/>
+        </w:rPr>
+      </w:pPr>
+      <w:r>
+        <w:rPr>
+          <w:lang w:val="es-CO"/>
+        </w:rPr>
+        <w:br w:type="page"/>
+      </w:r>
+    </w:p>
+    <w:p>
+      <w:pPr>
+        <w:pStyle w:val="Ttulo1"/>
+        <w:spacing w:before="240" w:after="240" w:line="480" w:lineRule="auto"/>
+        <w:jc w:val="center"/>
+      </w:pPr>
+      <w:bookmarkStart w:id="81" w:name="bm_referencias"/>
+      <w:r>
+        <w:rPr>
+          <w:b/>
+          <w:bCs/>
+          <w:color w:val="000000"/>
+          <w:sz w:val="24"/>
+          <w:szCs w:val="24"/>
         </w:rPr>
         <w:lastRenderedPageBreak/>
         <w:t>Referencias</w:t>
@@ -33139,6 +36260,28 @@
       </w:pPr>
       <w:r>
         <w:t>Refactoring.Guru. (s.f.). Facade. Recuperado en 2026, de https://refactoring.guru/es/design-patterns/facade</w:t>
+      </w:r>
+    </w:p>
+    <w:p>
+      <w:pPr>
+        <w:ind w:left="720" w:hanging="720"/>
+        <w:rPr>
+          <w:lang w:val="es-CO"/>
+        </w:rPr>
+      </w:pPr>
+      <w:r>
+        <w:t>Refactoring.Guru. (s.f.). Flyweight. Recuperado en 2026, de https://refactoring.guru/es/design-patterns/flyweight</w:t>
+      </w:r>
+    </w:p>
+    <w:p>
+      <w:pPr>
+        <w:ind w:left="720" w:hanging="720"/>
+        <w:rPr>
+          <w:lang w:val="es-CO"/>
+        </w:rPr>
+      </w:pPr>
+      <w:r>
+        <w:t>Refactoring.Guru. (s.f.). Proxy. Recuperado en 2026, de https://refactoring.guru/es/design-patterns/proxy</w:t>
       </w:r>
     </w:p>
     <w:sectPr>

</xml_diff>